<commit_message>
Changes in LaTeX code 08082025
</commit_message>
<xml_diff>
--- a/Test.docx
+++ b/Test.docx
@@ -365,9 +365,57 @@
       </w:pPr>
       <w:r>
         <w:rPr>
-          <w:rStyle w:val="VerbatimChar"/>
-        </w:rPr>
-        <w:t xml:space="preserve">This area should be approached with &lt;u&gt;sensitivity&lt;/u&gt;. </w:t>
+          <w:rStyle w:val="NormalTok"/>
+        </w:rPr>
+        <w:t xml:space="preserve">This area should be approached with </w:t>
+      </w:r>
+      <w:r>
+        <w:rPr>
+          <w:rStyle w:val="DataTypeTok"/>
+        </w:rPr>
+        <w:t xml:space="preserve">&lt;</w:t>
+      </w:r>
+      <w:r>
+        <w:rPr>
+          <w:rStyle w:val="KeywordTok"/>
+        </w:rPr>
+        <w:t xml:space="preserve">u</w:t>
+      </w:r>
+      <w:r>
+        <w:rPr>
+          <w:rStyle w:val="DataTypeTok"/>
+        </w:rPr>
+        <w:t xml:space="preserve">&gt;</w:t>
+      </w:r>
+      <w:r>
+        <w:rPr>
+          <w:rStyle w:val="NormalTok"/>
+        </w:rPr>
+        <w:t xml:space="preserve">sensitivity</w:t>
+      </w:r>
+      <w:r>
+        <w:rPr>
+          <w:rStyle w:val="DataTypeTok"/>
+        </w:rPr>
+        <w:t xml:space="preserve">&lt;/</w:t>
+      </w:r>
+      <w:r>
+        <w:rPr>
+          <w:rStyle w:val="KeywordTok"/>
+        </w:rPr>
+        <w:t xml:space="preserve">u</w:t>
+      </w:r>
+      <w:r>
+        <w:rPr>
+          <w:rStyle w:val="DataTypeTok"/>
+        </w:rPr>
+        <w:t xml:space="preserve">&gt;</w:t>
+      </w:r>
+      <w:r>
+        <w:rPr>
+          <w:rStyle w:val="NormalTok"/>
+        </w:rPr>
+        <w:t xml:space="preserve">.</w:t>
       </w:r>
     </w:p>
     <w:p>
@@ -399,6 +447,10 @@
         <w:t xml:space="preserve"> </w:t>
       </w:r>
       <w:r>
+        <w:rPr>
+          <w:i/>
+          <w:iCs/>
+        </w:rPr>
         <w:t xml:space="preserve">sensitivity</w:t>
       </w:r>
       <w:r>
@@ -531,32 +583,6 @@
         <w:t xml:space="preserve">Output:</w:t>
       </w:r>
     </w:p>
-    <w:p>
-      <w:pPr>
-        <w:pStyle w:val="BodyText"/>
-      </w:pPr>
-      <w:r>
-        <w:t xml:space="preserve">Definition</w:t>
-      </w:r>
-      <w:r>
-        <w:t xml:space="preserve"> </w:t>
-      </w:r>
-      <w:r>
-        <w:t xml:space="preserve"> </w:t>
-      </w:r>
-      <w:r>
-        <w:t xml:space="preserve">Definition</w:t>
-      </w:r>
-      <w:r>
-        <w:t xml:space="preserve"> </w:t>
-      </w:r>
-      <w:r>
-        <w:t xml:space="preserve"> </w:t>
-      </w:r>
-      <w:r>
-        <w:t xml:space="preserve">Definition</w:t>
-      </w:r>
-    </w:p>
     <w:bookmarkEnd w:id="26"/>
     <w:bookmarkStart w:id="27" w:name="padding"/>
     <w:p>
@@ -572,7 +598,43 @@
         <w:pStyle w:val="FirstParagraph"/>
       </w:pPr>
       <w:r>
-        <w:t xml:space="preserve">To get a padded text on the left of the page the following code is used:</w:t>
+        <w:t xml:space="preserve">To create an indented (or</w:t>
+      </w:r>
+      <w:r>
+        <w:t xml:space="preserve"> </w:t>
+      </w:r>
+      <w:r>
+        <w:t xml:space="preserve">“padded”</w:t>
+      </w:r>
+      <w:r>
+        <w:t xml:space="preserve">) block of text that works across all formats, you should use a fenced</w:t>
+      </w:r>
+      <w:r>
+        <w:t xml:space="preserve"> </w:t>
+      </w:r>
+      <w:r>
+        <w:rPr>
+          <w:rStyle w:val="VerbatimChar"/>
+        </w:rPr>
+        <w:t xml:space="preserve">Div</w:t>
+      </w:r>
+      <w:r>
+        <w:t xml:space="preserve"> </w:t>
+      </w:r>
+      <w:r>
+        <w:t xml:space="preserve">block with a custom padding-left style, like</w:t>
+      </w:r>
+      <w:r>
+        <w:t xml:space="preserve"> </w:t>
+      </w:r>
+      <w:r>
+        <w:rPr>
+          <w:rStyle w:val="VerbatimChar"/>
+        </w:rPr>
+        <w:t xml:space="preserve">&lt;div style="padding-left:3em;"&gt;</w:t>
+      </w:r>
+      <w:r>
+        <w:t xml:space="preserve">.</w:t>
       </w:r>
     </w:p>
     <w:p>
@@ -601,33 +663,15 @@
         <w:rPr>
           <w:rStyle w:val="VerbatimChar"/>
         </w:rPr>
-        <w:t xml:space="preserve">&lt;div style="padding-left:3em;"&gt;&lt;/div&gt;</w:t>
-      </w:r>
-      <w:r>
-        <w:br/>
-      </w:r>
-      <w:r>
-        <w:rPr>
-          <w:rStyle w:val="VerbatimChar"/>
-        </w:rPr>
-        <w:t xml:space="preserve"># this is usually used after a section to visually separate it from the rest of the text:</w:t>
-      </w:r>
-      <w:r>
-        <w:br/>
-      </w:r>
-      <w:r>
-        <w:br/>
-      </w:r>
-      <w:r>
-        <w:rPr>
-          <w:rStyle w:val="VerbatimChar"/>
-        </w:rPr>
         <w:t xml:space="preserve">&lt;b&gt;Definition&lt;/b&gt;</w:t>
       </w:r>
       <w:r>
         <w:br/>
       </w:r>
       <w:r>
+        <w:br/>
+      </w:r>
+      <w:r>
         <w:rPr>
           <w:rStyle w:val="VerbatimChar"/>
         </w:rPr>
@@ -640,7 +684,7 @@
         <w:rPr>
           <w:rStyle w:val="VerbatimChar"/>
         </w:rPr>
-        <w:t xml:space="preserve">    &lt;b&gt;F1a. Participation in social activities of long-standing interest&lt;/b&gt; — The person engaged in social activities that have been of long-standing interest to him or her. The activities may be quite varied and should be counted as long as they involve interaction with at least one other person. Examples include attending meetings of informal clubs or religious services, playing bridge or bingo, volunteering at the local clothing bank, or gossiping with the neighbours on their front porches in the evening.</w:t>
+        <w:t xml:space="preserve">&lt;b&gt;F1a. Participation in social activities of long-standing interest&lt;/b&gt; — The person engaged in social activities that have been of long-standing interest to him or her. The activities may be quite varied and should be counted as long as they involve interaction with at least one other person. Examples include attending meetings of informal clubs or religious services, playing bridge or bingo, volunteering at the local clothing bank, or gossiping with the neighbours on their front porches in the evening.</w:t>
       </w:r>
       <w:r>
         <w:br/>
@@ -670,28 +714,6 @@
         <w:t xml:space="preserve">Output:</w:t>
       </w:r>
     </w:p>
-    <w:p>
-      <w:pPr>
-        <w:pStyle w:val="BodyText"/>
-      </w:pPr>
-      <w:r>
-        <w:t xml:space="preserve">Definition</w:t>
-      </w:r>
-    </w:p>
-    <w:p>
-      <w:pPr>
-        <w:pStyle w:val="BodyText"/>
-      </w:pPr>
-      <w:r>
-        <w:t xml:space="preserve">F1a. Participation in social activities of long-standing interest</w:t>
-      </w:r>
-      <w:r>
-        <w:t xml:space="preserve"> </w:t>
-      </w:r>
-      <w:r>
-        <w:t xml:space="preserve">— The person engaged in social activities that have been of long-standing interest to him or her. The activities may be quite varied and should be counted as long as they involve interaction with at least one other person. Examples include attending meetings of informal clubs or religious services, playing bridge or bingo, volunteering at the local clothing bank, or gossiping with the neighbors on their front porches in the evening.</w:t>
-      </w:r>
-    </w:p>
     <w:bookmarkEnd w:id="27"/>
     <w:bookmarkStart w:id="28" w:name="center-left-right-positioned-text"/>
     <w:p>
@@ -777,14 +799,6 @@
         <w:pStyle w:val="BodyText"/>
       </w:pPr>
       <w:r>
-        <w:t xml:space="preserve">This is an example of a centered text</w:t>
-      </w:r>
-    </w:p>
-    <w:p>
-      <w:pPr>
-        <w:pStyle w:val="BodyText"/>
-      </w:pPr>
-      <w:r>
         <w:t xml:space="preserve">Placing the text to the left</w:t>
       </w:r>
       <w:r>
@@ -883,27 +897,6 @@
         <w:t xml:space="preserve">Output:</w:t>
       </w:r>
     </w:p>
-    <w:p>
-      <w:pPr>
-        <w:pStyle w:val="BodyText"/>
-      </w:pPr>
-      <w:r>
-        <w:t xml:space="preserve">This is an example of a left aligned text</w:t>
-      </w:r>
-    </w:p>
-    <w:p>
-      <w:pPr>
-        <w:pStyle w:val="BodyText"/>
-      </w:pPr>
-    </w:p>
-    <w:p>
-      <w:pPr>
-        <w:pStyle w:val="BodyText"/>
-      </w:pPr>
-      <w:r>
-        <w:t xml:space="preserve">This is an example of a right aligned text</w:t>
-      </w:r>
-    </w:p>
     <w:bookmarkEnd w:id="28"/>
     <w:bookmarkStart w:id="29" w:name="blank-spaces"/>
     <w:p>
@@ -928,7 +921,7 @@
         <w:rPr>
           <w:rStyle w:val="VerbatimChar"/>
         </w:rPr>
-        <w:t xml:space="preserve">&amp;nbsp;</w:t>
+        <w:t xml:space="preserve">"&amp;nbsp;"</w:t>
       </w:r>
       <w:r>
         <w:t xml:space="preserve">:</w:t>
@@ -1019,34 +1012,6 @@
           <w:bCs/>
         </w:rPr>
         <w:t xml:space="preserve">Output:</w:t>
-      </w:r>
-    </w:p>
-    <w:p>
-      <w:pPr>
-        <w:pStyle w:val="BodyText"/>
-      </w:pPr>
-      <w:r>
-        <w:t xml:space="preserve">Example: 01.03.1942</w:t>
-      </w:r>
-      <w:r>
-        <w:t xml:space="preserve"> </w:t>
-      </w:r>
-      <w:r>
-        <w:t xml:space="preserve">[ 0 ][ 1 ]      [ 0 ][ 3 ]      [ 1 ][ 9 ][ 4 ][ 2 ]</w:t>
-      </w:r>
-      <w:r>
-        <w:t xml:space="preserve"> </w:t>
-      </w:r>
-      <w:r>
-        <w:t xml:space="preserve">    </w:t>
-      </w:r>
-    </w:p>
-    <w:p>
-      <w:pPr>
-        <w:pStyle w:val="BodyText"/>
-      </w:pPr>
-      <w:r>
-        <w:t xml:space="preserve">  Day          Month             Year</w:t>
       </w:r>
     </w:p>
     <w:bookmarkEnd w:id="29"/>
@@ -1207,47 +1172,6 @@
         <w:t xml:space="preserve">Output:</w:t>
       </w:r>
     </w:p>
-    <w:p>
-      <w:pPr>
-        <w:pStyle w:val="BodyText"/>
-      </w:pPr>
-      <w:r>
-        <w:t xml:space="preserve">This area should be approached with sensitivity. The recording of the response should not reflect what you believe may have occurred but rather what the person or the record indicates.</w:t>
-      </w:r>
-    </w:p>
-    <w:p>
-      <w:pPr>
-        <w:pStyle w:val="BodyText"/>
-      </w:pPr>
-      <w:r>
-        <w:t xml:space="preserve">G1d. Victim of physical assault or abuse</w:t>
-      </w:r>
-      <w:r>
-        <w:t xml:space="preserve"> </w:t>
-      </w:r>
-      <w:r>
-        <w:t xml:space="preserve">— Any form of physical abuse experienced by the person, regardless of his or her age when the incident(s) occurred (for example, any incident resulting in non-accidental injury, physical confinement, excessive physical discipline, or withdrawal of necessities of life, such as food and shelter).</w:t>
-      </w:r>
-    </w:p>
-    <w:p>
-      <w:pPr>
-        <w:pStyle w:val="BodyText"/>
-      </w:pPr>
-    </w:p>
-    <w:p>
-      <w:pPr>
-        <w:pStyle w:val="BodyText"/>
-      </w:pPr>
-      <w:r>
-        <w:t xml:space="preserve">G1e. Victim of emotional abuse</w:t>
-      </w:r>
-      <w:r>
-        <w:t xml:space="preserve"> </w:t>
-      </w:r>
-      <w:r>
-        <w:t xml:space="preserve">— Person has been in a pervasive and hostile emotional environment created by an abuser for the purposes of control. The abused person’s self-esteem, identity, energy, ability to feel and question, wants, and needs are invalidated by the abuser.</w:t>
-      </w:r>
-    </w:p>
     <w:bookmarkEnd w:id="31"/>
     <w:bookmarkStart w:id="32" w:name="ordered-lists"/>
     <w:p>
@@ -1395,47 +1319,6 @@
           <w:bCs/>
         </w:rPr>
         <w:t xml:space="preserve">Output:</w:t>
-      </w:r>
-    </w:p>
-    <w:p>
-      <w:pPr>
-        <w:pStyle w:val="BodyText"/>
-      </w:pPr>
-      <w:r>
-        <w:t xml:space="preserve">This area should be approached with sensitivity. The recording of the response should not reflect what you believe may have occurred but rather what the person or the record indicates.</w:t>
-      </w:r>
-    </w:p>
-    <w:p>
-      <w:pPr>
-        <w:pStyle w:val="BodyText"/>
-      </w:pPr>
-      <w:r>
-        <w:t xml:space="preserve">Victim of physical assault or abuse</w:t>
-      </w:r>
-      <w:r>
-        <w:t xml:space="preserve"> </w:t>
-      </w:r>
-      <w:r>
-        <w:t xml:space="preserve">— Any form of physical abuse experienced by the person, regardless of his or her age when the incident(s) occurred (for example, any incident resulting in non-accidental injury, physical confinement, excessive physical discipline, or withdrawal of necessities of life, such as food and shelter).</w:t>
-      </w:r>
-    </w:p>
-    <w:p>
-      <w:pPr>
-        <w:pStyle w:val="BodyText"/>
-      </w:pPr>
-    </w:p>
-    <w:p>
-      <w:pPr>
-        <w:pStyle w:val="BodyText"/>
-      </w:pPr>
-      <w:r>
-        <w:t xml:space="preserve">Victim of emotional abuse</w:t>
-      </w:r>
-      <w:r>
-        <w:t xml:space="preserve"> </w:t>
-      </w:r>
-      <w:r>
-        <w:t xml:space="preserve">— Person has been in a pervasive and hostile emotional environment created by an abuser for the purposes of control. The abused person’s self-esteem, identity, energy, ability to feel and question, wants, and needs are invalidated by the abuser.</w:t>
       </w:r>
     </w:p>
     <w:bookmarkEnd w:id="32"/>
@@ -1564,14 +1447,6 @@
         <w:t xml:space="preserve">Output:</w:t>
       </w:r>
     </w:p>
-    <w:p>
-      <w:pPr>
-        <w:pStyle w:val="BodyText"/>
-      </w:pPr>
-      <w:r>
-        <w:t xml:space="preserve">Example of How to Code Life Events</w:t>
-      </w:r>
-    </w:p>
     <w:bookmarkEnd w:id="35"/>
     <w:bookmarkStart w:id="36" w:name="tables"/>
     <w:p>
@@ -1871,129 +1746,9 @@
         <w:t xml:space="preserve">Output:</w:t>
       </w:r>
     </w:p>
-    <w:tbl>
-      <w:tblPr>
-        <w:tblStyle w:val="Table"/>
-        <w:tblW w:type="auto" w:w="0"/>
-        <w:tblLook w:firstRow="1" w:lastRow="0" w:firstColumn="0" w:lastColumn="0" w:noHBand="0" w:noVBand="0" w:val="0020"/>
-      </w:tblPr>
-      <w:tblGrid>
-        <w:gridCol w:w="2640"/>
-        <w:gridCol w:w="2640"/>
-        <w:gridCol w:w="2640"/>
-      </w:tblGrid>
-      <w:tr>
-        <w:trPr>
-          <w:tblHeader w:val="on"/>
-        </w:trPr>
-        <w:tc>
-          <w:tcPr/>
-          <w:p>
-            <w:pPr>
-              <w:pStyle w:val="Compact"/>
-            </w:pPr>
-            <w:r>
-              <w:t xml:space="preserve">Morning</w:t>
-            </w:r>
-          </w:p>
-        </w:tc>
-        <w:tc>
-          <w:tcPr/>
-          <w:p>
-            <w:pPr>
-              <w:pStyle w:val="Compact"/>
-            </w:pPr>
-            <w:r>
-              <w:t xml:space="preserve">Afternoon</w:t>
-            </w:r>
-          </w:p>
-        </w:tc>
-        <w:tc>
-          <w:tcPr/>
-          <w:p>
-            <w:pPr>
-              <w:pStyle w:val="Compact"/>
-            </w:pPr>
-            <w:r>
-              <w:t xml:space="preserve">Night</w:t>
-            </w:r>
-          </w:p>
-        </w:tc>
-      </w:tr>
-      <w:tr>
-        <w:tc>
-          <w:tcPr/>
-          <w:p>
-            <w:pPr>
-              <w:pStyle w:val="Compact"/>
-            </w:pPr>
-            <w:r>
-              <w:t xml:space="preserve">Make bed</w:t>
-            </w:r>
-          </w:p>
-        </w:tc>
-        <w:tc>
-          <w:tcPr/>
-          <w:p>
-            <w:pPr>
-              <w:pStyle w:val="Compact"/>
-            </w:pPr>
-            <w:r>
-              <w:t xml:space="preserve">Visit to doctor</w:t>
-            </w:r>
-          </w:p>
-        </w:tc>
-        <w:tc>
-          <w:tcPr/>
-          <w:p>
-            <w:pPr>
-              <w:pStyle w:val="Compact"/>
-            </w:pPr>
-            <w:r>
-              <w:t xml:space="preserve">Socialize</w:t>
-            </w:r>
-          </w:p>
-        </w:tc>
-      </w:tr>
-      <w:tr>
-        <w:tc>
-          <w:tcPr/>
-          <w:p>
-            <w:pPr>
-              <w:pStyle w:val="Compact"/>
-            </w:pPr>
-            <w:r>
-              <w:t xml:space="preserve">Grocery shopping</w:t>
-            </w:r>
-          </w:p>
-        </w:tc>
-        <w:tc>
-          <w:tcPr/>
-          <w:p>
-            <w:pPr>
-              <w:pStyle w:val="Compact"/>
-            </w:pPr>
-            <w:r>
-              <w:t xml:space="preserve">Watch movie</w:t>
-            </w:r>
-          </w:p>
-        </w:tc>
-        <w:tc>
-          <w:tcPr/>
-          <w:p>
-            <w:pPr>
-              <w:pStyle w:val="Compact"/>
-            </w:pPr>
-            <w:r>
-              <w:t xml:space="preserve">Read</w:t>
-            </w:r>
-          </w:p>
-        </w:tc>
-      </w:tr>
-    </w:tbl>
     <w:bookmarkEnd w:id="36"/>
     <w:bookmarkEnd w:id="37"/>
-    <w:bookmarkStart w:id="78" w:name="general-guidelines"/>
+    <w:bookmarkStart w:id="102" w:name="general-guidelines"/>
     <w:p>
       <w:pPr>
         <w:pStyle w:val="Heading1"/>
@@ -2002,7 +1757,7 @@
         <w:t xml:space="preserve">General guidelines</w:t>
       </w:r>
     </w:p>
-    <w:bookmarkStart w:id="65" w:name="format"/>
+    <w:bookmarkStart w:id="77" w:name="format"/>
     <w:p>
       <w:pPr>
         <w:pStyle w:val="Heading2"/>
@@ -5250,7 +5005,7 @@
         </w:numPr>
       </w:pPr>
       <w:r>
-        <w:t xml:space="preserve">The importance of theses features lies in the fact that when formatting the CAP manual, the paragraphs within the same section should not be separated from each other by a double break mark</w:t>
+        <w:t xml:space="preserve">The importance of these features lies in the fact that when formatting the CAP manual, the paragraphs within the same section should not be separated from each other by a double break mark</w:t>
       </w:r>
       <w:r>
         <w:t xml:space="preserve"> </w:t>
@@ -5281,6 +5036,66 @@
       </w:r>
       <w:r>
         <w:t xml:space="preserve">symbol is enough to mark the end of a paragraph and the beginning of the next.</w:t>
+      </w:r>
+    </w:p>
+    <w:p>
+      <w:pPr>
+        <w:pStyle w:val="Compact"/>
+        <w:numPr>
+          <w:ilvl w:val="0"/>
+          <w:numId w:val="1008"/>
+        </w:numPr>
+      </w:pPr>
+      <w:r>
+        <w:t xml:space="preserve">Note that the main sections of the document (Problem, Triggers and Guidelines) should be rendered with the</w:t>
+      </w:r>
+      <w:r>
+        <w:t xml:space="preserve"> </w:t>
+      </w:r>
+      <w:r>
+        <w:rPr>
+          <w:rStyle w:val="VerbatimChar"/>
+        </w:rPr>
+        <w:t xml:space="preserve">&lt;h3&gt;&lt;/h3&gt;</w:t>
+      </w:r>
+      <w:r>
+        <w:t xml:space="preserve"> </w:t>
+      </w:r>
+      <w:r>
+        <w:t xml:space="preserve">tag. This makes it easier to spot each section as a separate block.</w:t>
+      </w:r>
+    </w:p>
+    <w:p>
+      <w:pPr>
+        <w:pStyle w:val="Compact"/>
+        <w:numPr>
+          <w:ilvl w:val="0"/>
+          <w:numId w:val="1008"/>
+        </w:numPr>
+      </w:pPr>
+      <w:r>
+        <w:t xml:space="preserve">The</w:t>
+      </w:r>
+      <w:r>
+        <w:t xml:space="preserve"> </w:t>
+      </w:r>
+      <w:r>
+        <w:t xml:space="preserve">‘Overall Goals of Care’</w:t>
+      </w:r>
+      <w:r>
+        <w:t xml:space="preserve"> </w:t>
+      </w:r>
+      <w:r>
+        <w:t xml:space="preserve">should be inside a table along these lines</w:t>
+      </w:r>
+      <w:r>
+        <w:t xml:space="preserve"> </w:t>
+      </w:r>
+      <w:r>
+        <w:rPr>
+          <w:rStyle w:val="VerbatimChar"/>
+        </w:rPr>
+        <w:t xml:space="preserve">&lt;div align="center"&gt;&lt;table border="1" rules="none"&gt;&lt;tbody&gt;&lt;/tbody&gt;&lt;/table&gt;&lt;/div&gt;</w:t>
       </w:r>
     </w:p>
     <w:p>
@@ -5290,7 +5105,7 @@
       <w:r>
         <w:drawing>
           <wp:inline>
-            <wp:extent cx="5334000" cy="3106403"/>
+            <wp:extent cx="5334000" cy="3958853"/>
             <wp:effectExtent b="0" l="0" r="0" t="0"/>
             <wp:docPr descr="General CAP view" title="" id="48" name="Picture"/>
             <a:graphic>
@@ -5311,7 +5126,7 @@
                   <pic:spPr bwMode="auto">
                     <a:xfrm>
                       <a:off x="0" y="0"/>
-                      <a:ext cx="5334000" cy="3106403"/>
+                      <a:ext cx="5334000" cy="3958853"/>
                     </a:xfrm>
                     <a:prstGeom prst="rect">
                       <a:avLst/>
@@ -5340,7 +5155,32 @@
     </w:p>
     <w:p>
       <w:pPr>
-        <w:pStyle w:val="Compact"/>
+        <w:numPr>
+          <w:ilvl w:val="0"/>
+          <w:numId w:val="1009"/>
+        </w:numPr>
+      </w:pPr>
+      <w:r>
+        <w:t xml:space="preserve">There are sections clearly limited which follow a similar structure in most of the CAPs. These sections should have the headings formatted with the</w:t>
+      </w:r>
+      <w:r>
+        <w:t xml:space="preserve"> </w:t>
+      </w:r>
+      <w:r>
+        <w:rPr>
+          <w:rStyle w:val="VerbatimChar"/>
+        </w:rPr>
+        <w:t xml:space="preserve">&lt;h3&gt;&lt;/h3&gt;</w:t>
+      </w:r>
+      <w:r>
+        <w:t xml:space="preserve"> </w:t>
+      </w:r>
+      <w:r>
+        <w:t xml:space="preserve">tag.</w:t>
+      </w:r>
+    </w:p>
+    <w:p>
+      <w:pPr>
         <w:numPr>
           <w:ilvl w:val="0"/>
           <w:numId w:val="1009"/>
@@ -5465,7 +5305,7 @@
         <w:t xml:space="preserve"> </w:t>
       </w:r>
       <w:r>
-        <w:t xml:space="preserve">section should be nested, with the</w:t>
+        <w:t xml:space="preserve">section should not be nested, with the</w:t>
       </w:r>
       <w:r>
         <w:t xml:space="preserve"> </w:t>
@@ -5499,7 +5339,7 @@
       <w:r>
         <w:drawing>
           <wp:inline>
-            <wp:extent cx="5334000" cy="915077"/>
+            <wp:extent cx="5334000" cy="3134853"/>
             <wp:effectExtent b="0" l="0" r="0" t="0"/>
             <wp:docPr descr="Triggers view" title="" id="54" name="Picture"/>
             <a:graphic>
@@ -5520,7 +5360,7 @@
                   <pic:spPr bwMode="auto">
                     <a:xfrm>
                       <a:off x="0" y="0"/>
-                      <a:ext cx="5334000" cy="915077"/>
+                      <a:ext cx="5334000" cy="3134853"/>
                     </a:xfrm>
                     <a:prstGeom prst="rect">
                       <a:avLst/>
@@ -5592,7 +5432,7 @@
         <w:t xml:space="preserve"> </w:t>
       </w:r>
       <w:r>
-        <w:t xml:space="preserve">section should be centered (both the title and the authors), with the title of the section in bold, but the authors themselves should not be in bold font.</w:t>
+        <w:t xml:space="preserve">section should be centered inside a table (both the title and the authors), with the title of the section in bold, but the authors themselves should not be in bold font.</w:t>
       </w:r>
     </w:p>
     <w:p>
@@ -5602,7 +5442,7 @@
       <w:r>
         <w:drawing>
           <wp:inline>
-            <wp:extent cx="5334000" cy="2617216"/>
+            <wp:extent cx="5334000" cy="2925862"/>
             <wp:effectExtent b="0" l="0" r="0" t="0"/>
             <wp:docPr descr="Authors view" title="" id="57" name="Picture"/>
             <a:graphic>
@@ -5623,7 +5463,7 @@
                   <pic:spPr bwMode="auto">
                     <a:xfrm>
                       <a:off x="0" y="0"/>
-                      <a:ext cx="5334000" cy="2617216"/>
+                      <a:ext cx="5334000" cy="2925862"/>
                     </a:xfrm>
                     <a:prstGeom prst="rect">
                       <a:avLst/>
@@ -5659,7 +5499,7 @@
         </w:numPr>
       </w:pPr>
       <w:r>
-        <w:t xml:space="preserve">The main title of the CAP manual is always visible at the top of the page, even when scrolling down, for that reason, it is important that the headings or sub-headings do not use the</w:t>
+        <w:t xml:space="preserve">The main title of the CAP manual is always visible at the top of the page, even when scrolling down. For that reason, it is important that the headings or sub-headings do not use the</w:t>
       </w:r>
       <w:r>
         <w:t xml:space="preserve"> </w:t>
@@ -5733,7 +5573,7 @@
       </w:r>
     </w:p>
     <w:bookmarkEnd w:id="62"/>
-    <w:bookmarkStart w:id="64" w:name="conventions-to-facilitate-reading"/>
+    <w:bookmarkStart w:id="74" w:name="conventions-to-facilitate-reading"/>
     <w:p>
       <w:pPr>
         <w:pStyle w:val="Heading3"/>
@@ -5771,38 +5611,140 @@
         <w:t xml:space="preserve">/</w:t>
       </w:r>
     </w:p>
-    <w:p>
-      <w:pPr>
-        <w:pStyle w:val="BlockText"/>
-      </w:pPr>
-      <w:r>
-        <w:t xml:space="preserve">This happens when the manual makes a reference to terms that have a close relationship and could be easily</w:t>
-      </w:r>
-      <w:r>
-        <w:t xml:space="preserve"> </w:t>
-      </w:r>
-      <w:r>
-        <w:t xml:space="preserve">interchanged. This is usually conveyed by joining the words without spaces with a</w:t>
-      </w:r>
-      <w:r>
-        <w:t xml:space="preserve"> </w:t>
-      </w:r>
-      <w:r>
-        <w:rPr>
-          <w:rStyle w:val="VerbatimChar"/>
-        </w:rPr>
-        <w:t xml:space="preserve">/</w:t>
-      </w:r>
-      <w:r>
-        <w:t xml:space="preserve"> </w:t>
-      </w:r>
-      <w:r>
-        <w:t xml:space="preserve">character.</w:t>
-      </w:r>
-    </w:p>
-    <w:p>
-      <w:pPr>
-        <w:pStyle w:val="FirstParagraph"/>
+    <w:tbl>
+      <w:tblPr>
+        <w:tblStyle w:val="Table"/>
+        <w:tblLook w:firstRow="0" w:lastRow="0" w:firstColumn="0" w:lastColumn="0" w:noHBand="0" w:noVBand="0" w:val="0000"/>
+        <w:tblBorders>
+          <w:left w:val="single" w:sz="24" w:space="0" w:color="0758E5"/>
+          <w:right w:val="single" w:sz="4" w:space="0" w:color="0758E5"/>
+          <w:top w:val="single" w:sz="4" w:space="0" w:color="0758E5"/>
+          <w:bottom w:val="single" w:sz="4" w:space="0" w:color="0758E5"/>
+        </w:tblBorders>
+        <w:tblCellMar>
+          <w:left w:w="144" w:type="dxa"/>
+          <w:right w:w="144" w:type="dxa"/>
+        </w:tblCellMar>
+        <w:tblInd w:w="164" w:type="dxa"/>
+        <w:tblW w:type="pct" w:w="100%"/>
+      </w:tblPr>
+      <w:tr>
+        <w:trPr>
+          <w:cantSplit/>
+        </w:trPr>
+        <w:tc>
+          <w:tcPr>
+            <w:shd w:color="auto" w:fill="dae6fb" w:val="clear"/>
+            <w:tcMar>
+              <w:top w:w="92" w:type="dxa"/>
+              <w:bottom w:w="92" w:type="dxa"/>
+            </w:tcMar>
+          </w:tcPr>
+          <w:p>
+            <w:pPr>
+              <w:pStyle w:val="FirstParagraph"/>
+            </w:pPr>
+            <w:pPr>
+              <w:spacing w:before="0" w:after="0"/>
+              <w:textAlignment w:val="center"/>
+            </w:pPr>
+            <w:r>
+              <w:drawing>
+                <wp:inline>
+                  <wp:extent cx="152400" cy="152400"/>
+                  <wp:effectExtent b="0" l="0" r="0" t="0"/>
+                  <wp:docPr descr="" title="" id="64" name="Picture"/>
+                  <a:graphic>
+                    <a:graphicData uri="http://schemas.openxmlformats.org/drawingml/2006/picture">
+                      <pic:pic>
+                        <pic:nvPicPr>
+                          <pic:cNvPr descr="C:\Users\vijgia\AppData\Local\Programs\Quarto\share\formats\docx\note.png" id="65" name="Picture"/>
+                          <pic:cNvPicPr>
+                            <a:picLocks noChangeArrowheads="1" noChangeAspect="1"/>
+                          </pic:cNvPicPr>
+                        </pic:nvPicPr>
+                        <pic:blipFill>
+                          <a:blip r:embed="rId63"/>
+                          <a:stretch>
+                            <a:fillRect/>
+                          </a:stretch>
+                        </pic:blipFill>
+                        <pic:spPr bwMode="auto">
+                          <a:xfrm>
+                            <a:off x="0" y="0"/>
+                            <a:ext cx="152400" cy="152400"/>
+                          </a:xfrm>
+                          <a:prstGeom prst="rect">
+                            <a:avLst/>
+                          </a:prstGeom>
+                          <a:noFill/>
+                          <a:ln w="9525">
+                            <a:noFill/>
+                            <a:headEnd/>
+                            <a:tailEnd/>
+                          </a:ln>
+                        </pic:spPr>
+                      </pic:pic>
+                    </a:graphicData>
+                  </a:graphic>
+                </wp:inline>
+              </w:drawing>
+            </w:r>
+            <w:r>
+              <w:t xml:space="preserve"> </w:t>
+            </w:r>
+            <w:r>
+              <w:t xml:space="preserve"> </w:t>
+            </w:r>
+            <w:r>
+              <w:t xml:space="preserve">Note</w:t>
+            </w:r>
+          </w:p>
+        </w:tc>
+      </w:tr>
+      <w:tr>
+        <w:trPr>
+          <w:cantSplit/>
+        </w:trPr>
+        <w:tc>
+          <w:tcPr>
+            <w:tcMar>
+              <w:top w:w="108" w:type="dxa"/>
+              <w:bottom w:w="108" w:type="dxa"/>
+            </w:tcMar>
+          </w:tcPr>
+          <w:p>
+            <w:pPr>
+              <w:pStyle w:val="BodyText"/>
+            </w:pPr>
+            <w:pPr>
+              <w:spacing w:before="16" w:after="16"/>
+            </w:pPr>
+            <w:r>
+              <w:t xml:space="preserve">This happens when the manual makes a reference to terms that have a close relationship and could be easily interchanged. This is usually conveyed by joining the words without spaces with a</w:t>
+            </w:r>
+            <w:r>
+              <w:t xml:space="preserve"> </w:t>
+            </w:r>
+            <w:r>
+              <w:rPr>
+                <w:rStyle w:val="VerbatimChar"/>
+              </w:rPr>
+              <w:t xml:space="preserve">/</w:t>
+            </w:r>
+            <w:r>
+              <w:t xml:space="preserve"> </w:t>
+            </w:r>
+            <w:r>
+              <w:t xml:space="preserve">character.</w:t>
+            </w:r>
+          </w:p>
+        </w:tc>
+      </w:tr>
+    </w:tbl>
+    <w:p>
+      <w:pPr>
+        <w:pStyle w:val="BodyText"/>
       </w:pPr>
       <w:r>
         <w:t xml:space="preserve">¦Examples:</w:t>
@@ -5820,32 +5762,140 @@
         <w:t xml:space="preserve">‘Hospice facility/palliative care unit’</w:t>
       </w:r>
     </w:p>
-    <w:p>
-      <w:pPr>
-        <w:pStyle w:val="BlockText"/>
-      </w:pPr>
-      <w:r>
-        <w:t xml:space="preserve">It is recommended to leave a space before and after the</w:t>
-      </w:r>
-      <w:r>
-        <w:t xml:space="preserve"> </w:t>
-      </w:r>
-      <w:r>
-        <w:rPr>
-          <w:rStyle w:val="VerbatimChar"/>
-        </w:rPr>
-        <w:t xml:space="preserve">/</w:t>
-      </w:r>
-      <w:r>
-        <w:t xml:space="preserve"> </w:t>
-      </w:r>
-      <w:r>
-        <w:t xml:space="preserve">character. So the previous examples would look like this:</w:t>
-      </w:r>
-    </w:p>
-    <w:p>
-      <w:pPr>
-        <w:pStyle w:val="FirstParagraph"/>
+    <w:tbl>
+      <w:tblPr>
+        <w:tblStyle w:val="Table"/>
+        <w:tblLook w:firstRow="0" w:lastRow="0" w:firstColumn="0" w:lastColumn="0" w:noHBand="0" w:noVBand="0" w:val="0000"/>
+        <w:tblBorders>
+          <w:left w:val="single" w:sz="24" w:space="0" w:color="CC1914"/>
+          <w:right w:val="single" w:sz="4" w:space="0" w:color="CC1914"/>
+          <w:top w:val="single" w:sz="4" w:space="0" w:color="CC1914"/>
+          <w:bottom w:val="single" w:sz="4" w:space="0" w:color="CC1914"/>
+        </w:tblBorders>
+        <w:tblCellMar>
+          <w:left w:w="144" w:type="dxa"/>
+          <w:right w:w="144" w:type="dxa"/>
+        </w:tblCellMar>
+        <w:tblInd w:w="164" w:type="dxa"/>
+        <w:tblW w:type="pct" w:w="100%"/>
+      </w:tblPr>
+      <w:tr>
+        <w:trPr>
+          <w:cantSplit/>
+        </w:trPr>
+        <w:tc>
+          <w:tcPr>
+            <w:shd w:color="auto" w:fill="f7dddc" w:val="clear"/>
+            <w:tcMar>
+              <w:top w:w="92" w:type="dxa"/>
+              <w:bottom w:w="92" w:type="dxa"/>
+            </w:tcMar>
+          </w:tcPr>
+          <w:p>
+            <w:pPr>
+              <w:pStyle w:val="BodyText"/>
+            </w:pPr>
+            <w:pPr>
+              <w:spacing w:before="0" w:after="0"/>
+              <w:textAlignment w:val="center"/>
+            </w:pPr>
+            <w:r>
+              <w:drawing>
+                <wp:inline>
+                  <wp:extent cx="152400" cy="152400"/>
+                  <wp:effectExtent b="0" l="0" r="0" t="0"/>
+                  <wp:docPr descr="" title="" id="67" name="Picture"/>
+                  <a:graphic>
+                    <a:graphicData uri="http://schemas.openxmlformats.org/drawingml/2006/picture">
+                      <pic:pic>
+                        <pic:nvPicPr>
+                          <pic:cNvPr descr="C:\Users\vijgia\AppData\Local\Programs\Quarto\share\formats\docx\important.png" id="68" name="Picture"/>
+                          <pic:cNvPicPr>
+                            <a:picLocks noChangeArrowheads="1" noChangeAspect="1"/>
+                          </pic:cNvPicPr>
+                        </pic:nvPicPr>
+                        <pic:blipFill>
+                          <a:blip r:embed="rId66"/>
+                          <a:stretch>
+                            <a:fillRect/>
+                          </a:stretch>
+                        </pic:blipFill>
+                        <pic:spPr bwMode="auto">
+                          <a:xfrm>
+                            <a:off x="0" y="0"/>
+                            <a:ext cx="152400" cy="152400"/>
+                          </a:xfrm>
+                          <a:prstGeom prst="rect">
+                            <a:avLst/>
+                          </a:prstGeom>
+                          <a:noFill/>
+                          <a:ln w="9525">
+                            <a:noFill/>
+                            <a:headEnd/>
+                            <a:tailEnd/>
+                          </a:ln>
+                        </pic:spPr>
+                      </pic:pic>
+                    </a:graphicData>
+                  </a:graphic>
+                </wp:inline>
+              </w:drawing>
+            </w:r>
+            <w:r>
+              <w:t xml:space="preserve"> </w:t>
+            </w:r>
+            <w:r>
+              <w:t xml:space="preserve"> </w:t>
+            </w:r>
+            <w:r>
+              <w:t xml:space="preserve">Important</w:t>
+            </w:r>
+          </w:p>
+        </w:tc>
+      </w:tr>
+      <w:tr>
+        <w:trPr>
+          <w:cantSplit/>
+        </w:trPr>
+        <w:tc>
+          <w:tcPr>
+            <w:tcMar>
+              <w:top w:w="108" w:type="dxa"/>
+              <w:bottom w:w="108" w:type="dxa"/>
+            </w:tcMar>
+          </w:tcPr>
+          <w:p>
+            <w:pPr>
+              <w:pStyle w:val="BodyText"/>
+            </w:pPr>
+            <w:pPr>
+              <w:spacing w:before="16" w:after="16"/>
+            </w:pPr>
+            <w:r>
+              <w:t xml:space="preserve">It is recommended to leave a space before and after the</w:t>
+            </w:r>
+            <w:r>
+              <w:t xml:space="preserve"> </w:t>
+            </w:r>
+            <w:r>
+              <w:rPr>
+                <w:rStyle w:val="VerbatimChar"/>
+              </w:rPr>
+              <w:t xml:space="preserve">/</w:t>
+            </w:r>
+            <w:r>
+              <w:t xml:space="preserve"> </w:t>
+            </w:r>
+            <w:r>
+              <w:t xml:space="preserve">character. So the previous examples would look like this:</w:t>
+            </w:r>
+          </w:p>
+        </w:tc>
+      </w:tr>
+    </w:tbl>
+    <w:p>
+      <w:pPr>
+        <w:pStyle w:val="BodyText"/>
       </w:pPr>
       <w:r>
         <w:t xml:space="preserve">¦Corrected examples:</w:t>
@@ -5875,35 +5925,131 @@
         <w:t xml:space="preserve">Words in bold on the original manual shown in normal font or vice versa</w:t>
       </w:r>
     </w:p>
-    <w:p>
-      <w:pPr>
-        <w:pStyle w:val="BlockText"/>
-      </w:pPr>
-      <w:r>
-        <w:t xml:space="preserve">Some words, like the author’s list in the screenshot before, will be copied with normal font even if shown in</w:t>
-      </w:r>
-      <w:r>
-        <w:t xml:space="preserve"> </w:t>
-      </w:r>
-      <w:r>
-        <w:t xml:space="preserve">bold on the original manual. This is also intended for clarity. Likewise, words that are not in bold on the</w:t>
-      </w:r>
-      <w:r>
-        <w:t xml:space="preserve"> </w:t>
-      </w:r>
-      <w:r>
-        <w:t xml:space="preserve">original manual (like</w:t>
-      </w:r>
-      <w:r>
-        <w:t xml:space="preserve"> </w:t>
-      </w:r>
-      <w:r>
-        <w:t xml:space="preserve">‘Trigger’</w:t>
-      </w:r>
-      <w:r>
-        <w:t xml:space="preserve">) get transcribed in bold to set the limits of a section.</w:t>
-      </w:r>
-    </w:p>
+    <w:tbl>
+      <w:tblPr>
+        <w:tblStyle w:val="Table"/>
+        <w:tblLook w:firstRow="0" w:lastRow="0" w:firstColumn="0" w:lastColumn="0" w:noHBand="0" w:noVBand="0" w:val="0000"/>
+        <w:tblBorders>
+          <w:left w:val="single" w:sz="24" w:space="0" w:color="0758E5"/>
+          <w:right w:val="single" w:sz="4" w:space="0" w:color="0758E5"/>
+          <w:top w:val="single" w:sz="4" w:space="0" w:color="0758E5"/>
+          <w:bottom w:val="single" w:sz="4" w:space="0" w:color="0758E5"/>
+        </w:tblBorders>
+        <w:tblCellMar>
+          <w:left w:w="144" w:type="dxa"/>
+          <w:right w:w="144" w:type="dxa"/>
+        </w:tblCellMar>
+        <w:tblInd w:w="164" w:type="dxa"/>
+        <w:tblW w:type="pct" w:w="100%"/>
+      </w:tblPr>
+      <w:tr>
+        <w:trPr>
+          <w:cantSplit/>
+        </w:trPr>
+        <w:tc>
+          <w:tcPr>
+            <w:shd w:color="auto" w:fill="dae6fb" w:val="clear"/>
+            <w:tcMar>
+              <w:top w:w="92" w:type="dxa"/>
+              <w:bottom w:w="92" w:type="dxa"/>
+            </w:tcMar>
+          </w:tcPr>
+          <w:p>
+            <w:pPr>
+              <w:pStyle w:val="FirstParagraph"/>
+            </w:pPr>
+            <w:pPr>
+              <w:spacing w:before="0" w:after="0"/>
+              <w:textAlignment w:val="center"/>
+            </w:pPr>
+            <w:r>
+              <w:drawing>
+                <wp:inline>
+                  <wp:extent cx="152400" cy="152400"/>
+                  <wp:effectExtent b="0" l="0" r="0" t="0"/>
+                  <wp:docPr descr="" title="" id="69" name="Picture"/>
+                  <a:graphic>
+                    <a:graphicData uri="http://schemas.openxmlformats.org/drawingml/2006/picture">
+                      <pic:pic>
+                        <pic:nvPicPr>
+                          <pic:cNvPr descr="C:\Users\vijgia\AppData\Local\Programs\Quarto\share\formats\docx\note.png" id="70" name="Picture"/>
+                          <pic:cNvPicPr>
+                            <a:picLocks noChangeArrowheads="1" noChangeAspect="1"/>
+                          </pic:cNvPicPr>
+                        </pic:nvPicPr>
+                        <pic:blipFill>
+                          <a:blip r:embed="rId63"/>
+                          <a:stretch>
+                            <a:fillRect/>
+                          </a:stretch>
+                        </pic:blipFill>
+                        <pic:spPr bwMode="auto">
+                          <a:xfrm>
+                            <a:off x="0" y="0"/>
+                            <a:ext cx="152400" cy="152400"/>
+                          </a:xfrm>
+                          <a:prstGeom prst="rect">
+                            <a:avLst/>
+                          </a:prstGeom>
+                          <a:noFill/>
+                          <a:ln w="9525">
+                            <a:noFill/>
+                            <a:headEnd/>
+                            <a:tailEnd/>
+                          </a:ln>
+                        </pic:spPr>
+                      </pic:pic>
+                    </a:graphicData>
+                  </a:graphic>
+                </wp:inline>
+              </w:drawing>
+            </w:r>
+            <w:r>
+              <w:t xml:space="preserve"> </w:t>
+            </w:r>
+            <w:r>
+              <w:t xml:space="preserve"> </w:t>
+            </w:r>
+            <w:r>
+              <w:t xml:space="preserve">Note</w:t>
+            </w:r>
+          </w:p>
+        </w:tc>
+      </w:tr>
+      <w:tr>
+        <w:trPr>
+          <w:cantSplit/>
+        </w:trPr>
+        <w:tc>
+          <w:tcPr>
+            <w:tcMar>
+              <w:top w:w="108" w:type="dxa"/>
+              <w:bottom w:w="108" w:type="dxa"/>
+            </w:tcMar>
+          </w:tcPr>
+          <w:p>
+            <w:pPr>
+              <w:pStyle w:val="BodyText"/>
+            </w:pPr>
+            <w:pPr>
+              <w:spacing w:before="16" w:after="16"/>
+            </w:pPr>
+            <w:r>
+              <w:t xml:space="preserve">Some words, like the author’s list in the screenshot before, will be copied with normal font even if shown in bold on the original manual. This is also intended for clarity. Likewise, words that are not in bold on the original manual (like</w:t>
+            </w:r>
+            <w:r>
+              <w:t xml:space="preserve"> </w:t>
+            </w:r>
+            <w:r>
+              <w:t xml:space="preserve">‘Trigger’</w:t>
+            </w:r>
+            <w:r>
+              <w:t xml:space="preserve">) get transcribed in bold to set the limits of a section.</w:t>
+            </w:r>
+          </w:p>
+        </w:tc>
+      </w:tr>
+    </w:tbl>
     <w:p>
       <w:pPr>
         <w:pStyle w:val="Compact"/>
@@ -5916,51 +6062,250 @@
         <w:t xml:space="preserve">Lists with short sentences vs lists with long sentences</w:t>
       </w:r>
     </w:p>
-    <w:p>
-      <w:pPr>
-        <w:pStyle w:val="BlockText"/>
-      </w:pPr>
-      <w:r>
-        <w:t xml:space="preserve">When transcribing ordered lists, it is recommended not to use the</w:t>
-      </w:r>
-      <w:r>
-        <w:t xml:space="preserve"> </w:t>
-      </w:r>
-      <w:r>
-        <w:rPr>
-          <w:rStyle w:val="VerbatimChar"/>
-        </w:rPr>
-        <w:t xml:space="preserve">&lt;ol&gt;&lt;/ol&gt;</w:t>
-      </w:r>
-      <w:r>
-        <w:t xml:space="preserve"> </w:t>
-      </w:r>
-      <w:r>
-        <w:t xml:space="preserve">format unless strictly necessary,</w:t>
-      </w:r>
-      <w:r>
-        <w:t xml:space="preserve"> </w:t>
-      </w:r>
-      <w:r>
-        <w:t xml:space="preserve">as mentioned before. It is also important to separate short sentences with just one</w:t>
-      </w:r>
-      <w:r>
-        <w:t xml:space="preserve"> </w:t>
-      </w:r>
-      <w:r>
-        <w:rPr>
-          <w:rStyle w:val="VerbatimChar"/>
-        </w:rPr>
-        <w:t xml:space="preserve">&lt;br&gt;</w:t>
-      </w:r>
-      <w:r>
-        <w:t xml:space="preserve"> </w:t>
-      </w:r>
-      <w:r>
-        <w:t xml:space="preserve">space, but use two</w:t>
-      </w:r>
-      <w:r>
-        <w:t xml:space="preserve"> </w:t>
+    <w:tbl>
+      <w:tblPr>
+        <w:tblStyle w:val="Table"/>
+        <w:tblLook w:firstRow="0" w:lastRow="0" w:firstColumn="0" w:lastColumn="0" w:noHBand="0" w:noVBand="0" w:val="0000"/>
+        <w:tblBorders>
+          <w:left w:val="single" w:sz="24" w:space="0" w:color="00A047"/>
+          <w:right w:val="single" w:sz="4" w:space="0" w:color="00A047"/>
+          <w:top w:val="single" w:sz="4" w:space="0" w:color="00A047"/>
+          <w:bottom w:val="single" w:sz="4" w:space="0" w:color="00A047"/>
+        </w:tblBorders>
+        <w:tblCellMar>
+          <w:left w:w="144" w:type="dxa"/>
+          <w:right w:w="144" w:type="dxa"/>
+        </w:tblCellMar>
+        <w:tblInd w:w="164" w:type="dxa"/>
+        <w:tblW w:type="pct" w:w="100%"/>
+      </w:tblPr>
+      <w:tr>
+        <w:trPr>
+          <w:cantSplit/>
+        </w:trPr>
+        <w:tc>
+          <w:tcPr>
+            <w:shd w:color="auto" w:fill="ccf1e3" w:val="clear"/>
+            <w:tcMar>
+              <w:top w:w="92" w:type="dxa"/>
+              <w:bottom w:w="92" w:type="dxa"/>
+            </w:tcMar>
+          </w:tcPr>
+          <w:p>
+            <w:pPr>
+              <w:pStyle w:val="FirstParagraph"/>
+            </w:pPr>
+            <w:pPr>
+              <w:spacing w:before="0" w:after="0"/>
+              <w:textAlignment w:val="center"/>
+            </w:pPr>
+            <w:r>
+              <w:drawing>
+                <wp:inline>
+                  <wp:extent cx="152400" cy="152400"/>
+                  <wp:effectExtent b="0" l="0" r="0" t="0"/>
+                  <wp:docPr descr="" title="" id="72" name="Picture"/>
+                  <a:graphic>
+                    <a:graphicData uri="http://schemas.openxmlformats.org/drawingml/2006/picture">
+                      <pic:pic>
+                        <pic:nvPicPr>
+                          <pic:cNvPr descr="C:\Users\vijgia\AppData\Local\Programs\Quarto\share\formats\docx\tip.png" id="73" name="Picture"/>
+                          <pic:cNvPicPr>
+                            <a:picLocks noChangeArrowheads="1" noChangeAspect="1"/>
+                          </pic:cNvPicPr>
+                        </pic:nvPicPr>
+                        <pic:blipFill>
+                          <a:blip r:embed="rId71"/>
+                          <a:stretch>
+                            <a:fillRect/>
+                          </a:stretch>
+                        </pic:blipFill>
+                        <pic:spPr bwMode="auto">
+                          <a:xfrm>
+                            <a:off x="0" y="0"/>
+                            <a:ext cx="152400" cy="152400"/>
+                          </a:xfrm>
+                          <a:prstGeom prst="rect">
+                            <a:avLst/>
+                          </a:prstGeom>
+                          <a:noFill/>
+                          <a:ln w="9525">
+                            <a:noFill/>
+                            <a:headEnd/>
+                            <a:tailEnd/>
+                          </a:ln>
+                        </pic:spPr>
+                      </pic:pic>
+                    </a:graphicData>
+                  </a:graphic>
+                </wp:inline>
+              </w:drawing>
+            </w:r>
+            <w:r>
+              <w:t xml:space="preserve"> </w:t>
+            </w:r>
+            <w:r>
+              <w:t xml:space="preserve"> </w:t>
+            </w:r>
+            <w:r>
+              <w:t xml:space="preserve">Tip</w:t>
+            </w:r>
+          </w:p>
+        </w:tc>
+      </w:tr>
+      <w:tr>
+        <w:trPr>
+          <w:cantSplit/>
+        </w:trPr>
+        <w:tc>
+          <w:tcPr>
+            <w:tcMar>
+              <w:top w:w="108" w:type="dxa"/>
+              <w:bottom w:w="108" w:type="dxa"/>
+            </w:tcMar>
+          </w:tcPr>
+          <w:p>
+            <w:pPr>
+              <w:pStyle w:val="BodyText"/>
+            </w:pPr>
+            <w:pPr>
+              <w:spacing w:before="16" w:after="16"/>
+            </w:pPr>
+            <w:r>
+              <w:t xml:space="preserve">When transcribing ordered lists, it is recommended not to use the</w:t>
+            </w:r>
+            <w:r>
+              <w:t xml:space="preserve"> </w:t>
+            </w:r>
+            <w:r>
+              <w:rPr>
+                <w:rStyle w:val="VerbatimChar"/>
+              </w:rPr>
+              <w:t xml:space="preserve">&lt;ol&gt;&lt;/ol&gt;</w:t>
+            </w:r>
+            <w:r>
+              <w:t xml:space="preserve"> </w:t>
+            </w:r>
+            <w:r>
+              <w:t xml:space="preserve">format unless strictly necessary, as mentioned before. It is also important to separate short sentences with just one</w:t>
+            </w:r>
+            <w:r>
+              <w:t xml:space="preserve"> </w:t>
+            </w:r>
+            <w:r>
+              <w:rPr>
+                <w:rStyle w:val="VerbatimChar"/>
+              </w:rPr>
+              <w:t xml:space="preserve">&lt;br&gt;</w:t>
+            </w:r>
+            <w:r>
+              <w:t xml:space="preserve"> </w:t>
+            </w:r>
+            <w:r>
+              <w:t xml:space="preserve">space, but use two</w:t>
+            </w:r>
+            <w:r>
+              <w:t xml:space="preserve"> </w:t>
+            </w:r>
+            <w:r>
+              <w:rPr>
+                <w:rStyle w:val="VerbatimChar"/>
+              </w:rPr>
+              <w:t xml:space="preserve">&lt;br&gt;&lt;br&gt;</w:t>
+            </w:r>
+            <w:r>
+              <w:t xml:space="preserve"> </w:t>
+            </w:r>
+            <w:r>
+              <w:t xml:space="preserve">spaces for longer sentences. This renders the long blocks of text neatly separated.</w:t>
+            </w:r>
+          </w:p>
+        </w:tc>
+      </w:tr>
+    </w:tbl>
+    <w:p>
+      <w:pPr>
+        <w:pStyle w:val="BodyText"/>
+      </w:pPr>
+      <w:r>
+        <w:t xml:space="preserve">¦Example of a list with short sentences:</w:t>
+      </w:r>
+    </w:p>
+    <w:p>
+      <w:pPr>
+        <w:pStyle w:val="SourceCode"/>
+      </w:pPr>
+      <w:r>
+        <w:rPr>
+          <w:rStyle w:val="VerbatimChar"/>
+        </w:rPr>
+        <w:t xml:space="preserve">&lt;b&gt;Coding&lt;/b&gt;</w:t>
+      </w:r>
+      <w:r>
+        <w:br/>
+      </w:r>
+      <w:r>
+        <w:rPr>
+          <w:rStyle w:val="VerbatimChar"/>
+        </w:rPr>
+        <w:t xml:space="preserve">&lt;div style="padding-left:3em;"&gt;</w:t>
+      </w:r>
+      <w:r>
+        <w:br/>
+      </w:r>
+      <w:r>
+        <w:rPr>
+          <w:rStyle w:val="VerbatimChar"/>
+        </w:rPr>
+        <w:t xml:space="preserve">&lt;b&gt;0.   Never&lt;/b&gt;&lt;br&gt;</w:t>
+      </w:r>
+      <w:r>
+        <w:br/>
+      </w:r>
+      <w:r>
+        <w:rPr>
+          <w:rStyle w:val="VerbatimChar"/>
+        </w:rPr>
+        <w:t xml:space="preserve">&lt;b&gt;1.   More than 30 days ago&lt;/b&gt;&lt;br&gt;</w:t>
+      </w:r>
+      <w:r>
+        <w:br/>
+      </w:r>
+      <w:r>
+        <w:rPr>
+          <w:rStyle w:val="VerbatimChar"/>
+        </w:rPr>
+        <w:t xml:space="preserve">&lt;b&gt;2.   8 to 30 days ago&lt;/b&gt;&lt;br&gt;</w:t>
+      </w:r>
+      <w:r>
+        <w:br/>
+      </w:r>
+      <w:r>
+        <w:rPr>
+          <w:rStyle w:val="VerbatimChar"/>
+        </w:rPr>
+        <w:t xml:space="preserve">&lt;b&gt;3.   4 to 7 days ago&lt;/b&gt;&lt;br&gt;</w:t>
+      </w:r>
+      <w:r>
+        <w:br/>
+      </w:r>
+      <w:r>
+        <w:rPr>
+          <w:rStyle w:val="VerbatimChar"/>
+        </w:rPr>
+        <w:t xml:space="preserve">&lt;b&gt;4.   In last 3 days&lt;/b&gt;&lt;br&gt;</w:t>
+      </w:r>
+      <w:r>
+        <w:br/>
+      </w:r>
+      <w:r>
+        <w:rPr>
+          <w:rStyle w:val="VerbatimChar"/>
+        </w:rPr>
+        <w:t xml:space="preserve">&lt;b&gt;8.   Unable to determine&lt;/b&gt;</w:t>
+      </w:r>
+      <w:r>
+        <w:br/>
       </w:r>
       <w:r>
         <w:rPr>
@@ -5968,19 +6313,72 @@
         </w:rPr>
         <w:t xml:space="preserve">&lt;br&gt;&lt;br&gt;</w:t>
       </w:r>
-      <w:r>
-        <w:t xml:space="preserve"> </w:t>
-      </w:r>
-      <w:r>
-        <w:t xml:space="preserve">spaces for longer sentences. This renders the long blocks of text neatly separated.</w:t>
-      </w:r>
     </w:p>
     <w:p>
       <w:pPr>
         <w:pStyle w:val="FirstParagraph"/>
       </w:pPr>
       <w:r>
-        <w:t xml:space="preserve">¦Example of a list with short sentences:</w:t>
+        <w:t xml:space="preserve">¦Output:</w:t>
+      </w:r>
+    </w:p>
+    <w:p>
+      <w:pPr>
+        <w:pStyle w:val="BodyText"/>
+      </w:pPr>
+      <w:r>
+        <w:t xml:space="preserve">Coding</w:t>
+      </w:r>
+    </w:p>
+    <w:p>
+      <w:pPr>
+        <w:pStyle w:val="BodyText"/>
+      </w:pPr>
+      <w:r>
+        <w:t xml:space="preserve">0. Never</w:t>
+      </w:r>
+      <w:r>
+        <w:t xml:space="preserve"> </w:t>
+      </w:r>
+      <w:r>
+        <w:t xml:space="preserve">1. More than 30 days ago</w:t>
+      </w:r>
+      <w:r>
+        <w:t xml:space="preserve"> </w:t>
+      </w:r>
+      <w:r>
+        <w:t xml:space="preserve">2. 8 to 30 days ago</w:t>
+      </w:r>
+      <w:r>
+        <w:t xml:space="preserve"> </w:t>
+      </w:r>
+      <w:r>
+        <w:t xml:space="preserve">3. 4 to 7 days ago</w:t>
+      </w:r>
+      <w:r>
+        <w:t xml:space="preserve"> </w:t>
+      </w:r>
+      <w:r>
+        <w:t xml:space="preserve">4. In last 3 days</w:t>
+      </w:r>
+      <w:r>
+        <w:t xml:space="preserve"> </w:t>
+      </w:r>
+      <w:r>
+        <w:t xml:space="preserve">8. Unable to determine</w:t>
+      </w:r>
+    </w:p>
+    <w:p>
+      <w:pPr>
+        <w:pStyle w:val="BodyText"/>
+      </w:pPr>
+    </w:p>
+    <w:p>
+      <w:pPr>
+        <w:pStyle w:val="BodyText"/>
+      </w:pPr>
+      <w:r>
+        <w:t xml:space="preserve">¦Example of a list with long sentences:</w:t>
       </w:r>
     </w:p>
     <w:p>
@@ -6009,52 +6407,7 @@
         <w:rPr>
           <w:rStyle w:val="VerbatimChar"/>
         </w:rPr>
-        <w:t xml:space="preserve">&lt;b&gt;0.   Never&lt;/b&gt;&lt;br&gt;</w:t>
-      </w:r>
-      <w:r>
-        <w:br/>
-      </w:r>
-      <w:r>
-        <w:rPr>
-          <w:rStyle w:val="VerbatimChar"/>
-        </w:rPr>
-        <w:t xml:space="preserve">&lt;b&gt;1.   More than 30 days ago&lt;/b&gt;&lt;br&gt;</w:t>
-      </w:r>
-      <w:r>
-        <w:br/>
-      </w:r>
-      <w:r>
-        <w:rPr>
-          <w:rStyle w:val="VerbatimChar"/>
-        </w:rPr>
-        <w:t xml:space="preserve">&lt;b&gt;2.   8 to 30 days ago&lt;/b&gt;&lt;br&gt;</w:t>
-      </w:r>
-      <w:r>
-        <w:br/>
-      </w:r>
-      <w:r>
-        <w:rPr>
-          <w:rStyle w:val="VerbatimChar"/>
-        </w:rPr>
-        <w:t xml:space="preserve">&lt;b&gt;3.   4 to 7 days ago&lt;/b&gt;&lt;br&gt;</w:t>
-      </w:r>
-      <w:r>
-        <w:br/>
-      </w:r>
-      <w:r>
-        <w:rPr>
-          <w:rStyle w:val="VerbatimChar"/>
-        </w:rPr>
-        <w:t xml:space="preserve">&lt;b&gt;4.   In last 3 days&lt;/b&gt;&lt;br&gt;</w:t>
-      </w:r>
-      <w:r>
-        <w:br/>
-      </w:r>
-      <w:r>
-        <w:rPr>
-          <w:rStyle w:val="VerbatimChar"/>
-        </w:rPr>
-        <w:t xml:space="preserve">&lt;b&gt;8.   Unable to determine&lt;/b&gt;</w:t>
+        <w:t xml:space="preserve">&lt;b&gt;0.   No decline&lt;/b&gt; — There was no change or there was an increase in the person’s level of participation in social activities.</w:t>
       </w:r>
       <w:r>
         <w:br/>
@@ -6065,6 +6418,48 @@
         </w:rPr>
         <w:t xml:space="preserve">&lt;br&gt;&lt;br&gt;</w:t>
       </w:r>
+      <w:r>
+        <w:br/>
+      </w:r>
+      <w:r>
+        <w:br/>
+      </w:r>
+      <w:r>
+        <w:rPr>
+          <w:rStyle w:val="VerbatimChar"/>
+        </w:rPr>
+        <w:t xml:space="preserve">&lt;b&gt;1.   Decline, not distressed&lt;/b&gt; — The person experienced a decline in his or her level of participation in social activities without a corresponding increase in his or her distress.</w:t>
+      </w:r>
+      <w:r>
+        <w:br/>
+      </w:r>
+      <w:r>
+        <w:rPr>
+          <w:rStyle w:val="VerbatimChar"/>
+        </w:rPr>
+        <w:t xml:space="preserve">&lt;br&gt;&lt;br&gt;</w:t>
+      </w:r>
+      <w:r>
+        <w:br/>
+      </w:r>
+      <w:r>
+        <w:br/>
+      </w:r>
+      <w:r>
+        <w:rPr>
+          <w:rStyle w:val="VerbatimChar"/>
+        </w:rPr>
+        <w:t xml:space="preserve">&lt;b&gt;2.   Decline, distressed&lt;/b&gt; — Both decline and distress are observed or reported.</w:t>
+      </w:r>
+      <w:r>
+        <w:br/>
+      </w:r>
+      <w:r>
+        <w:rPr>
+          <w:rStyle w:val="VerbatimChar"/>
+        </w:rPr>
+        <w:t xml:space="preserve">&lt;/div&gt;</w:t>
+      </w:r>
     </w:p>
     <w:p>
       <w:pPr>
@@ -6087,153 +6482,6 @@
         <w:pStyle w:val="BodyText"/>
       </w:pPr>
       <w:r>
-        <w:t xml:space="preserve">0. Never</w:t>
-      </w:r>
-      <w:r>
-        <w:t xml:space="preserve"> </w:t>
-      </w:r>
-      <w:r>
-        <w:t xml:space="preserve">1. More than 30 days ago</w:t>
-      </w:r>
-      <w:r>
-        <w:t xml:space="preserve"> </w:t>
-      </w:r>
-      <w:r>
-        <w:t xml:space="preserve">2. 8 to 30 days ago</w:t>
-      </w:r>
-      <w:r>
-        <w:t xml:space="preserve"> </w:t>
-      </w:r>
-      <w:r>
-        <w:t xml:space="preserve">3. 4 to 7 days ago</w:t>
-      </w:r>
-      <w:r>
-        <w:t xml:space="preserve"> </w:t>
-      </w:r>
-      <w:r>
-        <w:t xml:space="preserve">4. In last 3 days</w:t>
-      </w:r>
-      <w:r>
-        <w:t xml:space="preserve"> </w:t>
-      </w:r>
-      <w:r>
-        <w:t xml:space="preserve">8. Unable to determine</w:t>
-      </w:r>
-    </w:p>
-    <w:p>
-      <w:pPr>
-        <w:pStyle w:val="BodyText"/>
-      </w:pPr>
-    </w:p>
-    <w:p>
-      <w:pPr>
-        <w:pStyle w:val="BodyText"/>
-      </w:pPr>
-      <w:r>
-        <w:t xml:space="preserve">¦Example of a list with long sentences:</w:t>
-      </w:r>
-    </w:p>
-    <w:p>
-      <w:pPr>
-        <w:pStyle w:val="SourceCode"/>
-      </w:pPr>
-      <w:r>
-        <w:rPr>
-          <w:rStyle w:val="VerbatimChar"/>
-        </w:rPr>
-        <w:t xml:space="preserve">&lt;b&gt;Coding&lt;/b&gt;</w:t>
-      </w:r>
-      <w:r>
-        <w:br/>
-      </w:r>
-      <w:r>
-        <w:rPr>
-          <w:rStyle w:val="VerbatimChar"/>
-        </w:rPr>
-        <w:t xml:space="preserve">&lt;div style="padding-left:3em;"&gt;</w:t>
-      </w:r>
-      <w:r>
-        <w:br/>
-      </w:r>
-      <w:r>
-        <w:rPr>
-          <w:rStyle w:val="VerbatimChar"/>
-        </w:rPr>
-        <w:t xml:space="preserve">&lt;b&gt;0.   No decline&lt;/b&gt; — There was no change or there was an increase in the person’s level of participation in social activities.</w:t>
-      </w:r>
-      <w:r>
-        <w:br/>
-      </w:r>
-      <w:r>
-        <w:rPr>
-          <w:rStyle w:val="VerbatimChar"/>
-        </w:rPr>
-        <w:t xml:space="preserve">&lt;br&gt;&lt;br&gt;</w:t>
-      </w:r>
-      <w:r>
-        <w:br/>
-      </w:r>
-      <w:r>
-        <w:br/>
-      </w:r>
-      <w:r>
-        <w:rPr>
-          <w:rStyle w:val="VerbatimChar"/>
-        </w:rPr>
-        <w:t xml:space="preserve">&lt;b&gt;1.   Decline, not distressed&lt;/b&gt; — The person experienced a decline in his or her level of participation in social activities without a corresponding increase in his or her distress.</w:t>
-      </w:r>
-      <w:r>
-        <w:br/>
-      </w:r>
-      <w:r>
-        <w:rPr>
-          <w:rStyle w:val="VerbatimChar"/>
-        </w:rPr>
-        <w:t xml:space="preserve">&lt;br&gt;&lt;br&gt;</w:t>
-      </w:r>
-      <w:r>
-        <w:br/>
-      </w:r>
-      <w:r>
-        <w:br/>
-      </w:r>
-      <w:r>
-        <w:rPr>
-          <w:rStyle w:val="VerbatimChar"/>
-        </w:rPr>
-        <w:t xml:space="preserve">&lt;b&gt;2.   Decline, distressed&lt;/b&gt; — Both decline and distress are observed or reported.</w:t>
-      </w:r>
-      <w:r>
-        <w:br/>
-      </w:r>
-      <w:r>
-        <w:rPr>
-          <w:rStyle w:val="VerbatimChar"/>
-        </w:rPr>
-        <w:t xml:space="preserve">&lt;/div&gt;</w:t>
-      </w:r>
-    </w:p>
-    <w:p>
-      <w:pPr>
-        <w:pStyle w:val="FirstParagraph"/>
-      </w:pPr>
-      <w:r>
-        <w:t xml:space="preserve">¦Output:</w:t>
-      </w:r>
-    </w:p>
-    <w:p>
-      <w:pPr>
-        <w:pStyle w:val="BodyText"/>
-      </w:pPr>
-      <w:r>
-        <w:t xml:space="preserve">Coding</w:t>
-      </w:r>
-    </w:p>
-    <w:p>
-      <w:pPr>
-        <w:pStyle w:val="BodyText"/>
-      </w:pPr>
-      <w:r>
         <w:t xml:space="preserve">0. No decline</w:t>
       </w:r>
       <w:r>
@@ -6277,42 +6525,14 @@
         <w:t xml:space="preserve">— Both decline and distress are observed or reported.</w:t>
       </w:r>
     </w:p>
-    <w:bookmarkStart w:id="63" w:name="section"/>
-    <w:p>
-      <w:pPr>
-        <w:pStyle w:val="Heading345"/>
-      </w:pPr>
-    </w:p>
-    <w:bookmarkEnd w:id="63"/>
-    <w:bookmarkEnd w:id="64"/>
-    <w:bookmarkEnd w:id="65"/>
-    <w:bookmarkStart w:id="66" w:name="smartypants"/>
-    <w:p>
-      <w:pPr>
-        <w:pStyle w:val="Heading2"/>
-      </w:pPr>
-      <w:r>
-        <w:t xml:space="preserve">SmartyPants</w:t>
-      </w:r>
-    </w:p>
-    <w:p>
-      <w:pPr>
-        <w:pStyle w:val="FirstParagraph"/>
-      </w:pPr>
-      <w:r>
-        <w:t xml:space="preserve">SmartyPants converts ASCII punctuation characters into</w:t>
-      </w:r>
-      <w:r>
-        <w:t xml:space="preserve"> </w:t>
-      </w:r>
-      <w:r>
-        <w:t xml:space="preserve">“smart”</w:t>
-      </w:r>
-      <w:r>
-        <w:t xml:space="preserve"> </w:t>
-      </w:r>
-      <w:r>
-        <w:t xml:space="preserve">typographic punctuation HTML entities. For example:</w:t>
+    <w:bookmarkEnd w:id="74"/>
+    <w:bookmarkStart w:id="76" w:name="X91a6c4be80cfe7ebf6ed799c3e03b0814cc3082"/>
+    <w:p>
+      <w:pPr>
+        <w:pStyle w:val="Heading3"/>
+      </w:pPr>
+      <w:r>
+        <w:t xml:space="preserve">Availability of the interRAI instruments with CAP output in our main customer base</w:t>
       </w:r>
     </w:p>
     <w:tbl>
@@ -6323,9 +6543,586 @@
         <w:tblLook w:firstRow="1" w:lastRow="0" w:firstColumn="0" w:lastColumn="0" w:noHBand="0" w:noVBand="0" w:val="0020"/>
       </w:tblPr>
       <w:tblGrid>
-        <w:gridCol w:w="1667"/>
-        <w:gridCol w:w="3230"/>
-        <w:gridCol w:w="3022"/>
+        <w:gridCol w:w="2310"/>
+        <w:gridCol w:w="1870"/>
+        <w:gridCol w:w="1870"/>
+        <w:gridCol w:w="1870"/>
+      </w:tblGrid>
+      <w:tr>
+        <w:trPr>
+          <w:tblHeader w:val="on"/>
+        </w:trPr>
+        <w:tc>
+          <w:tcPr/>
+          <w:p>
+            <w:pPr>
+              <w:pStyle w:val="Compact"/>
+            </w:pPr>
+            <w:r>
+              <w:rPr>
+                <w:b/>
+                <w:bCs/>
+              </w:rPr>
+              <w:t xml:space="preserve">interRAI Instrument</w:t>
+            </w:r>
+          </w:p>
+        </w:tc>
+        <w:tc>
+          <w:tcPr/>
+          <w:p>
+            <w:pPr>
+              <w:pStyle w:val="Compact"/>
+            </w:pPr>
+            <w:r>
+              <w:rPr>
+                <w:b/>
+                <w:bCs/>
+              </w:rPr>
+              <w:t xml:space="preserve">Finland</w:t>
+            </w:r>
+          </w:p>
+        </w:tc>
+        <w:tc>
+          <w:tcPr/>
+          <w:p>
+            <w:pPr>
+              <w:pStyle w:val="Compact"/>
+            </w:pPr>
+            <w:r>
+              <w:rPr>
+                <w:b/>
+                <w:bCs/>
+              </w:rPr>
+              <w:t xml:space="preserve">Switzerland</w:t>
+            </w:r>
+          </w:p>
+        </w:tc>
+        <w:tc>
+          <w:tcPr/>
+          <w:p>
+            <w:pPr>
+              <w:pStyle w:val="Compact"/>
+            </w:pPr>
+            <w:r>
+              <w:rPr>
+                <w:b/>
+                <w:bCs/>
+              </w:rPr>
+              <w:t xml:space="preserve">Canada</w:t>
+            </w:r>
+          </w:p>
+        </w:tc>
+      </w:tr>
+      <w:tr>
+        <w:tc>
+          <w:tcPr/>
+          <w:p>
+            <w:pPr>
+              <w:pStyle w:val="Compact"/>
+            </w:pPr>
+            <w:r>
+              <w:t xml:space="preserve">Home Care (HC)</w:t>
+            </w:r>
+          </w:p>
+        </w:tc>
+        <w:tc>
+          <w:tcPr/>
+          <w:p>
+            <w:pPr>
+              <w:pStyle w:val="Compact"/>
+            </w:pPr>
+            <w:r>
+              <w:t xml:space="preserve">YES</w:t>
+            </w:r>
+          </w:p>
+        </w:tc>
+        <w:tc>
+          <w:tcPr/>
+          <w:p>
+            <w:pPr>
+              <w:pStyle w:val="Compact"/>
+            </w:pPr>
+            <w:r>
+              <w:t xml:space="preserve">YES</w:t>
+            </w:r>
+          </w:p>
+        </w:tc>
+        <w:tc>
+          <w:tcPr/>
+          <w:p>
+            <w:pPr>
+              <w:pStyle w:val="Compact"/>
+            </w:pPr>
+            <w:r>
+              <w:t xml:space="preserve">YES</w:t>
+            </w:r>
+          </w:p>
+        </w:tc>
+      </w:tr>
+      <w:tr>
+        <w:tc>
+          <w:tcPr/>
+          <w:p>
+            <w:pPr>
+              <w:pStyle w:val="Compact"/>
+            </w:pPr>
+            <w:r>
+              <w:t xml:space="preserve">Long-Term Care Facilities (LTCF)</w:t>
+            </w:r>
+          </w:p>
+        </w:tc>
+        <w:tc>
+          <w:tcPr/>
+          <w:p>
+            <w:pPr>
+              <w:pStyle w:val="Compact"/>
+            </w:pPr>
+            <w:r>
+              <w:t xml:space="preserve">YES</w:t>
+            </w:r>
+          </w:p>
+        </w:tc>
+        <w:tc>
+          <w:tcPr/>
+          <w:p>
+            <w:pPr>
+              <w:pStyle w:val="Compact"/>
+            </w:pPr>
+            <w:r>
+              <w:t xml:space="preserve">YES</w:t>
+            </w:r>
+          </w:p>
+        </w:tc>
+        <w:tc>
+          <w:tcPr/>
+          <w:p>
+            <w:pPr>
+              <w:pStyle w:val="Compact"/>
+            </w:pPr>
+            <w:r>
+              <w:t xml:space="preserve">YES</w:t>
+            </w:r>
+          </w:p>
+        </w:tc>
+      </w:tr>
+      <w:tr>
+        <w:tc>
+          <w:tcPr/>
+          <w:p>
+            <w:pPr>
+              <w:pStyle w:val="Compact"/>
+            </w:pPr>
+            <w:r>
+              <w:t xml:space="preserve">Acute Care (AC-CGA)</w:t>
+            </w:r>
+          </w:p>
+        </w:tc>
+        <w:tc>
+          <w:tcPr/>
+          <w:p>
+            <w:pPr>
+              <w:pStyle w:val="Compact"/>
+            </w:pPr>
+            <w:r>
+              <w:t xml:space="preserve">NO</w:t>
+            </w:r>
+          </w:p>
+        </w:tc>
+        <w:tc>
+          <w:tcPr/>
+          <w:p>
+            <w:pPr>
+              <w:pStyle w:val="Compact"/>
+            </w:pPr>
+            <w:r>
+              <w:t xml:space="preserve">YES</w:t>
+            </w:r>
+          </w:p>
+        </w:tc>
+        <w:tc>
+          <w:tcPr/>
+          <w:p>
+            <w:pPr>
+              <w:pStyle w:val="Compact"/>
+            </w:pPr>
+            <w:r>
+              <w:t xml:space="preserve">YES</w:t>
+            </w:r>
+          </w:p>
+        </w:tc>
+      </w:tr>
+      <w:tr>
+        <w:tc>
+          <w:tcPr/>
+          <w:p>
+            <w:pPr>
+              <w:pStyle w:val="Compact"/>
+            </w:pPr>
+            <w:r>
+              <w:t xml:space="preserve">Palliative Care (PC)</w:t>
+            </w:r>
+          </w:p>
+        </w:tc>
+        <w:tc>
+          <w:tcPr/>
+          <w:p>
+            <w:pPr>
+              <w:pStyle w:val="Compact"/>
+            </w:pPr>
+            <w:r>
+              <w:t xml:space="preserve">NO</w:t>
+            </w:r>
+          </w:p>
+        </w:tc>
+        <w:tc>
+          <w:tcPr/>
+          <w:p>
+            <w:pPr>
+              <w:pStyle w:val="Compact"/>
+            </w:pPr>
+            <w:r>
+              <w:t xml:space="preserve">NO</w:t>
+            </w:r>
+          </w:p>
+        </w:tc>
+        <w:tc>
+          <w:tcPr/>
+          <w:p>
+            <w:pPr>
+              <w:pStyle w:val="Compact"/>
+            </w:pPr>
+            <w:r>
+              <w:t xml:space="preserve">YES</w:t>
+            </w:r>
+          </w:p>
+        </w:tc>
+      </w:tr>
+      <w:tr>
+        <w:tc>
+          <w:tcPr/>
+          <w:p>
+            <w:pPr>
+              <w:pStyle w:val="Compact"/>
+            </w:pPr>
+            <w:r>
+              <w:t xml:space="preserve">Mental Health (MH)</w:t>
+            </w:r>
+          </w:p>
+        </w:tc>
+        <w:tc>
+          <w:tcPr/>
+          <w:p>
+            <w:pPr>
+              <w:pStyle w:val="Compact"/>
+            </w:pPr>
+            <w:r>
+              <w:t xml:space="preserve">YES</w:t>
+            </w:r>
+          </w:p>
+        </w:tc>
+        <w:tc>
+          <w:tcPr/>
+          <w:p>
+            <w:pPr>
+              <w:pStyle w:val="Compact"/>
+            </w:pPr>
+            <w:r>
+              <w:t xml:space="preserve">YES</w:t>
+            </w:r>
+          </w:p>
+        </w:tc>
+        <w:tc>
+          <w:tcPr/>
+          <w:p>
+            <w:pPr>
+              <w:pStyle w:val="Compact"/>
+            </w:pPr>
+            <w:r>
+              <w:t xml:space="preserve">YES</w:t>
+            </w:r>
+          </w:p>
+        </w:tc>
+      </w:tr>
+      <w:tr>
+        <w:tc>
+          <w:tcPr/>
+          <w:p>
+            <w:pPr>
+              <w:pStyle w:val="Compact"/>
+            </w:pPr>
+            <w:r>
+              <w:t xml:space="preserve">Child &amp; Youth Mental Health (ChYMH)</w:t>
+            </w:r>
+          </w:p>
+        </w:tc>
+        <w:tc>
+          <w:tcPr/>
+          <w:p>
+            <w:pPr>
+              <w:pStyle w:val="Compact"/>
+            </w:pPr>
+            <w:r>
+              <w:t xml:space="preserve">YES</w:t>
+            </w:r>
+          </w:p>
+        </w:tc>
+        <w:tc>
+          <w:tcPr/>
+          <w:p>
+            <w:pPr>
+              <w:pStyle w:val="Compact"/>
+            </w:pPr>
+            <w:r>
+              <w:t xml:space="preserve">NO</w:t>
+            </w:r>
+          </w:p>
+        </w:tc>
+        <w:tc>
+          <w:tcPr/>
+          <w:p>
+            <w:pPr>
+              <w:pStyle w:val="Compact"/>
+            </w:pPr>
+            <w:r>
+              <w:t xml:space="preserve">YES</w:t>
+            </w:r>
+          </w:p>
+        </w:tc>
+      </w:tr>
+      <w:tr>
+        <w:tc>
+          <w:tcPr/>
+          <w:p>
+            <w:pPr>
+              <w:pStyle w:val="Compact"/>
+            </w:pPr>
+            <w:r>
+              <w:t xml:space="preserve">Intellectual Disability (ID)</w:t>
+            </w:r>
+          </w:p>
+        </w:tc>
+        <w:tc>
+          <w:tcPr/>
+          <w:p>
+            <w:pPr>
+              <w:pStyle w:val="Compact"/>
+            </w:pPr>
+            <w:r>
+              <w:t xml:space="preserve">YES</w:t>
+            </w:r>
+          </w:p>
+        </w:tc>
+        <w:tc>
+          <w:tcPr/>
+          <w:p>
+            <w:pPr>
+              <w:pStyle w:val="Compact"/>
+            </w:pPr>
+            <w:r>
+              <w:t xml:space="preserve">YES</w:t>
+            </w:r>
+          </w:p>
+        </w:tc>
+        <w:tc>
+          <w:tcPr/>
+          <w:p>
+            <w:pPr>
+              <w:pStyle w:val="Compact"/>
+            </w:pPr>
+            <w:r>
+              <w:t xml:space="preserve">YES</w:t>
+            </w:r>
+          </w:p>
+        </w:tc>
+      </w:tr>
+      <w:tr>
+        <w:tc>
+          <w:tcPr/>
+          <w:p>
+            <w:pPr>
+              <w:pStyle w:val="Compact"/>
+            </w:pPr>
+            <w:r>
+              <w:t xml:space="preserve">Emergency Department Screener (ED)</w:t>
+            </w:r>
+          </w:p>
+        </w:tc>
+        <w:tc>
+          <w:tcPr/>
+          <w:p>
+            <w:pPr>
+              <w:pStyle w:val="Compact"/>
+            </w:pPr>
+            <w:r>
+              <w:t xml:space="preserve">YES</w:t>
+            </w:r>
+          </w:p>
+        </w:tc>
+        <w:tc>
+          <w:tcPr/>
+          <w:p>
+            <w:pPr>
+              <w:pStyle w:val="Compact"/>
+            </w:pPr>
+            <w:r>
+              <w:t xml:space="preserve">YES</w:t>
+            </w:r>
+          </w:p>
+        </w:tc>
+        <w:tc>
+          <w:tcPr/>
+          <w:p>
+            <w:pPr>
+              <w:pStyle w:val="Compact"/>
+            </w:pPr>
+            <w:r>
+              <w:t xml:space="preserve">YES</w:t>
+            </w:r>
+          </w:p>
+        </w:tc>
+      </w:tr>
+      <w:tr>
+        <w:tc>
+          <w:tcPr/>
+          <w:p>
+            <w:pPr>
+              <w:pStyle w:val="Compact"/>
+            </w:pPr>
+            <w:r>
+              <w:t xml:space="preserve">Community Mental Health (CMH)</w:t>
+            </w:r>
+          </w:p>
+        </w:tc>
+        <w:tc>
+          <w:tcPr/>
+          <w:p>
+            <w:pPr>
+              <w:pStyle w:val="Compact"/>
+            </w:pPr>
+            <w:r>
+              <w:t xml:space="preserve">YES</w:t>
+            </w:r>
+          </w:p>
+        </w:tc>
+        <w:tc>
+          <w:tcPr/>
+          <w:p>
+            <w:pPr>
+              <w:pStyle w:val="Compact"/>
+            </w:pPr>
+            <w:r>
+              <w:t xml:space="preserve">YES</w:t>
+            </w:r>
+          </w:p>
+        </w:tc>
+        <w:tc>
+          <w:tcPr/>
+          <w:p>
+            <w:pPr>
+              <w:pStyle w:val="Compact"/>
+            </w:pPr>
+            <w:r>
+              <w:t xml:space="preserve">YES</w:t>
+            </w:r>
+          </w:p>
+        </w:tc>
+      </w:tr>
+      <w:tr>
+        <w:tc>
+          <w:tcPr/>
+          <w:p>
+            <w:pPr>
+              <w:pStyle w:val="Compact"/>
+            </w:pPr>
+            <w:r>
+              <w:t xml:space="preserve">Children &amp; Youth MH + Developmental Disabilities</w:t>
+            </w:r>
+          </w:p>
+        </w:tc>
+        <w:tc>
+          <w:tcPr/>
+          <w:p>
+            <w:pPr>
+              <w:pStyle w:val="Compact"/>
+            </w:pPr>
+            <w:r>
+              <w:t xml:space="preserve">YES</w:t>
+            </w:r>
+          </w:p>
+        </w:tc>
+        <w:tc>
+          <w:tcPr/>
+          <w:p>
+            <w:pPr>
+              <w:pStyle w:val="Compact"/>
+            </w:pPr>
+            <w:r>
+              <w:t xml:space="preserve">NO</w:t>
+            </w:r>
+          </w:p>
+        </w:tc>
+        <w:tc>
+          <w:tcPr/>
+          <w:p>
+            <w:pPr>
+              <w:pStyle w:val="Compact"/>
+            </w:pPr>
+            <w:r>
+              <w:t xml:space="preserve">YES</w:t>
+            </w:r>
+          </w:p>
+        </w:tc>
+      </w:tr>
+    </w:tbl>
+    <w:bookmarkStart w:id="75" w:name="section"/>
+    <w:p>
+      <w:pPr>
+        <w:pStyle w:val="Heading345"/>
+      </w:pPr>
+    </w:p>
+    <w:bookmarkEnd w:id="75"/>
+    <w:bookmarkEnd w:id="76"/>
+    <w:bookmarkEnd w:id="77"/>
+    <w:bookmarkStart w:id="78" w:name="smartypants"/>
+    <w:p>
+      <w:pPr>
+        <w:pStyle w:val="Heading2"/>
+      </w:pPr>
+      <w:r>
+        <w:t xml:space="preserve">SmartyPants</w:t>
+      </w:r>
+    </w:p>
+    <w:p>
+      <w:pPr>
+        <w:pStyle w:val="FirstParagraph"/>
+      </w:pPr>
+      <w:r>
+        <w:t xml:space="preserve">SmartyPants converts ASCII punctuation characters into</w:t>
+      </w:r>
+      <w:r>
+        <w:t xml:space="preserve"> </w:t>
+      </w:r>
+      <w:r>
+        <w:t xml:space="preserve">“smart”</w:t>
+      </w:r>
+      <w:r>
+        <w:t xml:space="preserve"> </w:t>
+      </w:r>
+      <w:r>
+        <w:t xml:space="preserve">typographic punctuation HTML entities. For example:</w:t>
+      </w:r>
+    </w:p>
+    <w:tbl>
+      <w:tblPr>
+        <w:tblStyle w:val="Table"/>
+        <w:tblW w:type="pct" w:w="5000"/>
+        <w:tblLayout w:type="fixed"/>
+        <w:tblLook w:firstRow="1" w:lastRow="0" w:firstColumn="0" w:lastColumn="0" w:noHBand="0" w:noVBand="0" w:val="0020"/>
+      </w:tblPr>
+      <w:tblGrid>
+        <w:gridCol w:w="1980"/>
+        <w:gridCol w:w="2970"/>
+        <w:gridCol w:w="2970"/>
       </w:tblGrid>
       <w:tr>
         <w:trPr>
@@ -6477,8 +7274,8 @@
         </w:tc>
       </w:tr>
     </w:tbl>
-    <w:bookmarkEnd w:id="66"/>
-    <w:bookmarkStart w:id="69" w:name="katex"/>
+    <w:bookmarkEnd w:id="78"/>
+    <w:bookmarkStart w:id="81" w:name="katex"/>
     <w:p>
       <w:pPr>
         <w:pStyle w:val="Heading2"/>
@@ -6497,7 +7294,7 @@
       <w:r>
         <w:t xml:space="preserve"> </w:t>
       </w:r>
-      <w:hyperlink r:id="rId67">
+      <w:hyperlink r:id="rId79">
         <w:r>
           <w:rPr>
             <w:rStyle w:val="Hyperlink"/>
@@ -6756,7 +7553,7 @@
       <w:r>
         <w:t xml:space="preserve"> </w:t>
       </w:r>
-      <w:hyperlink r:id="rId68">
+      <w:hyperlink r:id="rId80">
         <w:r>
           <w:rPr>
             <w:rStyle w:val="Hyperlink"/>
@@ -6768,8 +7565,8 @@
         <w:t xml:space="preserve">.</w:t>
       </w:r>
     </w:p>
-    <w:bookmarkEnd w:id="69"/>
-    <w:bookmarkStart w:id="77" w:name="uml-diagrams"/>
+    <w:bookmarkEnd w:id="81"/>
+    <w:bookmarkStart w:id="101" w:name="uml-diagrams"/>
     <w:p>
       <w:pPr>
         <w:pStyle w:val="Heading2"/>
@@ -6788,7 +7585,7 @@
       <w:r>
         <w:t xml:space="preserve"> </w:t>
       </w:r>
-      <w:hyperlink r:id="rId70">
+      <w:hyperlink r:id="rId82">
         <w:r>
           <w:rPr>
             <w:rStyle w:val="Hyperlink"/>
@@ -6814,18 +7611,18 @@
           <wp:inline>
             <wp:extent cx="5334000" cy="3646516"/>
             <wp:effectExtent b="0" l="0" r="0" t="0"/>
-            <wp:docPr descr="" title="" id="72" name="Picture"/>
+            <wp:docPr descr="" title="" id="84" name="Picture"/>
             <a:graphic>
               <a:graphicData uri="http://schemas.openxmlformats.org/drawingml/2006/picture">
                 <pic:pic>
                   <pic:nvPicPr>
-                    <pic:cNvPr descr="Test_files\figure-docx\mermaid-figure-1.png" id="73" name="Picture"/>
+                    <pic:cNvPr descr="Test_files\figure-docx\mermaid-figure-1.png" id="85" name="Picture"/>
                     <pic:cNvPicPr>
                       <a:picLocks noChangeArrowheads="1" noChangeAspect="1"/>
                     </pic:cNvPicPr>
                   </pic:nvPicPr>
                   <pic:blipFill>
-                    <a:blip r:embed="rId71"/>
+                    <a:blip r:embed="rId83"/>
                     <a:stretch>
                       <a:fillRect/>
                     </a:stretch>
@@ -6879,18 +7676,18 @@
           <wp:inline>
             <wp:extent cx="5266944" cy="1682496"/>
             <wp:effectExtent b="0" l="0" r="0" t="0"/>
-            <wp:docPr descr="" title="" id="75" name="Picture"/>
+            <wp:docPr descr="" title="" id="87" name="Picture"/>
             <a:graphic>
               <a:graphicData uri="http://schemas.openxmlformats.org/drawingml/2006/picture">
                 <pic:pic>
                   <pic:nvPicPr>
-                    <pic:cNvPr descr="Test_files\figure-docx\mermaid-figure-2.png" id="76" name="Picture"/>
+                    <pic:cNvPr descr="Test_files\figure-docx\mermaid-figure-2.png" id="88" name="Picture"/>
                     <pic:cNvPicPr>
                       <a:picLocks noChangeArrowheads="1" noChangeAspect="1"/>
                     </pic:cNvPicPr>
                   </pic:nvPicPr>
                   <pic:blipFill>
-                    <a:blip r:embed="rId74"/>
+                    <a:blip r:embed="rId86"/>
                     <a:stretch>
                       <a:fillRect/>
                     </a:stretch>
@@ -6922,8 +7719,715 @@
         <w:pStyle w:val="BodyText"/>
       </w:pPr>
     </w:p>
-    <w:bookmarkEnd w:id="77"/>
-    <w:bookmarkEnd w:id="78"/>
+    <w:tbl>
+      <w:tblPr>
+        <w:tblStyle w:val="Table"/>
+        <w:tblLook w:firstRow="0" w:lastRow="0" w:firstColumn="0" w:lastColumn="0" w:noHBand="0" w:noVBand="0" w:val="0000"/>
+        <w:tblBorders>
+          <w:left w:val="single" w:sz="24" w:space="0" w:color="0758E5"/>
+          <w:right w:val="single" w:sz="4" w:space="0" w:color="0758E5"/>
+          <w:top w:val="single" w:sz="4" w:space="0" w:color="0758E5"/>
+          <w:bottom w:val="single" w:sz="4" w:space="0" w:color="0758E5"/>
+        </w:tblBorders>
+        <w:tblCellMar>
+          <w:left w:w="144" w:type="dxa"/>
+          <w:right w:w="144" w:type="dxa"/>
+        </w:tblCellMar>
+        <w:tblInd w:w="164" w:type="dxa"/>
+        <w:tblW w:type="pct" w:w="100%"/>
+      </w:tblPr>
+      <w:tr>
+        <w:trPr>
+          <w:cantSplit/>
+        </w:trPr>
+        <w:tc>
+          <w:tcPr>
+            <w:shd w:color="auto" w:fill="dae6fb" w:val="clear"/>
+            <w:tcMar>
+              <w:top w:w="92" w:type="dxa"/>
+              <w:bottom w:w="92" w:type="dxa"/>
+            </w:tcMar>
+          </w:tcPr>
+          <w:p>
+            <w:pPr>
+              <w:pStyle w:val="BodyText"/>
+            </w:pPr>
+            <w:pPr>
+              <w:spacing w:before="0" w:after="0"/>
+              <w:textAlignment w:val="center"/>
+            </w:pPr>
+            <w:r>
+              <w:drawing>
+                <wp:inline>
+                  <wp:extent cx="152400" cy="152400"/>
+                  <wp:effectExtent b="0" l="0" r="0" t="0"/>
+                  <wp:docPr descr="" title="" id="89" name="Picture"/>
+                  <a:graphic>
+                    <a:graphicData uri="http://schemas.openxmlformats.org/drawingml/2006/picture">
+                      <pic:pic>
+                        <pic:nvPicPr>
+                          <pic:cNvPr descr="C:\Users\vijgia\AppData\Local\Programs\Quarto\share\formats\docx\note.png" id="90" name="Picture"/>
+                          <pic:cNvPicPr>
+                            <a:picLocks noChangeArrowheads="1" noChangeAspect="1"/>
+                          </pic:cNvPicPr>
+                        </pic:nvPicPr>
+                        <pic:blipFill>
+                          <a:blip r:embed="rId63"/>
+                          <a:stretch>
+                            <a:fillRect/>
+                          </a:stretch>
+                        </pic:blipFill>
+                        <pic:spPr bwMode="auto">
+                          <a:xfrm>
+                            <a:off x="0" y="0"/>
+                            <a:ext cx="152400" cy="152400"/>
+                          </a:xfrm>
+                          <a:prstGeom prst="rect">
+                            <a:avLst/>
+                          </a:prstGeom>
+                          <a:noFill/>
+                          <a:ln w="9525">
+                            <a:noFill/>
+                            <a:headEnd/>
+                            <a:tailEnd/>
+                          </a:ln>
+                        </pic:spPr>
+                      </pic:pic>
+                    </a:graphicData>
+                  </a:graphic>
+                </wp:inline>
+              </w:drawing>
+            </w:r>
+            <w:r>
+              <w:t xml:space="preserve"> </w:t>
+            </w:r>
+            <w:r>
+              <w:t xml:space="preserve"> </w:t>
+            </w:r>
+            <w:r>
+              <w:t xml:space="preserve">Note</w:t>
+            </w:r>
+          </w:p>
+        </w:tc>
+      </w:tr>
+      <w:tr>
+        <w:trPr>
+          <w:cantSplit/>
+        </w:trPr>
+        <w:tc>
+          <w:tcPr>
+            <w:tcMar>
+              <w:top w:w="108" w:type="dxa"/>
+              <w:bottom w:w="108" w:type="dxa"/>
+            </w:tcMar>
+          </w:tcPr>
+          <w:p>
+            <w:pPr>
+              <w:pStyle w:val="BodyText"/>
+            </w:pPr>
+            <w:pPr>
+              <w:spacing w:before="16" w:after="16"/>
+            </w:pPr>
+            <w:r>
+              <w:t xml:space="preserve">Note that there are five types of callouts, including: note, tip, warning, caution, and important.</w:t>
+            </w:r>
+          </w:p>
+        </w:tc>
+      </w:tr>
+    </w:tbl>
+    <w:p>
+      <w:pPr>
+        <w:pStyle w:val="BodyText"/>
+      </w:pPr>
+      <w:r>
+        <w:t xml:space="preserve"> </w:t>
+      </w:r>
+    </w:p>
+    <w:tbl>
+      <w:tblPr>
+        <w:tblStyle w:val="Table"/>
+        <w:tblLook w:firstRow="0" w:lastRow="0" w:firstColumn="0" w:lastColumn="0" w:noHBand="0" w:noVBand="0" w:val="0000"/>
+        <w:tblBorders>
+          <w:left w:val="single" w:sz="24" w:space="0" w:color="EB9113"/>
+          <w:right w:val="single" w:sz="4" w:space="0" w:color="EB9113"/>
+          <w:top w:val="single" w:sz="4" w:space="0" w:color="EB9113"/>
+          <w:bottom w:val="single" w:sz="4" w:space="0" w:color="EB9113"/>
+        </w:tblBorders>
+        <w:tblCellMar>
+          <w:left w:w="144" w:type="dxa"/>
+          <w:right w:w="144" w:type="dxa"/>
+        </w:tblCellMar>
+        <w:tblInd w:w="164" w:type="dxa"/>
+        <w:tblW w:type="pct" w:w="100%"/>
+      </w:tblPr>
+      <w:tr>
+        <w:trPr>
+          <w:cantSplit/>
+        </w:trPr>
+        <w:tc>
+          <w:tcPr>
+            <w:shd w:color="auto" w:fill="fcefdc" w:val="clear"/>
+            <w:tcMar>
+              <w:top w:w="92" w:type="dxa"/>
+              <w:bottom w:w="92" w:type="dxa"/>
+            </w:tcMar>
+          </w:tcPr>
+          <w:p>
+            <w:pPr>
+              <w:pStyle w:val="BodyText"/>
+            </w:pPr>
+            <w:pPr>
+              <w:spacing w:before="0" w:after="0"/>
+              <w:textAlignment w:val="center"/>
+            </w:pPr>
+            <w:r>
+              <w:drawing>
+                <wp:inline>
+                  <wp:extent cx="152400" cy="152400"/>
+                  <wp:effectExtent b="0" l="0" r="0" t="0"/>
+                  <wp:docPr descr="" title="" id="92" name="Picture"/>
+                  <a:graphic>
+                    <a:graphicData uri="http://schemas.openxmlformats.org/drawingml/2006/picture">
+                      <pic:pic>
+                        <pic:nvPicPr>
+                          <pic:cNvPr descr="C:\Users\vijgia\AppData\Local\Programs\Quarto\share\formats\docx\warning.png" id="93" name="Picture"/>
+                          <pic:cNvPicPr>
+                            <a:picLocks noChangeArrowheads="1" noChangeAspect="1"/>
+                          </pic:cNvPicPr>
+                        </pic:nvPicPr>
+                        <pic:blipFill>
+                          <a:blip r:embed="rId91"/>
+                          <a:stretch>
+                            <a:fillRect/>
+                          </a:stretch>
+                        </pic:blipFill>
+                        <pic:spPr bwMode="auto">
+                          <a:xfrm>
+                            <a:off x="0" y="0"/>
+                            <a:ext cx="152400" cy="152400"/>
+                          </a:xfrm>
+                          <a:prstGeom prst="rect">
+                            <a:avLst/>
+                          </a:prstGeom>
+                          <a:noFill/>
+                          <a:ln w="9525">
+                            <a:noFill/>
+                            <a:headEnd/>
+                            <a:tailEnd/>
+                          </a:ln>
+                        </pic:spPr>
+                      </pic:pic>
+                    </a:graphicData>
+                  </a:graphic>
+                </wp:inline>
+              </w:drawing>
+            </w:r>
+            <w:r>
+              <w:t xml:space="preserve"> </w:t>
+            </w:r>
+            <w:r>
+              <w:t xml:space="preserve"> </w:t>
+            </w:r>
+            <w:r>
+              <w:t xml:space="preserve">Warning</w:t>
+            </w:r>
+          </w:p>
+        </w:tc>
+      </w:tr>
+      <w:tr>
+        <w:trPr>
+          <w:cantSplit/>
+        </w:trPr>
+        <w:tc>
+          <w:tcPr>
+            <w:tcMar>
+              <w:top w:w="108" w:type="dxa"/>
+              <w:bottom w:w="108" w:type="dxa"/>
+            </w:tcMar>
+          </w:tcPr>
+          <w:p>
+            <w:pPr>
+              <w:pStyle w:val="BodyText"/>
+            </w:pPr>
+            <w:pPr>
+              <w:spacing w:before="16" w:after="16"/>
+            </w:pPr>
+            <w:r>
+              <w:t xml:space="preserve">Callouts provide a simple way to attract attention, for example, to this warning.</w:t>
+            </w:r>
+          </w:p>
+        </w:tc>
+      </w:tr>
+    </w:tbl>
+    <w:p>
+      <w:pPr>
+        <w:pStyle w:val="BodyText"/>
+      </w:pPr>
+      <w:r>
+        <w:t xml:space="preserve"> </w:t>
+      </w:r>
+    </w:p>
+    <w:tbl>
+      <w:tblPr>
+        <w:tblStyle w:val="Table"/>
+        <w:tblLook w:firstRow="0" w:lastRow="0" w:firstColumn="0" w:lastColumn="0" w:noHBand="0" w:noVBand="0" w:val="0000"/>
+        <w:tblBorders>
+          <w:left w:val="single" w:sz="24" w:space="0" w:color="CC1914"/>
+          <w:right w:val="single" w:sz="4" w:space="0" w:color="CC1914"/>
+          <w:top w:val="single" w:sz="4" w:space="0" w:color="CC1914"/>
+          <w:bottom w:val="single" w:sz="4" w:space="0" w:color="CC1914"/>
+        </w:tblBorders>
+        <w:tblCellMar>
+          <w:left w:w="144" w:type="dxa"/>
+          <w:right w:w="144" w:type="dxa"/>
+        </w:tblCellMar>
+        <w:tblInd w:w="164" w:type="dxa"/>
+        <w:tblW w:type="pct" w:w="100%"/>
+      </w:tblPr>
+      <w:tr>
+        <w:trPr>
+          <w:cantSplit/>
+        </w:trPr>
+        <w:tc>
+          <w:tcPr>
+            <w:shd w:color="auto" w:fill="f7dddc" w:val="clear"/>
+            <w:tcMar>
+              <w:top w:w="92" w:type="dxa"/>
+              <w:bottom w:w="92" w:type="dxa"/>
+            </w:tcMar>
+          </w:tcPr>
+          <w:p>
+            <w:pPr>
+              <w:pStyle w:val="BodyText"/>
+            </w:pPr>
+            <w:pPr>
+              <w:spacing w:before="0" w:after="0"/>
+              <w:textAlignment w:val="center"/>
+            </w:pPr>
+            <w:r>
+              <w:drawing>
+                <wp:inline>
+                  <wp:extent cx="152400" cy="152400"/>
+                  <wp:effectExtent b="0" l="0" r="0" t="0"/>
+                  <wp:docPr descr="" title="" id="94" name="Picture"/>
+                  <a:graphic>
+                    <a:graphicData uri="http://schemas.openxmlformats.org/drawingml/2006/picture">
+                      <pic:pic>
+                        <pic:nvPicPr>
+                          <pic:cNvPr descr="C:\Users\vijgia\AppData\Local\Programs\Quarto\share\formats\docx\important.png" id="95" name="Picture"/>
+                          <pic:cNvPicPr>
+                            <a:picLocks noChangeArrowheads="1" noChangeAspect="1"/>
+                          </pic:cNvPicPr>
+                        </pic:nvPicPr>
+                        <pic:blipFill>
+                          <a:blip r:embed="rId66"/>
+                          <a:stretch>
+                            <a:fillRect/>
+                          </a:stretch>
+                        </pic:blipFill>
+                        <pic:spPr bwMode="auto">
+                          <a:xfrm>
+                            <a:off x="0" y="0"/>
+                            <a:ext cx="152400" cy="152400"/>
+                          </a:xfrm>
+                          <a:prstGeom prst="rect">
+                            <a:avLst/>
+                          </a:prstGeom>
+                          <a:noFill/>
+                          <a:ln w="9525">
+                            <a:noFill/>
+                            <a:headEnd/>
+                            <a:tailEnd/>
+                          </a:ln>
+                        </pic:spPr>
+                      </pic:pic>
+                    </a:graphicData>
+                  </a:graphic>
+                </wp:inline>
+              </w:drawing>
+            </w:r>
+            <w:r>
+              <w:t xml:space="preserve"> </w:t>
+            </w:r>
+            <w:r>
+              <w:t xml:space="preserve"> </w:t>
+            </w:r>
+            <w:r>
+              <w:t xml:space="preserve">Important</w:t>
+            </w:r>
+          </w:p>
+        </w:tc>
+      </w:tr>
+      <w:tr>
+        <w:trPr>
+          <w:cantSplit/>
+        </w:trPr>
+        <w:tc>
+          <w:tcPr>
+            <w:tcMar>
+              <w:top w:w="108" w:type="dxa"/>
+              <w:bottom w:w="108" w:type="dxa"/>
+            </w:tcMar>
+          </w:tcPr>
+          <w:p>
+            <w:pPr>
+              <w:pStyle w:val="BodyText"/>
+            </w:pPr>
+            <w:pPr>
+              <w:spacing w:before="16" w:after="16"/>
+            </w:pPr>
+            <w:r>
+              <w:t xml:space="preserve">Danger, callouts will really improve your writing.</w:t>
+            </w:r>
+          </w:p>
+        </w:tc>
+      </w:tr>
+    </w:tbl>
+    <w:p>
+      <w:pPr>
+        <w:pStyle w:val="BodyText"/>
+      </w:pPr>
+      <w:r>
+        <w:t xml:space="preserve"> </w:t>
+      </w:r>
+    </w:p>
+    <w:tbl>
+      <w:tblPr>
+        <w:tblStyle w:val="Table"/>
+        <w:tblLook w:firstRow="0" w:lastRow="0" w:firstColumn="0" w:lastColumn="0" w:noHBand="0" w:noVBand="0" w:val="0000"/>
+        <w:tblBorders>
+          <w:left w:val="single" w:sz="24" w:space="0" w:color="00A047"/>
+          <w:right w:val="single" w:sz="4" w:space="0" w:color="00A047"/>
+          <w:top w:val="single" w:sz="4" w:space="0" w:color="00A047"/>
+          <w:bottom w:val="single" w:sz="4" w:space="0" w:color="00A047"/>
+        </w:tblBorders>
+        <w:tblCellMar>
+          <w:left w:w="144" w:type="dxa"/>
+          <w:right w:w="144" w:type="dxa"/>
+        </w:tblCellMar>
+        <w:tblInd w:w="164" w:type="dxa"/>
+        <w:tblW w:type="pct" w:w="100%"/>
+      </w:tblPr>
+      <w:tr>
+        <w:trPr>
+          <w:cantSplit/>
+        </w:trPr>
+        <w:tc>
+          <w:tcPr>
+            <w:shd w:color="auto" w:fill="ccf1e3" w:val="clear"/>
+            <w:tcMar>
+              <w:top w:w="92" w:type="dxa"/>
+              <w:bottom w:w="92" w:type="dxa"/>
+            </w:tcMar>
+          </w:tcPr>
+          <w:p>
+            <w:pPr>
+              <w:pStyle w:val="BodyText"/>
+            </w:pPr>
+            <w:pPr>
+              <w:spacing w:before="0" w:after="0"/>
+              <w:textAlignment w:val="center"/>
+            </w:pPr>
+            <w:r>
+              <w:drawing>
+                <wp:inline>
+                  <wp:extent cx="152400" cy="152400"/>
+                  <wp:effectExtent b="0" l="0" r="0" t="0"/>
+                  <wp:docPr descr="" title="" id="96" name="Picture"/>
+                  <a:graphic>
+                    <a:graphicData uri="http://schemas.openxmlformats.org/drawingml/2006/picture">
+                      <pic:pic>
+                        <pic:nvPicPr>
+                          <pic:cNvPr descr="C:\Users\vijgia\AppData\Local\Programs\Quarto\share\formats\docx\tip.png" id="97" name="Picture"/>
+                          <pic:cNvPicPr>
+                            <a:picLocks noChangeArrowheads="1" noChangeAspect="1"/>
+                          </pic:cNvPicPr>
+                        </pic:nvPicPr>
+                        <pic:blipFill>
+                          <a:blip r:embed="rId71"/>
+                          <a:stretch>
+                            <a:fillRect/>
+                          </a:stretch>
+                        </pic:blipFill>
+                        <pic:spPr bwMode="auto">
+                          <a:xfrm>
+                            <a:off x="0" y="0"/>
+                            <a:ext cx="152400" cy="152400"/>
+                          </a:xfrm>
+                          <a:prstGeom prst="rect">
+                            <a:avLst/>
+                          </a:prstGeom>
+                          <a:noFill/>
+                          <a:ln w="9525">
+                            <a:noFill/>
+                            <a:headEnd/>
+                            <a:tailEnd/>
+                          </a:ln>
+                        </pic:spPr>
+                      </pic:pic>
+                    </a:graphicData>
+                  </a:graphic>
+                </wp:inline>
+              </w:drawing>
+            </w:r>
+            <w:r>
+              <w:t xml:space="preserve"> </w:t>
+            </w:r>
+            <w:r>
+              <w:t xml:space="preserve"> </w:t>
+            </w:r>
+            <w:r>
+              <w:t xml:space="preserve">Helpful Tip</w:t>
+            </w:r>
+          </w:p>
+        </w:tc>
+      </w:tr>
+      <w:tr>
+        <w:trPr>
+          <w:cantSplit/>
+        </w:trPr>
+        <w:tc>
+          <w:tcPr>
+            <w:tcMar>
+              <w:top w:w="108" w:type="dxa"/>
+              <w:bottom w:w="108" w:type="dxa"/>
+            </w:tcMar>
+          </w:tcPr>
+          <w:p>
+            <w:pPr>
+              <w:pStyle w:val="BodyText"/>
+            </w:pPr>
+            <w:pPr>
+              <w:spacing w:before="16" w:after="16"/>
+            </w:pPr>
+            <w:r>
+              <w:t xml:space="preserve">This is an example of a callout with a custom title.</w:t>
+            </w:r>
+          </w:p>
+        </w:tc>
+      </w:tr>
+    </w:tbl>
+    <w:p>
+      <w:pPr>
+        <w:pStyle w:val="BodyText"/>
+      </w:pPr>
+      <w:r>
+        <w:t xml:space="preserve"> </w:t>
+      </w:r>
+    </w:p>
+    <w:tbl>
+      <w:tblPr>
+        <w:tblStyle w:val="Table"/>
+        <w:tblLook w:firstRow="0" w:lastRow="0" w:firstColumn="0" w:lastColumn="0" w:noHBand="0" w:noVBand="0" w:val="0000"/>
+        <w:tblBorders>
+          <w:left w:val="single" w:sz="24" w:space="0" w:color="909090"/>
+        </w:tblBorders>
+        <w:tblCellMar>
+          <w:left w:w="0" w:type="dxa"/>
+          <w:right w:w="0" w:type="dxa"/>
+        </w:tblCellMar>
+        <w:tblInd w:w="164" w:type="dxa"/>
+      </w:tblPr>
+      <w:tr>
+        <w:trPr>
+          <w:cantSplit/>
+        </w:trPr>
+        <w:tc>
+          <w:tcPr>
+            <w:tcMar>
+              <w:left w:w="144" w:type="dxa"/>
+            </w:tcMar>
+          </w:tcPr>
+          <w:p>
+            <w:pPr>
+              <w:pStyle w:val="BodyText"/>
+            </w:pPr>
+            <w:pPr>
+              <w:spacing w:before="16" w:after="64"/>
+            </w:pPr>
+          </w:p>
+          <w:p>
+            <w:pPr>
+              <w:pStyle w:val="BodyText"/>
+            </w:pPr>
+            <w:pPr>
+              <w:spacing w:before="16" w:after="16"/>
+            </w:pPr>
+            <w:r>
+              <w:t xml:space="preserve">This is a default callout with no type specified.</w:t>
+            </w:r>
+          </w:p>
+        </w:tc>
+      </w:tr>
+    </w:tbl>
+    <w:p>
+      <w:pPr>
+        <w:pStyle w:val="BodyText"/>
+      </w:pPr>
+      <w:r>
+        <w:t xml:space="preserve"> </w:t>
+      </w:r>
+    </w:p>
+    <w:tbl>
+      <w:tblPr>
+        <w:tblStyle w:val="Table"/>
+        <w:tblLook w:firstRow="0" w:lastRow="0" w:firstColumn="0" w:lastColumn="0" w:noHBand="0" w:noVBand="0" w:val="0000"/>
+        <w:tblBorders>
+          <w:left w:val="single" w:sz="24" w:space="0" w:color="FC5300"/>
+          <w:right w:val="single" w:sz="4" w:space="0" w:color="FC5300"/>
+          <w:top w:val="single" w:sz="4" w:space="0" w:color="FC5300"/>
+          <w:bottom w:val="single" w:sz="4" w:space="0" w:color="FC5300"/>
+        </w:tblBorders>
+        <w:tblCellMar>
+          <w:left w:w="144" w:type="dxa"/>
+          <w:right w:w="144" w:type="dxa"/>
+        </w:tblCellMar>
+        <w:tblInd w:w="164" w:type="dxa"/>
+        <w:tblW w:type="pct" w:w="100%"/>
+      </w:tblPr>
+      <w:tr>
+        <w:trPr>
+          <w:cantSplit/>
+        </w:trPr>
+        <w:tc>
+          <w:tcPr>
+            <w:shd w:color="auto" w:fill="ffe5d0" w:val="clear"/>
+            <w:tcMar>
+              <w:top w:w="92" w:type="dxa"/>
+              <w:bottom w:w="92" w:type="dxa"/>
+            </w:tcMar>
+          </w:tcPr>
+          <w:p>
+            <w:pPr>
+              <w:pStyle w:val="BodyText"/>
+            </w:pPr>
+            <w:pPr>
+              <w:spacing w:before="0" w:after="0"/>
+              <w:textAlignment w:val="center"/>
+            </w:pPr>
+            <w:r>
+              <w:drawing>
+                <wp:inline>
+                  <wp:extent cx="152400" cy="152400"/>
+                  <wp:effectExtent b="0" l="0" r="0" t="0"/>
+                  <wp:docPr descr="" title="" id="99" name="Picture"/>
+                  <a:graphic>
+                    <a:graphicData uri="http://schemas.openxmlformats.org/drawingml/2006/picture">
+                      <pic:pic>
+                        <pic:nvPicPr>
+                          <pic:cNvPr descr="C:\Users\vijgia\AppData\Local\Programs\Quarto\share\formats\docx\caution.png" id="100" name="Picture"/>
+                          <pic:cNvPicPr>
+                            <a:picLocks noChangeArrowheads="1" noChangeAspect="1"/>
+                          </pic:cNvPicPr>
+                        </pic:nvPicPr>
+                        <pic:blipFill>
+                          <a:blip r:embed="rId98"/>
+                          <a:stretch>
+                            <a:fillRect/>
+                          </a:stretch>
+                        </pic:blipFill>
+                        <pic:spPr bwMode="auto">
+                          <a:xfrm>
+                            <a:off x="0" y="0"/>
+                            <a:ext cx="152400" cy="152400"/>
+                          </a:xfrm>
+                          <a:prstGeom prst="rect">
+                            <a:avLst/>
+                          </a:prstGeom>
+                          <a:noFill/>
+                          <a:ln w="9525">
+                            <a:noFill/>
+                            <a:headEnd/>
+                            <a:tailEnd/>
+                          </a:ln>
+                        </pic:spPr>
+                      </pic:pic>
+                    </a:graphicData>
+                  </a:graphic>
+                </wp:inline>
+              </w:drawing>
+            </w:r>
+            <w:r>
+              <w:t xml:space="preserve"> </w:t>
+            </w:r>
+            <w:r>
+              <w:t xml:space="preserve"> </w:t>
+            </w:r>
+            <w:r>
+              <w:t xml:space="preserve">Expand To Learn About Collapse</w:t>
+            </w:r>
+          </w:p>
+        </w:tc>
+      </w:tr>
+      <w:tr>
+        <w:trPr>
+          <w:cantSplit/>
+        </w:trPr>
+        <w:tc>
+          <w:tcPr>
+            <w:tcMar>
+              <w:top w:w="108" w:type="dxa"/>
+              <w:bottom w:w="108" w:type="dxa"/>
+            </w:tcMar>
+          </w:tcPr>
+          <w:p>
+            <w:pPr>
+              <w:pStyle w:val="BodyText"/>
+            </w:pPr>
+            <w:pPr>
+              <w:spacing w:before="16" w:after="16"/>
+            </w:pPr>
+            <w:r>
+              <w:t xml:space="preserve">This is an example of a</w:t>
+            </w:r>
+            <w:r>
+              <w:t xml:space="preserve"> </w:t>
+            </w:r>
+            <w:r>
+              <w:t xml:space="preserve">‘folded’</w:t>
+            </w:r>
+            <w:r>
+              <w:t xml:space="preserve"> </w:t>
+            </w:r>
+            <w:r>
+              <w:t xml:space="preserve">caution callout that can be expanded by the user. You can use</w:t>
+            </w:r>
+            <w:r>
+              <w:t xml:space="preserve"> </w:t>
+            </w:r>
+            <w:r>
+              <w:rPr>
+                <w:rStyle w:val="VerbatimChar"/>
+              </w:rPr>
+              <w:t xml:space="preserve">collapse="true"</w:t>
+            </w:r>
+            <w:r>
+              <w:t xml:space="preserve"> </w:t>
+            </w:r>
+            <w:r>
+              <w:t xml:space="preserve">to collapse it by default or</w:t>
+            </w:r>
+            <w:r>
+              <w:t xml:space="preserve"> </w:t>
+            </w:r>
+            <w:r>
+              <w:rPr>
+                <w:rStyle w:val="VerbatimChar"/>
+              </w:rPr>
+              <w:t xml:space="preserve">collapse="false"</w:t>
+            </w:r>
+            <w:r>
+              <w:t xml:space="preserve"> </w:t>
+            </w:r>
+            <w:r>
+              <w:t xml:space="preserve">to make a collapsible callout that is expanded by default.</w:t>
+            </w:r>
+          </w:p>
+        </w:tc>
+      </w:tr>
+    </w:tbl>
+    <w:bookmarkEnd w:id="101"/>
+    <w:bookmarkEnd w:id="102"/>
     <w:sectPr>
       <w:footnotePr>
         <w:numRestart w:val="eachSect"/>

</xml_diff>

<commit_message>
Changes in header pdf and docx output
</commit_message>
<xml_diff>
--- a/Test.docx
+++ b/Test.docx
@@ -26,13 +26,39 @@
         <w:t xml:space="preserve">2025-06-30</w:t>
       </w:r>
     </w:p>
+    <w:sdt>
+      <w:sdtPr>
+        <w:docPartObj>
+          <w:docPartGallery w:val="Table of Contents"/>
+          <w:docPartUnique/>
+        </w:docPartObj>
+      </w:sdtPr>
+      <w:sdtContent>
+        <w:p>
+          <w:pPr>
+            <w:pStyle w:val="TOCHeading"/>
+          </w:pPr>
+          <w:r>
+            <w:t xml:space="preserve">Table of contents</w:t>
+          </w:r>
+        </w:p>
+        <w:p>
+          <w:r>
+            <w:fldChar w:fldCharType="begin" w:dirty="true"/>
+            <w:instrText xml:space="preserve">TOC \o "1-3" \h \z \u</w:instrText>
+            <w:fldChar w:fldCharType="separate"/>
+            <w:fldChar w:fldCharType="end"/>
+          </w:r>
+        </w:p>
+      </w:sdtContent>
+    </w:sdt>
     <w:bookmarkStart w:id="34" w:name="text-formatting"/>
     <w:p>
       <w:pPr>
         <w:pStyle w:val="Heading1"/>
       </w:pPr>
       <w:r>
-        <w:t xml:space="preserve">Text formatting</w:t>
+        <w:t xml:space="preserve">1. Text formatting</w:t>
       </w:r>
     </w:p>
     <w:bookmarkStart w:id="25" w:name="typography"/>
@@ -41,7 +67,7 @@
         <w:pStyle w:val="Heading2"/>
       </w:pPr>
       <w:r>
-        <w:t xml:space="preserve">Typography</w:t>
+        <w:t xml:space="preserve">1.1 Typography</w:t>
       </w:r>
     </w:p>
     <w:bookmarkStart w:id="23" w:name="fonts"/>
@@ -50,7 +76,7 @@
         <w:pStyle w:val="Heading3"/>
       </w:pPr>
       <w:r>
-        <w:t xml:space="preserve">Fonts</w:t>
+        <w:t xml:space="preserve">1.1.1 Fonts</w:t>
       </w:r>
     </w:p>
     <w:bookmarkStart w:id="20" w:name="bold-font"/>
@@ -59,7 +85,7 @@
         <w:pStyle w:val="Heading4"/>
       </w:pPr>
       <w:r>
-        <w:t xml:space="preserve">Bold font</w:t>
+        <w:t xml:space="preserve">1.1.1.1 Bold font</w:t>
       </w:r>
     </w:p>
     <w:p>
@@ -147,7 +173,7 @@
         <w:pStyle w:val="Heading4"/>
       </w:pPr>
       <w:r>
-        <w:t xml:space="preserve">Italic font</w:t>
+        <w:t xml:space="preserve">1.1.1.2 Italic font</w:t>
       </w:r>
     </w:p>
     <w:p>
@@ -235,7 +261,7 @@
         <w:pStyle w:val="Heading4"/>
       </w:pPr>
       <w:r>
-        <w:t xml:space="preserve">Bold / Italic</w:t>
+        <w:t xml:space="preserve">1.1.1.3 Bold / Italic</w:t>
       </w:r>
     </w:p>
     <w:p>
@@ -315,7 +341,7 @@
         <w:pStyle w:val="Heading3"/>
       </w:pPr>
       <w:r>
-        <w:t xml:space="preserve">Underlined text</w:t>
+        <w:t xml:space="preserve">1.1.2 Underlined text</w:t>
       </w:r>
     </w:p>
     <w:p>
@@ -465,7 +491,7 @@
         <w:pStyle w:val="Heading2"/>
       </w:pPr>
       <w:r>
-        <w:t xml:space="preserve">Indentation and spacing</w:t>
+        <w:t xml:space="preserve">1.2 Indentation and spacing</w:t>
       </w:r>
     </w:p>
     <w:bookmarkStart w:id="26" w:name="line-breaks"/>
@@ -474,7 +500,7 @@
         <w:pStyle w:val="Heading3"/>
       </w:pPr>
       <w:r>
-        <w:t xml:space="preserve">Line breaks</w:t>
+        <w:t xml:space="preserve">1.2.1 Line breaks</w:t>
       </w:r>
     </w:p>
     <w:p>
@@ -590,7 +616,7 @@
         <w:pStyle w:val="Heading3"/>
       </w:pPr>
       <w:r>
-        <w:t xml:space="preserve">Padding</w:t>
+        <w:t xml:space="preserve">1.2.2 Padding</w:t>
       </w:r>
     </w:p>
     <w:p>
@@ -721,7 +747,7 @@
         <w:pStyle w:val="Heading3"/>
       </w:pPr>
       <w:r>
-        <w:t xml:space="preserve">Center / left / right positioned text</w:t>
+        <w:t xml:space="preserve">1.2.3 Center / left / right positioned text</w:t>
       </w:r>
     </w:p>
     <w:p>
@@ -904,7 +930,7 @@
         <w:pStyle w:val="Heading3"/>
       </w:pPr>
       <w:r>
-        <w:t xml:space="preserve">Blank spaces</w:t>
+        <w:t xml:space="preserve">1.2.4 Blank spaces</w:t>
       </w:r>
     </w:p>
     <w:p>
@@ -1022,7 +1048,7 @@
         <w:pStyle w:val="Heading2"/>
       </w:pPr>
       <w:r>
-        <w:t xml:space="preserve">Lists</w:t>
+        <w:t xml:space="preserve">1.3 Lists</w:t>
       </w:r>
     </w:p>
     <w:p>
@@ -1039,7 +1065,7 @@
         <w:pStyle w:val="Heading3"/>
       </w:pPr>
       <w:r>
-        <w:t xml:space="preserve">Unordered lists (bullet list)</w:t>
+        <w:t xml:space="preserve">1.3.1 Unordered lists (bullet list)</w:t>
       </w:r>
     </w:p>
     <w:p>
@@ -1179,7 +1205,7 @@
         <w:pStyle w:val="Heading3"/>
       </w:pPr>
       <w:r>
-        <w:t xml:space="preserve">Ordered lists</w:t>
+        <w:t xml:space="preserve">1.3.2 Ordered lists</w:t>
       </w:r>
     </w:p>
     <w:p>
@@ -1330,7 +1356,7 @@
         <w:pStyle w:val="Heading1"/>
       </w:pPr>
       <w:r>
-        <w:t xml:space="preserve">Boxes and tables</w:t>
+        <w:t xml:space="preserve">2. Boxes and tables</w:t>
       </w:r>
     </w:p>
     <w:p>
@@ -1347,7 +1373,7 @@
         <w:pStyle w:val="Heading2"/>
       </w:pPr>
       <w:r>
-        <w:t xml:space="preserve">Boxes</w:t>
+        <w:t xml:space="preserve">2.1 Boxes</w:t>
       </w:r>
     </w:p>
     <w:p>
@@ -1454,7 +1480,7 @@
         <w:pStyle w:val="Heading2"/>
       </w:pPr>
       <w:r>
-        <w:t xml:space="preserve">Tables</w:t>
+        <w:t xml:space="preserve">2.2 Tables</w:t>
       </w:r>
     </w:p>
     <w:p>
@@ -1754,7 +1780,7 @@
         <w:pStyle w:val="Heading1"/>
       </w:pPr>
       <w:r>
-        <w:t xml:space="preserve">General guidelines</w:t>
+        <w:t xml:space="preserve">3. General guidelines</w:t>
       </w:r>
     </w:p>
     <w:bookmarkStart w:id="77" w:name="format"/>
@@ -1763,7 +1789,7 @@
         <w:pStyle w:val="Heading2"/>
       </w:pPr>
       <w:r>
-        <w:t xml:space="preserve">Format</w:t>
+        <w:t xml:space="preserve">3.1 Format</w:t>
       </w:r>
     </w:p>
     <w:bookmarkStart w:id="44" w:name="aesthetic-rules"/>
@@ -1772,7 +1798,7 @@
         <w:pStyle w:val="Heading3"/>
       </w:pPr>
       <w:r>
-        <w:t xml:space="preserve">Aesthetic rules</w:t>
+        <w:t xml:space="preserve">3.1.1 Aesthetic rules</w:t>
       </w:r>
     </w:p>
     <w:bookmarkStart w:id="38" w:name="structure-of-the-sections"/>
@@ -1781,7 +1807,7 @@
         <w:pStyle w:val="Heading4"/>
       </w:pPr>
       <w:r>
-        <w:t xml:space="preserve">Structure of the sections</w:t>
+        <w:t xml:space="preserve">3.1.1.1 Structure of the sections</w:t>
       </w:r>
     </w:p>
     <w:p>
@@ -1974,7 +2000,7 @@
         <w:pStyle w:val="Heading4"/>
       </w:pPr>
       <w:r>
-        <w:t xml:space="preserve">Visual harmonization</w:t>
+        <w:t xml:space="preserve">3.1.1.2 Visual harmonization</w:t>
       </w:r>
     </w:p>
     <w:p>
@@ -2000,7 +2026,7 @@
         <w:pStyle w:val="Heading4"/>
       </w:pPr>
       <w:r>
-        <w:t xml:space="preserve">Titles, headings and sub-headings</w:t>
+        <w:t xml:space="preserve">3.1.1.3 Titles, headings and sub-headings</w:t>
       </w:r>
     </w:p>
     <w:p>
@@ -2034,7 +2060,7 @@
       <w:r>
         <w:drawing>
           <wp:inline>
-            <wp:extent cx="5334000" cy="3996384"/>
+            <wp:extent cx="5727700" cy="4291355"/>
             <wp:effectExtent b="0" l="0" r="0" t="0"/>
             <wp:docPr descr="Section A1" title="" id="41" name="Picture"/>
             <a:graphic>
@@ -2055,7 +2081,7 @@
                   <pic:spPr bwMode="auto">
                     <a:xfrm>
                       <a:off x="0" y="0"/>
-                      <a:ext cx="5334000" cy="3996384"/>
+                      <a:ext cx="5727700" cy="4291355"/>
                     </a:xfrm>
                     <a:prstGeom prst="rect">
                       <a:avLst/>
@@ -2487,7 +2513,7 @@
         <w:pStyle w:val="Heading3"/>
       </w:pPr>
       <w:r>
-        <w:t xml:space="preserve">Spacing between paragraphs</w:t>
+        <w:t xml:space="preserve">3.1.2 Spacing between paragraphs</w:t>
       </w:r>
     </w:p>
     <w:p>
@@ -3222,7 +3248,7 @@
         <w:pStyle w:val="Heading3"/>
       </w:pPr>
       <w:r>
-        <w:t xml:space="preserve">Ordered and unordered lists</w:t>
+        <w:t xml:space="preserve">3.1.3 Ordered and unordered lists</w:t>
       </w:r>
     </w:p>
     <w:p>
@@ -4925,7 +4951,7 @@
         <w:pStyle w:val="Heading3"/>
       </w:pPr>
       <w:r>
-        <w:t xml:space="preserve">CAP manual</w:t>
+        <w:t xml:space="preserve">3.1.4 CAP manual</w:t>
       </w:r>
     </w:p>
     <w:p>
@@ -5105,7 +5131,7 @@
       <w:r>
         <w:drawing>
           <wp:inline>
-            <wp:extent cx="5334000" cy="3958853"/>
+            <wp:extent cx="5727700" cy="4251054"/>
             <wp:effectExtent b="0" l="0" r="0" t="0"/>
             <wp:docPr descr="General CAP view" title="" id="48" name="Picture"/>
             <a:graphic>
@@ -5126,7 +5152,7 @@
                   <pic:spPr bwMode="auto">
                     <a:xfrm>
                       <a:off x="0" y="0"/>
-                      <a:ext cx="5334000" cy="3958853"/>
+                      <a:ext cx="5727700" cy="4251054"/>
                     </a:xfrm>
                     <a:prstGeom prst="rect">
                       <a:avLst/>
@@ -5236,7 +5262,7 @@
       <w:r>
         <w:drawing>
           <wp:inline>
-            <wp:extent cx="5334000" cy="2759456"/>
+            <wp:extent cx="5727700" cy="2963130"/>
             <wp:effectExtent b="0" l="0" r="0" t="0"/>
             <wp:docPr descr="Subsection in bold" title="" id="51" name="Picture"/>
             <a:graphic>
@@ -5257,7 +5283,7 @@
                   <pic:spPr bwMode="auto">
                     <a:xfrm>
                       <a:off x="0" y="0"/>
-                      <a:ext cx="5334000" cy="2759456"/>
+                      <a:ext cx="5727700" cy="2963130"/>
                     </a:xfrm>
                     <a:prstGeom prst="rect">
                       <a:avLst/>
@@ -5339,7 +5365,7 @@
       <w:r>
         <w:drawing>
           <wp:inline>
-            <wp:extent cx="5334000" cy="3134853"/>
+            <wp:extent cx="5727700" cy="3366235"/>
             <wp:effectExtent b="0" l="0" r="0" t="0"/>
             <wp:docPr descr="Triggers view" title="" id="54" name="Picture"/>
             <a:graphic>
@@ -5360,7 +5386,7 @@
                   <pic:spPr bwMode="auto">
                     <a:xfrm>
                       <a:off x="0" y="0"/>
-                      <a:ext cx="5334000" cy="3134853"/>
+                      <a:ext cx="5727700" cy="3366235"/>
                     </a:xfrm>
                     <a:prstGeom prst="rect">
                       <a:avLst/>
@@ -5442,7 +5468,7 @@
       <w:r>
         <w:drawing>
           <wp:inline>
-            <wp:extent cx="5334000" cy="2925862"/>
+            <wp:extent cx="5727700" cy="3141819"/>
             <wp:effectExtent b="0" l="0" r="0" t="0"/>
             <wp:docPr descr="Authors view" title="" id="57" name="Picture"/>
             <a:graphic>
@@ -5463,7 +5489,7 @@
                   <pic:spPr bwMode="auto">
                     <a:xfrm>
                       <a:off x="0" y="0"/>
-                      <a:ext cx="5334000" cy="2925862"/>
+                      <a:ext cx="5727700" cy="3141819"/>
                     </a:xfrm>
                     <a:prstGeom prst="rect">
                       <a:avLst/>
@@ -5524,7 +5550,7 @@
       <w:r>
         <w:drawing>
           <wp:inline>
-            <wp:extent cx="5334000" cy="1510429"/>
+            <wp:extent cx="5727700" cy="1621913"/>
             <wp:effectExtent b="0" l="0" r="0" t="0"/>
             <wp:docPr descr="Title vs Heading font" title="" id="60" name="Picture"/>
             <a:graphic>
@@ -5545,7 +5571,7 @@
                   <pic:spPr bwMode="auto">
                     <a:xfrm>
                       <a:off x="0" y="0"/>
-                      <a:ext cx="5334000" cy="1510429"/>
+                      <a:ext cx="5727700" cy="1621913"/>
                     </a:xfrm>
                     <a:prstGeom prst="rect">
                       <a:avLst/>
@@ -5579,7 +5605,7 @@
         <w:pStyle w:val="Heading3"/>
       </w:pPr>
       <w:r>
-        <w:t xml:space="preserve">Conventions to facilitate reading</w:t>
+        <w:t xml:space="preserve">3.1.5 Conventions to facilitate reading</w:t>
       </w:r>
     </w:p>
     <w:p>
@@ -6532,7 +6558,7 @@
         <w:pStyle w:val="Heading3"/>
       </w:pPr>
       <w:r>
-        <w:t xml:space="preserve">Availability of the interRAI instruments with CAP output in our main customer base</w:t>
+        <w:t xml:space="preserve">3.1.6 Availability of the interRAI instruments with CAP output in our main customer base</w:t>
       </w:r>
     </w:p>
     <w:tbl>
@@ -7089,7 +7115,7 @@
         <w:pStyle w:val="Heading2"/>
       </w:pPr>
       <w:r>
-        <w:t xml:space="preserve">SmartyPants</w:t>
+        <w:t xml:space="preserve">3.2 SmartyPants</w:t>
       </w:r>
     </w:p>
     <w:p>
@@ -7281,7 +7307,7 @@
         <w:pStyle w:val="Heading2"/>
       </w:pPr>
       <w:r>
-        <w:t xml:space="preserve">KaTeX</w:t>
+        <w:t xml:space="preserve">3.3 KaTeX</w:t>
       </w:r>
     </w:p>
     <w:p>
@@ -7572,7 +7598,7 @@
         <w:pStyle w:val="Heading2"/>
       </w:pPr>
       <w:r>
-        <w:t xml:space="preserve">UML diagrams</w:t>
+        <w:t xml:space="preserve">3.4 UML diagrams</w:t>
       </w:r>
     </w:p>
     <w:p>
@@ -7609,7 +7635,7 @@
       <w:r>
         <w:drawing>
           <wp:inline>
-            <wp:extent cx="5334000" cy="3646516"/>
+            <wp:extent cx="5727700" cy="3915664"/>
             <wp:effectExtent b="0" l="0" r="0" t="0"/>
             <wp:docPr descr="" title="" id="84" name="Picture"/>
             <a:graphic>
@@ -7630,7 +7656,7 @@
                   <pic:spPr bwMode="auto">
                     <a:xfrm>
                       <a:off x="0" y="0"/>
-                      <a:ext cx="5334000" cy="3646516"/>
+                      <a:ext cx="5727700" cy="3915664"/>
                     </a:xfrm>
                     <a:prstGeom prst="rect">
                       <a:avLst/>
@@ -8429,9 +8455,16 @@
     <w:bookmarkEnd w:id="101"/>
     <w:bookmarkEnd w:id="102"/>
     <w:sectPr>
-      <w:footnotePr>
-        <w:numRestart w:val="eachSect"/>
-      </w:footnotePr>
+      <w:headerReference r:id="rId10" w:type="even"/>
+      <w:headerReference r:id="rId9" w:type="default"/>
+      <w:footerReference r:id="rId12" w:type="even"/>
+      <w:footerReference r:id="rId14" w:type="default"/>
+      <w:headerReference r:id="rId11" w:type="first"/>
+      <w:footerReference r:id="rId13" w:type="first"/>
+      <w:pgSz w:h="16838" w:w="11906"/>
+      <w:pgMar w:bottom="1440" w:footer="708" w:gutter="0" w:header="708" w:left="1440" w:right="1440" w:top="1440"/>
+      <w:cols w:space="708"/>
+      <w:docGrid w:linePitch="360"/>
     </w:sectPr>
   </w:body>
 </w:document>
@@ -8441,6 +8474,36 @@
 <w:comments xmlns:w="http://schemas.openxmlformats.org/wordprocessingml/2006/main" xmlns:m="http://schemas.openxmlformats.org/officeDocument/2006/math" xmlns:r="http://schemas.openxmlformats.org/officeDocument/2006/relationships" xmlns:o="urn:schemas-microsoft-com:office:office" xmlns:v="urn:schemas-microsoft-com:vml" xmlns:w10="urn:schemas-microsoft-com:office:word" xmlns:a="http://schemas.openxmlformats.org/drawingml/2006/main" xmlns:pic="http://schemas.openxmlformats.org/drawingml/2006/picture" xmlns:wp="http://schemas.openxmlformats.org/drawingml/2006/wordprocessingDrawing"/>
 </file>
 
+<file path=word/footer1.xml><?xml version="1.0" encoding="utf-8"?>
+<w:ftr xmlns:wpc="http://schemas.microsoft.com/office/word/2010/wordprocessingCanvas" xmlns:cx="http://schemas.microsoft.com/office/drawing/2014/chartex" xmlns:cx1="http://schemas.microsoft.com/office/drawing/2015/9/8/chartex" xmlns:cx2="http://schemas.microsoft.com/office/drawing/2015/10/21/chartex" xmlns:cx3="http://schemas.microsoft.com/office/drawing/2016/5/9/chartex" xmlns:cx4="http://schemas.microsoft.com/office/drawing/2016/5/10/chartex" xmlns:cx5="http://schemas.microsoft.com/office/drawing/2016/5/11/chartex" xmlns:cx6="http://schemas.microsoft.com/office/drawing/2016/5/12/chartex" xmlns:cx7="http://schemas.microsoft.com/office/drawing/2016/5/13/chartex" xmlns:cx8="http://schemas.microsoft.com/office/drawing/2016/5/14/chartex" xmlns:mc="http://schemas.openxmlformats.org/markup-compatibility/2006" xmlns:aink="http://schemas.microsoft.com/office/drawing/2016/ink" xmlns:am3d="http://schemas.microsoft.com/office/drawing/2017/model3d" xmlns:o="urn:schemas-microsoft-com:office:office" xmlns:oel="http://schemas.microsoft.com/office/2019/extlst" xmlns:r="http://schemas.openxmlformats.org/officeDocument/2006/relationships" xmlns:m="http://schemas.openxmlformats.org/officeDocument/2006/math" xmlns:v="urn:schemas-microsoft-com:vml" xmlns:wp14="http://schemas.microsoft.com/office/word/2010/wordprocessingDrawing" xmlns:wp="http://schemas.openxmlformats.org/drawingml/2006/wordprocessingDrawing" xmlns:w10="urn:schemas-microsoft-com:office:word" xmlns:w="http://schemas.openxmlformats.org/wordprocessingml/2006/main" xmlns:w14="http://schemas.microsoft.com/office/word/2010/wordml" xmlns:w15="http://schemas.microsoft.com/office/word/2012/wordml" xmlns:w16cex="http://schemas.microsoft.com/office/word/2018/wordml/cex" xmlns:w16cid="http://schemas.microsoft.com/office/word/2016/wordml/cid" xmlns:w16="http://schemas.microsoft.com/office/word/2018/wordml" xmlns:w16du="http://schemas.microsoft.com/office/word/2023/wordml/word16du" xmlns:w16sdtdh="http://schemas.microsoft.com/office/word/2020/wordml/sdtdatahash" xmlns:w16sdtfl="http://schemas.microsoft.com/office/word/2024/wordml/sdtformatlock" xmlns:w16se="http://schemas.microsoft.com/office/word/2015/wordml/symex" xmlns:wpg="http://schemas.microsoft.com/office/word/2010/wordprocessingGroup" xmlns:wpi="http://schemas.microsoft.com/office/word/2010/wordprocessingInk" xmlns:wne="http://schemas.microsoft.com/office/word/2006/wordml" xmlns:wps="http://schemas.microsoft.com/office/word/2010/wordprocessingShape" mc:Ignorable="w14 w15 w16se w16cid w16 w16cex w16sdtdh w16sdtfl w16du wp14">
+  <w:p>
+    <w:pPr>
+      <w:pStyle w:val="Footer"/>
+    </w:pPr>
+  </w:p>
+</w:ftr>
+</file>
+
+<file path=word/footer2.xml><?xml version="1.0" encoding="utf-8"?>
+<w:ftr xmlns:wpc="http://schemas.microsoft.com/office/word/2010/wordprocessingCanvas" xmlns:cx="http://schemas.microsoft.com/office/drawing/2014/chartex" xmlns:cx1="http://schemas.microsoft.com/office/drawing/2015/9/8/chartex" xmlns:cx2="http://schemas.microsoft.com/office/drawing/2015/10/21/chartex" xmlns:cx3="http://schemas.microsoft.com/office/drawing/2016/5/9/chartex" xmlns:cx4="http://schemas.microsoft.com/office/drawing/2016/5/10/chartex" xmlns:cx5="http://schemas.microsoft.com/office/drawing/2016/5/11/chartex" xmlns:cx6="http://schemas.microsoft.com/office/drawing/2016/5/12/chartex" xmlns:cx7="http://schemas.microsoft.com/office/drawing/2016/5/13/chartex" xmlns:cx8="http://schemas.microsoft.com/office/drawing/2016/5/14/chartex" xmlns:mc="http://schemas.openxmlformats.org/markup-compatibility/2006" xmlns:aink="http://schemas.microsoft.com/office/drawing/2016/ink" xmlns:am3d="http://schemas.microsoft.com/office/drawing/2017/model3d" xmlns:o="urn:schemas-microsoft-com:office:office" xmlns:oel="http://schemas.microsoft.com/office/2019/extlst" xmlns:r="http://schemas.openxmlformats.org/officeDocument/2006/relationships" xmlns:m="http://schemas.openxmlformats.org/officeDocument/2006/math" xmlns:v="urn:schemas-microsoft-com:vml" xmlns:wp14="http://schemas.microsoft.com/office/word/2010/wordprocessingDrawing" xmlns:wp="http://schemas.openxmlformats.org/drawingml/2006/wordprocessingDrawing" xmlns:w10="urn:schemas-microsoft-com:office:word" xmlns:w="http://schemas.openxmlformats.org/wordprocessingml/2006/main" xmlns:w14="http://schemas.microsoft.com/office/word/2010/wordml" xmlns:w15="http://schemas.microsoft.com/office/word/2012/wordml" xmlns:w16cex="http://schemas.microsoft.com/office/word/2018/wordml/cex" xmlns:w16cid="http://schemas.microsoft.com/office/word/2016/wordml/cid" xmlns:w16="http://schemas.microsoft.com/office/word/2018/wordml" xmlns:w16du="http://schemas.microsoft.com/office/word/2023/wordml/word16du" xmlns:w16sdtdh="http://schemas.microsoft.com/office/word/2020/wordml/sdtdatahash" xmlns:w16sdtfl="http://schemas.microsoft.com/office/word/2024/wordml/sdtformatlock" xmlns:w16se="http://schemas.microsoft.com/office/word/2015/wordml/symex" xmlns:wpg="http://schemas.microsoft.com/office/word/2010/wordprocessingGroup" xmlns:wpi="http://schemas.microsoft.com/office/word/2010/wordprocessingInk" xmlns:wne="http://schemas.microsoft.com/office/word/2006/wordml" xmlns:wps="http://schemas.microsoft.com/office/word/2010/wordprocessingShape" mc:Ignorable="w14 w15 w16se w16cid w16 w16cex w16sdtdh w16sdtfl w16du wp14">
+  <w:p>
+    <w:pPr>
+      <w:pStyle w:val="Footer"/>
+    </w:pPr>
+  </w:p>
+</w:ftr>
+</file>
+
+<file path=word/footer3.xml><?xml version="1.0" encoding="utf-8"?>
+<w:ftr xmlns:wpc="http://schemas.microsoft.com/office/word/2010/wordprocessingCanvas" xmlns:cx="http://schemas.microsoft.com/office/drawing/2014/chartex" xmlns:cx1="http://schemas.microsoft.com/office/drawing/2015/9/8/chartex" xmlns:cx2="http://schemas.microsoft.com/office/drawing/2015/10/21/chartex" xmlns:cx3="http://schemas.microsoft.com/office/drawing/2016/5/9/chartex" xmlns:cx4="http://schemas.microsoft.com/office/drawing/2016/5/10/chartex" xmlns:cx5="http://schemas.microsoft.com/office/drawing/2016/5/11/chartex" xmlns:cx6="http://schemas.microsoft.com/office/drawing/2016/5/12/chartex" xmlns:cx7="http://schemas.microsoft.com/office/drawing/2016/5/13/chartex" xmlns:cx8="http://schemas.microsoft.com/office/drawing/2016/5/14/chartex" xmlns:mc="http://schemas.openxmlformats.org/markup-compatibility/2006" xmlns:aink="http://schemas.microsoft.com/office/drawing/2016/ink" xmlns:am3d="http://schemas.microsoft.com/office/drawing/2017/model3d" xmlns:o="urn:schemas-microsoft-com:office:office" xmlns:oel="http://schemas.microsoft.com/office/2019/extlst" xmlns:r="http://schemas.openxmlformats.org/officeDocument/2006/relationships" xmlns:m="http://schemas.openxmlformats.org/officeDocument/2006/math" xmlns:v="urn:schemas-microsoft-com:vml" xmlns:wp14="http://schemas.microsoft.com/office/word/2010/wordprocessingDrawing" xmlns:wp="http://schemas.openxmlformats.org/drawingml/2006/wordprocessingDrawing" xmlns:w10="urn:schemas-microsoft-com:office:word" xmlns:w="http://schemas.openxmlformats.org/wordprocessingml/2006/main" xmlns:w14="http://schemas.microsoft.com/office/word/2010/wordml" xmlns:w15="http://schemas.microsoft.com/office/word/2012/wordml" xmlns:w16cex="http://schemas.microsoft.com/office/word/2018/wordml/cex" xmlns:w16cid="http://schemas.microsoft.com/office/word/2016/wordml/cid" xmlns:w16="http://schemas.microsoft.com/office/word/2018/wordml" xmlns:w16du="http://schemas.microsoft.com/office/word/2023/wordml/word16du" xmlns:w16sdtdh="http://schemas.microsoft.com/office/word/2020/wordml/sdtdatahash" xmlns:w16sdtfl="http://schemas.microsoft.com/office/word/2024/wordml/sdtformatlock" xmlns:w16se="http://schemas.microsoft.com/office/word/2015/wordml/symex" xmlns:wpg="http://schemas.microsoft.com/office/word/2010/wordprocessingGroup" xmlns:wpi="http://schemas.microsoft.com/office/word/2010/wordprocessingInk" xmlns:wne="http://schemas.microsoft.com/office/word/2006/wordml" xmlns:wps="http://schemas.microsoft.com/office/word/2010/wordprocessingShape" mc:Ignorable="w14 w15 w16se w16cid w16 w16cex w16sdtdh w16sdtfl w16du wp14">
+  <w:p>
+    <w:pPr>
+      <w:pStyle w:val="Footer"/>
+    </w:pPr>
+  </w:p>
+</w:ftr>
+</file>
+
 <file path=word/footnotes.xml><?xml version="1.0" encoding="utf-8"?>
 <w:footnotes xmlns:w="http://schemas.openxmlformats.org/wordprocessingml/2006/main" xmlns:m="http://schemas.openxmlformats.org/officeDocument/2006/math" xmlns:r="http://schemas.openxmlformats.org/officeDocument/2006/relationships" xmlns:o="urn:schemas-microsoft-com:office:office" xmlns:v="urn:schemas-microsoft-com:vml" xmlns:w10="urn:schemas-microsoft-com:office:word" xmlns:a="http://schemas.openxmlformats.org/drawingml/2006/main" xmlns:pic="http://schemas.openxmlformats.org/drawingml/2006/picture" xmlns:wp="http://schemas.openxmlformats.org/drawingml/2006/wordprocessingDrawing">
   <w:footnote w:type="continuationSeparator" w:id="0">
@@ -8458,6 +8521,82 @@
     </w:p>
   </w:footnote>
 </w:footnotes>
+</file>
+
+<file path=word/header1.xml><?xml version="1.0" encoding="utf-8"?>
+<w:hdr xmlns:wpc="http://schemas.microsoft.com/office/word/2010/wordprocessingCanvas" xmlns:cx="http://schemas.microsoft.com/office/drawing/2014/chartex" xmlns:cx1="http://schemas.microsoft.com/office/drawing/2015/9/8/chartex" xmlns:cx2="http://schemas.microsoft.com/office/drawing/2015/10/21/chartex" xmlns:cx3="http://schemas.microsoft.com/office/drawing/2016/5/9/chartex" xmlns:cx4="http://schemas.microsoft.com/office/drawing/2016/5/10/chartex" xmlns:cx5="http://schemas.microsoft.com/office/drawing/2016/5/11/chartex" xmlns:cx6="http://schemas.microsoft.com/office/drawing/2016/5/12/chartex" xmlns:cx7="http://schemas.microsoft.com/office/drawing/2016/5/13/chartex" xmlns:cx8="http://schemas.microsoft.com/office/drawing/2016/5/14/chartex" xmlns:mc="http://schemas.openxmlformats.org/markup-compatibility/2006" xmlns:aink="http://schemas.microsoft.com/office/drawing/2016/ink" xmlns:am3d="http://schemas.microsoft.com/office/drawing/2017/model3d" xmlns:o="urn:schemas-microsoft-com:office:office" xmlns:oel="http://schemas.microsoft.com/office/2019/extlst" xmlns:r="http://schemas.openxmlformats.org/officeDocument/2006/relationships" xmlns:m="http://schemas.openxmlformats.org/officeDocument/2006/math" xmlns:v="urn:schemas-microsoft-com:vml" xmlns:wp14="http://schemas.microsoft.com/office/word/2010/wordprocessingDrawing" xmlns:wp="http://schemas.openxmlformats.org/drawingml/2006/wordprocessingDrawing" xmlns:w10="urn:schemas-microsoft-com:office:word" xmlns:w="http://schemas.openxmlformats.org/wordprocessingml/2006/main" xmlns:w14="http://schemas.microsoft.com/office/word/2010/wordml" xmlns:w15="http://schemas.microsoft.com/office/word/2012/wordml" xmlns:w16cex="http://schemas.microsoft.com/office/word/2018/wordml/cex" xmlns:w16cid="http://schemas.microsoft.com/office/word/2016/wordml/cid" xmlns:w16="http://schemas.microsoft.com/office/word/2018/wordml" xmlns:w16du="http://schemas.microsoft.com/office/word/2023/wordml/word16du" xmlns:w16sdtdh="http://schemas.microsoft.com/office/word/2020/wordml/sdtdatahash" xmlns:w16sdtfl="http://schemas.microsoft.com/office/word/2024/wordml/sdtformatlock" xmlns:w16se="http://schemas.microsoft.com/office/word/2015/wordml/symex" xmlns:wpg="http://schemas.microsoft.com/office/word/2010/wordprocessingGroup" xmlns:wpi="http://schemas.microsoft.com/office/word/2010/wordprocessingInk" xmlns:wne="http://schemas.microsoft.com/office/word/2006/wordml" xmlns:wps="http://schemas.microsoft.com/office/word/2010/wordprocessingShape" mc:Ignorable="w14 w15 w16se w16cid w16 w16cex w16sdtdh w16sdtfl w16du wp14">
+  <w:p>
+    <w:pPr>
+      <w:pStyle w:val="Header"/>
+    </w:pPr>
+  </w:p>
+</w:hdr>
+</file>
+
+<file path=word/header2.xml><?xml version="1.0" encoding="utf-8"?>
+<w:hdr xmlns:wpc="http://schemas.microsoft.com/office/word/2010/wordprocessingCanvas" xmlns:cx="http://schemas.microsoft.com/office/drawing/2014/chartex" xmlns:cx1="http://schemas.microsoft.com/office/drawing/2015/9/8/chartex" xmlns:cx2="http://schemas.microsoft.com/office/drawing/2015/10/21/chartex" xmlns:cx3="http://schemas.microsoft.com/office/drawing/2016/5/9/chartex" xmlns:cx4="http://schemas.microsoft.com/office/drawing/2016/5/10/chartex" xmlns:cx5="http://schemas.microsoft.com/office/drawing/2016/5/11/chartex" xmlns:cx6="http://schemas.microsoft.com/office/drawing/2016/5/12/chartex" xmlns:cx7="http://schemas.microsoft.com/office/drawing/2016/5/13/chartex" xmlns:cx8="http://schemas.microsoft.com/office/drawing/2016/5/14/chartex" xmlns:mc="http://schemas.openxmlformats.org/markup-compatibility/2006" xmlns:aink="http://schemas.microsoft.com/office/drawing/2016/ink" xmlns:am3d="http://schemas.microsoft.com/office/drawing/2017/model3d" xmlns:o="urn:schemas-microsoft-com:office:office" xmlns:oel="http://schemas.microsoft.com/office/2019/extlst" xmlns:r="http://schemas.openxmlformats.org/officeDocument/2006/relationships" xmlns:m="http://schemas.openxmlformats.org/officeDocument/2006/math" xmlns:v="urn:schemas-microsoft-com:vml" xmlns:wp14="http://schemas.microsoft.com/office/word/2010/wordprocessingDrawing" xmlns:wp="http://schemas.openxmlformats.org/drawingml/2006/wordprocessingDrawing" xmlns:w10="urn:schemas-microsoft-com:office:word" xmlns:w="http://schemas.openxmlformats.org/wordprocessingml/2006/main" xmlns:w14="http://schemas.microsoft.com/office/word/2010/wordml" xmlns:w15="http://schemas.microsoft.com/office/word/2012/wordml" xmlns:w16cex="http://schemas.microsoft.com/office/word/2018/wordml/cex" xmlns:w16cid="http://schemas.microsoft.com/office/word/2016/wordml/cid" xmlns:w16="http://schemas.microsoft.com/office/word/2018/wordml" xmlns:w16du="http://schemas.microsoft.com/office/word/2023/wordml/word16du" xmlns:w16sdtdh="http://schemas.microsoft.com/office/word/2020/wordml/sdtdatahash" xmlns:w16sdtfl="http://schemas.microsoft.com/office/word/2024/wordml/sdtformatlock" xmlns:w16se="http://schemas.microsoft.com/office/word/2015/wordml/symex" xmlns:wpg="http://schemas.microsoft.com/office/word/2010/wordprocessingGroup" xmlns:wpi="http://schemas.microsoft.com/office/word/2010/wordprocessingInk" xmlns:wne="http://schemas.microsoft.com/office/word/2006/wordml" xmlns:wps="http://schemas.microsoft.com/office/word/2010/wordprocessingShape" mc:Ignorable="w14 w15 w16se w16cid w16 w16cex w16sdtdh w16sdtfl w16du wp14">
+  <w:p>
+    <w:pPr>
+      <w:pStyle w:val="Header"/>
+    </w:pPr>
+    <w:r>
+      <w:rPr>
+        <w:noProof/>
+      </w:rPr>
+      <w:drawing>
+        <wp:inline distT="0" distB="0" distL="0" distR="0" wp14:anchorId="2ECC1689" wp14:editId="2AFFEAD6">
+          <wp:extent cx="1504800" cy="432000"/>
+          <wp:effectExtent l="0" t="0" r="635" b="6350"/>
+          <wp:docPr id="1655768963" name="Picture 1" descr="A black and white logo&#10;&#10;AI-generated content may be incorrect."/>
+          <wp:cNvGraphicFramePr>
+            <a:graphicFrameLocks xmlns:a="http://schemas.openxmlformats.org/drawingml/2006/main" noChangeAspect="1"/>
+          </wp:cNvGraphicFramePr>
+          <a:graphic xmlns:a="http://schemas.openxmlformats.org/drawingml/2006/main">
+            <a:graphicData uri="http://schemas.openxmlformats.org/drawingml/2006/picture">
+              <pic:pic xmlns:pic="http://schemas.openxmlformats.org/drawingml/2006/picture">
+                <pic:nvPicPr>
+                  <pic:cNvPr id="1655768963" name="Picture 1" descr="A black and white logo&#10;&#10;AI-generated content may be incorrect."/>
+                  <pic:cNvPicPr/>
+                </pic:nvPicPr>
+                <pic:blipFill>
+                  <a:blip r:embed="rId1">
+                    <a:extLst>
+                      <a:ext uri="{28A0092B-C50C-407E-A947-70E740481C1C}">
+                        <a14:useLocalDpi xmlns:a14="http://schemas.microsoft.com/office/drawing/2010/main" val="0"/>
+                      </a:ext>
+                    </a:extLst>
+                  </a:blip>
+                  <a:stretch>
+                    <a:fillRect/>
+                  </a:stretch>
+                </pic:blipFill>
+                <pic:spPr>
+                  <a:xfrm>
+                    <a:off x="0" y="0"/>
+                    <a:ext cx="1504800" cy="432000"/>
+                  </a:xfrm>
+                  <a:prstGeom prst="rect">
+                    <a:avLst/>
+                  </a:prstGeom>
+                </pic:spPr>
+              </pic:pic>
+            </a:graphicData>
+          </a:graphic>
+        </wp:inline>
+      </w:drawing>
+    </w:r>
+  </w:p>
+</w:hdr>
+</file>
+
+<file path=word/header3.xml><?xml version="1.0" encoding="utf-8"?>
+<w:hdr xmlns:wpc="http://schemas.microsoft.com/office/word/2010/wordprocessingCanvas" xmlns:cx="http://schemas.microsoft.com/office/drawing/2014/chartex" xmlns:cx1="http://schemas.microsoft.com/office/drawing/2015/9/8/chartex" xmlns:cx2="http://schemas.microsoft.com/office/drawing/2015/10/21/chartex" xmlns:cx3="http://schemas.microsoft.com/office/drawing/2016/5/9/chartex" xmlns:cx4="http://schemas.microsoft.com/office/drawing/2016/5/10/chartex" xmlns:cx5="http://schemas.microsoft.com/office/drawing/2016/5/11/chartex" xmlns:cx6="http://schemas.microsoft.com/office/drawing/2016/5/12/chartex" xmlns:cx7="http://schemas.microsoft.com/office/drawing/2016/5/13/chartex" xmlns:cx8="http://schemas.microsoft.com/office/drawing/2016/5/14/chartex" xmlns:mc="http://schemas.openxmlformats.org/markup-compatibility/2006" xmlns:aink="http://schemas.microsoft.com/office/drawing/2016/ink" xmlns:am3d="http://schemas.microsoft.com/office/drawing/2017/model3d" xmlns:o="urn:schemas-microsoft-com:office:office" xmlns:oel="http://schemas.microsoft.com/office/2019/extlst" xmlns:r="http://schemas.openxmlformats.org/officeDocument/2006/relationships" xmlns:m="http://schemas.openxmlformats.org/officeDocument/2006/math" xmlns:v="urn:schemas-microsoft-com:vml" xmlns:wp14="http://schemas.microsoft.com/office/word/2010/wordprocessingDrawing" xmlns:wp="http://schemas.openxmlformats.org/drawingml/2006/wordprocessingDrawing" xmlns:w10="urn:schemas-microsoft-com:office:word" xmlns:w="http://schemas.openxmlformats.org/wordprocessingml/2006/main" xmlns:w14="http://schemas.microsoft.com/office/word/2010/wordml" xmlns:w15="http://schemas.microsoft.com/office/word/2012/wordml" xmlns:w16cex="http://schemas.microsoft.com/office/word/2018/wordml/cex" xmlns:w16cid="http://schemas.microsoft.com/office/word/2016/wordml/cid" xmlns:w16="http://schemas.microsoft.com/office/word/2018/wordml" xmlns:w16du="http://schemas.microsoft.com/office/word/2023/wordml/word16du" xmlns:w16sdtdh="http://schemas.microsoft.com/office/word/2020/wordml/sdtdatahash" xmlns:w16sdtfl="http://schemas.microsoft.com/office/word/2024/wordml/sdtformatlock" xmlns:w16se="http://schemas.microsoft.com/office/word/2015/wordml/symex" xmlns:wpg="http://schemas.microsoft.com/office/word/2010/wordprocessingGroup" xmlns:wpi="http://schemas.microsoft.com/office/word/2010/wordprocessingInk" xmlns:wne="http://schemas.microsoft.com/office/word/2006/wordml" xmlns:wps="http://schemas.microsoft.com/office/word/2010/wordprocessingShape" mc:Ignorable="w14 w15 w16se w16cid w16 w16cex w16sdtdh w16sdtfl w16du wp14">
+  <w:p>
+    <w:pPr>
+      <w:pStyle w:val="Header"/>
+    </w:pPr>
+  </w:p>
+</w:hdr>
 </file>
 
 <file path=word/numbering.xml><?xml version="1.0" encoding="utf-8"?>
@@ -8693,191 +8832,414 @@
 </file>
 
 <file path=word/styles.xml><?xml version="1.0" encoding="utf-8"?>
-<w:styles xmlns:r="http://schemas.openxmlformats.org/officeDocument/2006/relationships" xmlns:w="http://schemas.openxmlformats.org/wordprocessingml/2006/main">
+<w:styles xmlns:mc="http://schemas.openxmlformats.org/markup-compatibility/2006" xmlns:r="http://schemas.openxmlformats.org/officeDocument/2006/relationships" xmlns:w="http://schemas.openxmlformats.org/wordprocessingml/2006/main" xmlns:w14="http://schemas.microsoft.com/office/word/2010/wordml" xmlns:w15="http://schemas.microsoft.com/office/word/2012/wordml" xmlns:w16="http://schemas.microsoft.com/office/word/2018/wordml" xmlns:w16cex="http://schemas.microsoft.com/office/word/2018/wordml/cex" xmlns:w16cid="http://schemas.microsoft.com/office/word/2016/wordml/cid" xmlns:w16du="http://schemas.microsoft.com/office/word/2023/wordml/word16du" xmlns:w16sdtdh="http://schemas.microsoft.com/office/word/2020/wordml/sdtdatahash" xmlns:w16sdtfl="http://schemas.microsoft.com/office/word/2024/wordml/sdtformatlock" xmlns:w16se="http://schemas.microsoft.com/office/word/2015/wordml/symex" mc:Ignorable="w14 w15 w16se w16cid w16 w16cex w16sdtdh w16sdtfl w16du">
   <w:docDefaults>
     <w:rPrDefault>
       <w:rPr>
         <w:rFonts w:asciiTheme="minorHAnsi" w:cstheme="minorBidi" w:eastAsiaTheme="minorHAnsi" w:hAnsiTheme="minorHAnsi"/>
+        <w:kern w:val="2"/>
         <w:sz w:val="24"/>
         <w:szCs w:val="24"/>
-        <w:lang w:bidi="ar-SA" w:eastAsia="en-US" w:val="en"/>
+        <w:lang w:bidi="ar-SA" w:eastAsia="en-US"/>
+        <w14:ligatures w14:val="standardContextual"/>
       </w:rPr>
     </w:rPrDefault>
     <w:pPrDefault>
       <w:pPr>
-        <w:spacing w:after="200"/>
+        <w:spacing w:after="160" w:line="278" w:lineRule="auto"/>
       </w:pPr>
     </w:pPrDefault>
   </w:docDefaults>
-  <w:latentStyles w:count="276" w:defLockedState="0" w:defQFormat="0" w:defSemiHidden="0" w:defUIPriority="0" w:defUnhideWhenUsed="0"/>
+  <w:latentStyles w:count="376" w:defLockedState="0" w:defQFormat="0" w:defSemiHidden="0" w:defUIPriority="99" w:defUnhideWhenUsed="0">
+    <w:lsdException w:name="Normal" w:qFormat="1" w:uiPriority="0"/>
+    <w:lsdException w:name="heading 1" w:qFormat="1" w:uiPriority="9"/>
+    <w:lsdException w:name="heading 2" w:qFormat="1" w:semiHidden="1" w:uiPriority="9" w:unhideWhenUsed="1"/>
+    <w:lsdException w:name="heading 3" w:qFormat="1" w:semiHidden="1" w:uiPriority="9" w:unhideWhenUsed="1"/>
+    <w:lsdException w:name="heading 4" w:qFormat="1" w:semiHidden="1" w:uiPriority="9" w:unhideWhenUsed="1"/>
+    <w:lsdException w:name="heading 5" w:qFormat="1" w:semiHidden="1" w:uiPriority="9" w:unhideWhenUsed="1"/>
+    <w:lsdException w:name="heading 6" w:qFormat="1" w:semiHidden="1" w:uiPriority="9" w:unhideWhenUsed="1"/>
+    <w:lsdException w:name="heading 7" w:qFormat="1" w:semiHidden="1" w:uiPriority="9" w:unhideWhenUsed="1"/>
+    <w:lsdException w:name="heading 8" w:qFormat="1" w:semiHidden="1" w:uiPriority="9" w:unhideWhenUsed="1"/>
+    <w:lsdException w:name="heading 9" w:qFormat="1" w:semiHidden="1" w:uiPriority="9" w:unhideWhenUsed="1"/>
+    <w:lsdException w:name="index 1" w:semiHidden="1" w:unhideWhenUsed="1"/>
+    <w:lsdException w:name="index 2" w:semiHidden="1" w:unhideWhenUsed="1"/>
+    <w:lsdException w:name="index 3" w:semiHidden="1" w:unhideWhenUsed="1"/>
+    <w:lsdException w:name="index 4" w:semiHidden="1" w:unhideWhenUsed="1"/>
+    <w:lsdException w:name="index 5" w:semiHidden="1" w:unhideWhenUsed="1"/>
+    <w:lsdException w:name="index 6" w:semiHidden="1" w:unhideWhenUsed="1"/>
+    <w:lsdException w:name="index 7" w:semiHidden="1" w:unhideWhenUsed="1"/>
+    <w:lsdException w:name="index 8" w:semiHidden="1" w:unhideWhenUsed="1"/>
+    <w:lsdException w:name="index 9" w:semiHidden="1" w:unhideWhenUsed="1"/>
+    <w:lsdException w:name="toc 1" w:semiHidden="1" w:uiPriority="39" w:unhideWhenUsed="1"/>
+    <w:lsdException w:name="toc 2" w:semiHidden="1" w:uiPriority="39" w:unhideWhenUsed="1"/>
+    <w:lsdException w:name="toc 3" w:semiHidden="1" w:uiPriority="39" w:unhideWhenUsed="1"/>
+    <w:lsdException w:name="toc 4" w:semiHidden="1" w:uiPriority="39" w:unhideWhenUsed="1"/>
+    <w:lsdException w:name="toc 5" w:semiHidden="1" w:uiPriority="39" w:unhideWhenUsed="1"/>
+    <w:lsdException w:name="toc 6" w:semiHidden="1" w:uiPriority="39" w:unhideWhenUsed="1"/>
+    <w:lsdException w:name="toc 7" w:semiHidden="1" w:uiPriority="39" w:unhideWhenUsed="1"/>
+    <w:lsdException w:name="toc 8" w:semiHidden="1" w:uiPriority="39" w:unhideWhenUsed="1"/>
+    <w:lsdException w:name="toc 9" w:semiHidden="1" w:uiPriority="39" w:unhideWhenUsed="1"/>
+    <w:lsdException w:name="Normal Indent" w:semiHidden="1" w:unhideWhenUsed="1"/>
+    <w:lsdException w:name="footnote text" w:semiHidden="1" w:unhideWhenUsed="1"/>
+    <w:lsdException w:name="annotation text" w:semiHidden="1" w:unhideWhenUsed="1"/>
+    <w:lsdException w:name="header" w:semiHidden="1" w:unhideWhenUsed="1"/>
+    <w:lsdException w:name="footer" w:semiHidden="1" w:unhideWhenUsed="1"/>
+    <w:lsdException w:name="index heading" w:semiHidden="1" w:unhideWhenUsed="1"/>
+    <w:lsdException w:name="caption" w:qFormat="1" w:semiHidden="1" w:uiPriority="35" w:unhideWhenUsed="1"/>
+    <w:lsdException w:name="table of figures" w:semiHidden="1" w:unhideWhenUsed="1"/>
+    <w:lsdException w:name="envelope address" w:semiHidden="1" w:unhideWhenUsed="1"/>
+    <w:lsdException w:name="envelope return" w:semiHidden="1" w:unhideWhenUsed="1"/>
+    <w:lsdException w:name="footnote reference" w:semiHidden="1" w:unhideWhenUsed="1"/>
+    <w:lsdException w:name="annotation reference" w:semiHidden="1" w:unhideWhenUsed="1"/>
+    <w:lsdException w:name="line number" w:semiHidden="1" w:unhideWhenUsed="1"/>
+    <w:lsdException w:name="page number" w:semiHidden="1" w:unhideWhenUsed="1"/>
+    <w:lsdException w:name="endnote reference" w:semiHidden="1" w:unhideWhenUsed="1"/>
+    <w:lsdException w:name="endnote text" w:semiHidden="1" w:unhideWhenUsed="1"/>
+    <w:lsdException w:name="table of authorities" w:semiHidden="1" w:unhideWhenUsed="1"/>
+    <w:lsdException w:name="macro" w:semiHidden="1" w:unhideWhenUsed="1"/>
+    <w:lsdException w:name="toa heading" w:semiHidden="1" w:unhideWhenUsed="1"/>
+    <w:lsdException w:name="List" w:semiHidden="1" w:unhideWhenUsed="1"/>
+    <w:lsdException w:name="List Bullet" w:semiHidden="1" w:unhideWhenUsed="1"/>
+    <w:lsdException w:name="List Number" w:semiHidden="1" w:unhideWhenUsed="1"/>
+    <w:lsdException w:name="List 2" w:semiHidden="1" w:unhideWhenUsed="1"/>
+    <w:lsdException w:name="List 3" w:semiHidden="1" w:unhideWhenUsed="1"/>
+    <w:lsdException w:name="List 4" w:semiHidden="1" w:unhideWhenUsed="1"/>
+    <w:lsdException w:name="List 5" w:semiHidden="1" w:unhideWhenUsed="1"/>
+    <w:lsdException w:name="List Bullet 2" w:semiHidden="1" w:unhideWhenUsed="1"/>
+    <w:lsdException w:name="List Bullet 3" w:semiHidden="1" w:unhideWhenUsed="1"/>
+    <w:lsdException w:name="List Bullet 4" w:semiHidden="1" w:unhideWhenUsed="1"/>
+    <w:lsdException w:name="List Bullet 5" w:semiHidden="1" w:unhideWhenUsed="1"/>
+    <w:lsdException w:name="List Number 2" w:semiHidden="1" w:unhideWhenUsed="1"/>
+    <w:lsdException w:name="List Number 3" w:semiHidden="1" w:unhideWhenUsed="1"/>
+    <w:lsdException w:name="List Number 4" w:semiHidden="1" w:unhideWhenUsed="1"/>
+    <w:lsdException w:name="List Number 5" w:semiHidden="1" w:unhideWhenUsed="1"/>
+    <w:lsdException w:name="Title" w:qFormat="1" w:uiPriority="10"/>
+    <w:lsdException w:name="Closing" w:semiHidden="1" w:unhideWhenUsed="1"/>
+    <w:lsdException w:name="Signature" w:semiHidden="1" w:unhideWhenUsed="1"/>
+    <w:lsdException w:name="Default Paragraph Font" w:semiHidden="1" w:uiPriority="1" w:unhideWhenUsed="1"/>
+    <w:lsdException w:name="Body Text" w:semiHidden="1" w:unhideWhenUsed="1"/>
+    <w:lsdException w:name="Body Text Indent" w:semiHidden="1" w:unhideWhenUsed="1"/>
+    <w:lsdException w:name="List Continue" w:semiHidden="1" w:unhideWhenUsed="1"/>
+    <w:lsdException w:name="List Continue 2" w:semiHidden="1" w:unhideWhenUsed="1"/>
+    <w:lsdException w:name="List Continue 3" w:semiHidden="1" w:unhideWhenUsed="1"/>
+    <w:lsdException w:name="List Continue 4" w:semiHidden="1" w:unhideWhenUsed="1"/>
+    <w:lsdException w:name="List Continue 5" w:semiHidden="1" w:unhideWhenUsed="1"/>
+    <w:lsdException w:name="Message Header" w:semiHidden="1" w:unhideWhenUsed="1"/>
+    <w:lsdException w:name="Subtitle" w:qFormat="1" w:uiPriority="11"/>
+    <w:lsdException w:name="Salutation" w:semiHidden="1" w:unhideWhenUsed="1"/>
+    <w:lsdException w:name="Date" w:semiHidden="1" w:unhideWhenUsed="1"/>
+    <w:lsdException w:name="Body Text First Indent" w:semiHidden="1" w:unhideWhenUsed="1"/>
+    <w:lsdException w:name="Body Text First Indent 2" w:semiHidden="1" w:unhideWhenUsed="1"/>
+    <w:lsdException w:name="Note Heading" w:semiHidden="1" w:unhideWhenUsed="1"/>
+    <w:lsdException w:name="Body Text 2" w:semiHidden="1" w:unhideWhenUsed="1"/>
+    <w:lsdException w:name="Body Text 3" w:semiHidden="1" w:unhideWhenUsed="1"/>
+    <w:lsdException w:name="Body Text Indent 2" w:semiHidden="1" w:unhideWhenUsed="1"/>
+    <w:lsdException w:name="Body Text Indent 3" w:semiHidden="1" w:unhideWhenUsed="1"/>
+    <w:lsdException w:name="Block Text" w:semiHidden="1" w:unhideWhenUsed="1"/>
+    <w:lsdException w:name="Hyperlink" w:semiHidden="1" w:unhideWhenUsed="1"/>
+    <w:lsdException w:name="FollowedHyperlink" w:semiHidden="1" w:unhideWhenUsed="1"/>
+    <w:lsdException w:name="Strong" w:qFormat="1" w:uiPriority="22"/>
+    <w:lsdException w:name="Emphasis" w:qFormat="1" w:uiPriority="20"/>
+    <w:lsdException w:name="Document Map" w:semiHidden="1" w:unhideWhenUsed="1"/>
+    <w:lsdException w:name="Plain Text" w:semiHidden="1" w:unhideWhenUsed="1"/>
+    <w:lsdException w:name="E-mail Signature" w:semiHidden="1" w:unhideWhenUsed="1"/>
+    <w:lsdException w:name="HTML Top of Form" w:semiHidden="1" w:unhideWhenUsed="1"/>
+    <w:lsdException w:name="HTML Bottom of Form" w:semiHidden="1" w:unhideWhenUsed="1"/>
+    <w:lsdException w:name="Normal (Web)" w:semiHidden="1" w:unhideWhenUsed="1"/>
+    <w:lsdException w:name="HTML Acronym" w:semiHidden="1" w:unhideWhenUsed="1"/>
+    <w:lsdException w:name="HTML Address" w:semiHidden="1" w:unhideWhenUsed="1"/>
+    <w:lsdException w:name="HTML Cite" w:semiHidden="1" w:unhideWhenUsed="1"/>
+    <w:lsdException w:name="HTML Code" w:semiHidden="1" w:unhideWhenUsed="1"/>
+    <w:lsdException w:name="HTML Definition" w:semiHidden="1" w:unhideWhenUsed="1"/>
+    <w:lsdException w:name="HTML Keyboard" w:semiHidden="1" w:unhideWhenUsed="1"/>
+    <w:lsdException w:name="HTML Preformatted" w:semiHidden="1" w:unhideWhenUsed="1"/>
+    <w:lsdException w:name="HTML Sample" w:semiHidden="1" w:unhideWhenUsed="1"/>
+    <w:lsdException w:name="HTML Typewriter" w:semiHidden="1" w:unhideWhenUsed="1"/>
+    <w:lsdException w:name="HTML Variable" w:semiHidden="1" w:unhideWhenUsed="1"/>
+    <w:lsdException w:name="Normal Table" w:semiHidden="1" w:unhideWhenUsed="1"/>
+    <w:lsdException w:name="annotation subject" w:semiHidden="1" w:unhideWhenUsed="1"/>
+    <w:lsdException w:name="No List" w:semiHidden="1" w:unhideWhenUsed="1"/>
+    <w:lsdException w:name="Outline List 1" w:semiHidden="1" w:unhideWhenUsed="1"/>
+    <w:lsdException w:name="Outline List 2" w:semiHidden="1" w:unhideWhenUsed="1"/>
+    <w:lsdException w:name="Outline List 3" w:semiHidden="1" w:unhideWhenUsed="1"/>
+    <w:lsdException w:name="Table Simple 1" w:semiHidden="1" w:unhideWhenUsed="1"/>
+    <w:lsdException w:name="Table Simple 2" w:semiHidden="1" w:unhideWhenUsed="1"/>
+    <w:lsdException w:name="Table Simple 3" w:semiHidden="1" w:unhideWhenUsed="1"/>
+    <w:lsdException w:name="Table Classic 1" w:semiHidden="1" w:unhideWhenUsed="1"/>
+    <w:lsdException w:name="Table Classic 2" w:semiHidden="1" w:unhideWhenUsed="1"/>
+    <w:lsdException w:name="Table Classic 3" w:semiHidden="1" w:unhideWhenUsed="1"/>
+    <w:lsdException w:name="Table Classic 4" w:semiHidden="1" w:unhideWhenUsed="1"/>
+    <w:lsdException w:name="Table Colorful 1" w:semiHidden="1" w:unhideWhenUsed="1"/>
+    <w:lsdException w:name="Table Colorful 2" w:semiHidden="1" w:unhideWhenUsed="1"/>
+    <w:lsdException w:name="Table Colorful 3" w:semiHidden="1" w:unhideWhenUsed="1"/>
+    <w:lsdException w:name="Table Columns 1" w:semiHidden="1" w:unhideWhenUsed="1"/>
+    <w:lsdException w:name="Table Columns 2" w:semiHidden="1" w:unhideWhenUsed="1"/>
+    <w:lsdException w:name="Table Columns 3" w:semiHidden="1" w:unhideWhenUsed="1"/>
+    <w:lsdException w:name="Table Columns 4" w:semiHidden="1" w:unhideWhenUsed="1"/>
+    <w:lsdException w:name="Table Columns 5" w:semiHidden="1" w:unhideWhenUsed="1"/>
+    <w:lsdException w:name="Table Grid 1" w:semiHidden="1" w:unhideWhenUsed="1"/>
+    <w:lsdException w:name="Table Grid 2" w:semiHidden="1" w:unhideWhenUsed="1"/>
+    <w:lsdException w:name="Table Grid 3" w:semiHidden="1" w:unhideWhenUsed="1"/>
+    <w:lsdException w:name="Table Grid 4" w:semiHidden="1" w:unhideWhenUsed="1"/>
+    <w:lsdException w:name="Table Grid 5" w:semiHidden="1" w:unhideWhenUsed="1"/>
+    <w:lsdException w:name="Table Grid 6" w:semiHidden="1" w:unhideWhenUsed="1"/>
+    <w:lsdException w:name="Table Grid 7" w:semiHidden="1" w:unhideWhenUsed="1"/>
+    <w:lsdException w:name="Table Grid 8" w:semiHidden="1" w:unhideWhenUsed="1"/>
+    <w:lsdException w:name="Table List 1" w:semiHidden="1" w:unhideWhenUsed="1"/>
+    <w:lsdException w:name="Table List 2" w:semiHidden="1" w:unhideWhenUsed="1"/>
+    <w:lsdException w:name="Table List 3" w:semiHidden="1" w:unhideWhenUsed="1"/>
+    <w:lsdException w:name="Table List 4" w:semiHidden="1" w:unhideWhenUsed="1"/>
+    <w:lsdException w:name="Table List 5" w:semiHidden="1" w:unhideWhenUsed="1"/>
+    <w:lsdException w:name="Table List 6" w:semiHidden="1" w:unhideWhenUsed="1"/>
+    <w:lsdException w:name="Table List 7" w:semiHidden="1" w:unhideWhenUsed="1"/>
+    <w:lsdException w:name="Table List 8" w:semiHidden="1" w:unhideWhenUsed="1"/>
+    <w:lsdException w:name="Table 3D effects 1" w:semiHidden="1" w:unhideWhenUsed="1"/>
+    <w:lsdException w:name="Table 3D effects 2" w:semiHidden="1" w:unhideWhenUsed="1"/>
+    <w:lsdException w:name="Table 3D effects 3" w:semiHidden="1" w:unhideWhenUsed="1"/>
+    <w:lsdException w:name="Table Contemporary" w:semiHidden="1" w:unhideWhenUsed="1"/>
+    <w:lsdException w:name="Table Elegant" w:semiHidden="1" w:unhideWhenUsed="1"/>
+    <w:lsdException w:name="Table Professional" w:semiHidden="1" w:unhideWhenUsed="1"/>
+    <w:lsdException w:name="Table Subtle 1" w:semiHidden="1" w:unhideWhenUsed="1"/>
+    <w:lsdException w:name="Table Subtle 2" w:semiHidden="1" w:unhideWhenUsed="1"/>
+    <w:lsdException w:name="Table Web 1" w:semiHidden="1" w:unhideWhenUsed="1"/>
+    <w:lsdException w:name="Table Web 2" w:semiHidden="1" w:unhideWhenUsed="1"/>
+    <w:lsdException w:name="Table Web 3" w:semiHidden="1" w:unhideWhenUsed="1"/>
+    <w:lsdException w:name="Balloon Text" w:semiHidden="1" w:unhideWhenUsed="1"/>
+    <w:lsdException w:name="Table Grid" w:uiPriority="39"/>
+    <w:lsdException w:name="Table Theme" w:semiHidden="1" w:unhideWhenUsed="1"/>
+    <w:lsdException w:name="Placeholder Text" w:semiHidden="1"/>
+    <w:lsdException w:name="No Spacing" w:qFormat="1" w:uiPriority="1"/>
+    <w:lsdException w:name="Light Shading" w:uiPriority="60"/>
+    <w:lsdException w:name="Light List" w:uiPriority="61"/>
+    <w:lsdException w:name="Light Grid" w:uiPriority="62"/>
+    <w:lsdException w:name="Medium Shading 1" w:uiPriority="63"/>
+    <w:lsdException w:name="Medium Shading 2" w:uiPriority="64"/>
+    <w:lsdException w:name="Medium List 1" w:uiPriority="65"/>
+    <w:lsdException w:name="Medium List 2" w:uiPriority="66"/>
+    <w:lsdException w:name="Medium Grid 1" w:uiPriority="67"/>
+    <w:lsdException w:name="Medium Grid 2" w:uiPriority="68"/>
+    <w:lsdException w:name="Medium Grid 3" w:uiPriority="69"/>
+    <w:lsdException w:name="Dark List" w:uiPriority="70"/>
+    <w:lsdException w:name="Colorful Shading" w:uiPriority="71"/>
+    <w:lsdException w:name="Colorful List" w:uiPriority="72"/>
+    <w:lsdException w:name="Colorful Grid" w:uiPriority="73"/>
+    <w:lsdException w:name="Light Shading Accent 1" w:uiPriority="60"/>
+    <w:lsdException w:name="Light List Accent 1" w:uiPriority="61"/>
+    <w:lsdException w:name="Light Grid Accent 1" w:uiPriority="62"/>
+    <w:lsdException w:name="Medium Shading 1 Accent 1" w:uiPriority="63"/>
+    <w:lsdException w:name="Medium Shading 2 Accent 1" w:uiPriority="64"/>
+    <w:lsdException w:name="Medium List 1 Accent 1" w:uiPriority="65"/>
+    <w:lsdException w:name="Revision" w:semiHidden="1"/>
+    <w:lsdException w:name="List Paragraph" w:qFormat="1" w:uiPriority="34"/>
+    <w:lsdException w:name="Quote" w:qFormat="1" w:uiPriority="29"/>
+    <w:lsdException w:name="Intense Quote" w:qFormat="1" w:uiPriority="30"/>
+    <w:lsdException w:name="Medium List 2 Accent 1" w:uiPriority="66"/>
+    <w:lsdException w:name="Medium Grid 1 Accent 1" w:uiPriority="67"/>
+    <w:lsdException w:name="Medium Grid 2 Accent 1" w:uiPriority="68"/>
+    <w:lsdException w:name="Medium Grid 3 Accent 1" w:uiPriority="69"/>
+    <w:lsdException w:name="Dark List Accent 1" w:uiPriority="70"/>
+    <w:lsdException w:name="Colorful Shading Accent 1" w:uiPriority="71"/>
+    <w:lsdException w:name="Colorful List Accent 1" w:uiPriority="72"/>
+    <w:lsdException w:name="Colorful Grid Accent 1" w:uiPriority="73"/>
+    <w:lsdException w:name="Light Shading Accent 2" w:uiPriority="60"/>
+    <w:lsdException w:name="Light List Accent 2" w:uiPriority="61"/>
+    <w:lsdException w:name="Light Grid Accent 2" w:uiPriority="62"/>
+    <w:lsdException w:name="Medium Shading 1 Accent 2" w:uiPriority="63"/>
+    <w:lsdException w:name="Medium Shading 2 Accent 2" w:uiPriority="64"/>
+    <w:lsdException w:name="Medium List 1 Accent 2" w:uiPriority="65"/>
+    <w:lsdException w:name="Medium List 2 Accent 2" w:uiPriority="66"/>
+    <w:lsdException w:name="Medium Grid 1 Accent 2" w:uiPriority="67"/>
+    <w:lsdException w:name="Medium Grid 2 Accent 2" w:uiPriority="68"/>
+    <w:lsdException w:name="Medium Grid 3 Accent 2" w:uiPriority="69"/>
+    <w:lsdException w:name="Dark List Accent 2" w:uiPriority="70"/>
+    <w:lsdException w:name="Colorful Shading Accent 2" w:uiPriority="71"/>
+    <w:lsdException w:name="Colorful List Accent 2" w:uiPriority="72"/>
+    <w:lsdException w:name="Colorful Grid Accent 2" w:uiPriority="73"/>
+    <w:lsdException w:name="Light Shading Accent 3" w:uiPriority="60"/>
+    <w:lsdException w:name="Light List Accent 3" w:uiPriority="61"/>
+    <w:lsdException w:name="Light Grid Accent 3" w:uiPriority="62"/>
+    <w:lsdException w:name="Medium Shading 1 Accent 3" w:uiPriority="63"/>
+    <w:lsdException w:name="Medium Shading 2 Accent 3" w:uiPriority="64"/>
+    <w:lsdException w:name="Medium List 1 Accent 3" w:uiPriority="65"/>
+    <w:lsdException w:name="Medium List 2 Accent 3" w:uiPriority="66"/>
+    <w:lsdException w:name="Medium Grid 1 Accent 3" w:uiPriority="67"/>
+    <w:lsdException w:name="Medium Grid 2 Accent 3" w:uiPriority="68"/>
+    <w:lsdException w:name="Medium Grid 3 Accent 3" w:uiPriority="69"/>
+    <w:lsdException w:name="Dark List Accent 3" w:uiPriority="70"/>
+    <w:lsdException w:name="Colorful Shading Accent 3" w:uiPriority="71"/>
+    <w:lsdException w:name="Colorful List Accent 3" w:uiPriority="72"/>
+    <w:lsdException w:name="Colorful Grid Accent 3" w:uiPriority="73"/>
+    <w:lsdException w:name="Light Shading Accent 4" w:uiPriority="60"/>
+    <w:lsdException w:name="Light List Accent 4" w:uiPriority="61"/>
+    <w:lsdException w:name="Light Grid Accent 4" w:uiPriority="62"/>
+    <w:lsdException w:name="Medium Shading 1 Accent 4" w:uiPriority="63"/>
+    <w:lsdException w:name="Medium Shading 2 Accent 4" w:uiPriority="64"/>
+    <w:lsdException w:name="Medium List 1 Accent 4" w:uiPriority="65"/>
+    <w:lsdException w:name="Medium List 2 Accent 4" w:uiPriority="66"/>
+    <w:lsdException w:name="Medium Grid 1 Accent 4" w:uiPriority="67"/>
+    <w:lsdException w:name="Medium Grid 2 Accent 4" w:uiPriority="68"/>
+    <w:lsdException w:name="Medium Grid 3 Accent 4" w:uiPriority="69"/>
+    <w:lsdException w:name="Dark List Accent 4" w:uiPriority="70"/>
+    <w:lsdException w:name="Colorful Shading Accent 4" w:uiPriority="71"/>
+    <w:lsdException w:name="Colorful List Accent 4" w:uiPriority="72"/>
+    <w:lsdException w:name="Colorful Grid Accent 4" w:uiPriority="73"/>
+    <w:lsdException w:name="Light Shading Accent 5" w:uiPriority="60"/>
+    <w:lsdException w:name="Light List Accent 5" w:uiPriority="61"/>
+    <w:lsdException w:name="Light Grid Accent 5" w:uiPriority="62"/>
+    <w:lsdException w:name="Medium Shading 1 Accent 5" w:uiPriority="63"/>
+    <w:lsdException w:name="Medium Shading 2 Accent 5" w:uiPriority="64"/>
+    <w:lsdException w:name="Medium List 1 Accent 5" w:uiPriority="65"/>
+    <w:lsdException w:name="Medium List 2 Accent 5" w:uiPriority="66"/>
+    <w:lsdException w:name="Medium Grid 1 Accent 5" w:uiPriority="67"/>
+    <w:lsdException w:name="Medium Grid 2 Accent 5" w:uiPriority="68"/>
+    <w:lsdException w:name="Medium Grid 3 Accent 5" w:uiPriority="69"/>
+    <w:lsdException w:name="Dark List Accent 5" w:uiPriority="70"/>
+    <w:lsdException w:name="Colorful Shading Accent 5" w:uiPriority="71"/>
+    <w:lsdException w:name="Colorful List Accent 5" w:uiPriority="72"/>
+    <w:lsdException w:name="Colorful Grid Accent 5" w:uiPriority="73"/>
+    <w:lsdException w:name="Light Shading Accent 6" w:uiPriority="60"/>
+    <w:lsdException w:name="Light List Accent 6" w:uiPriority="61"/>
+    <w:lsdException w:name="Light Grid Accent 6" w:uiPriority="62"/>
+    <w:lsdException w:name="Medium Shading 1 Accent 6" w:uiPriority="63"/>
+    <w:lsdException w:name="Medium Shading 2 Accent 6" w:uiPriority="64"/>
+    <w:lsdException w:name="Medium List 1 Accent 6" w:uiPriority="65"/>
+    <w:lsdException w:name="Medium List 2 Accent 6" w:uiPriority="66"/>
+    <w:lsdException w:name="Medium Grid 1 Accent 6" w:uiPriority="67"/>
+    <w:lsdException w:name="Medium Grid 2 Accent 6" w:uiPriority="68"/>
+    <w:lsdException w:name="Medium Grid 3 Accent 6" w:uiPriority="69"/>
+    <w:lsdException w:name="Dark List Accent 6" w:uiPriority="70"/>
+    <w:lsdException w:name="Colorful Shading Accent 6" w:uiPriority="71"/>
+    <w:lsdException w:name="Colorful List Accent 6" w:uiPriority="72"/>
+    <w:lsdException w:name="Colorful Grid Accent 6" w:uiPriority="73"/>
+    <w:lsdException w:name="Subtle Emphasis" w:qFormat="1" w:uiPriority="19"/>
+    <w:lsdException w:name="Intense Emphasis" w:qFormat="1" w:uiPriority="21"/>
+    <w:lsdException w:name="Subtle Reference" w:qFormat="1" w:uiPriority="31"/>
+    <w:lsdException w:name="Intense Reference" w:qFormat="1" w:uiPriority="32"/>
+    <w:lsdException w:name="Book Title" w:qFormat="1" w:uiPriority="33"/>
+    <w:lsdException w:name="Bibliography" w:semiHidden="1" w:uiPriority="37" w:unhideWhenUsed="1"/>
+    <w:lsdException w:name="TOC Heading" w:qFormat="1" w:semiHidden="1" w:uiPriority="39" w:unhideWhenUsed="1"/>
+    <w:lsdException w:name="Plain Table 1" w:uiPriority="41"/>
+    <w:lsdException w:name="Plain Table 2" w:uiPriority="42"/>
+    <w:lsdException w:name="Plain Table 3" w:uiPriority="43"/>
+    <w:lsdException w:name="Plain Table 4" w:uiPriority="44"/>
+    <w:lsdException w:name="Plain Table 5" w:uiPriority="45"/>
+    <w:lsdException w:name="Grid Table Light" w:uiPriority="40"/>
+    <w:lsdException w:name="Grid Table 1 Light" w:uiPriority="46"/>
+    <w:lsdException w:name="Grid Table 2" w:uiPriority="47"/>
+    <w:lsdException w:name="Grid Table 3" w:uiPriority="48"/>
+    <w:lsdException w:name="Grid Table 4" w:uiPriority="49"/>
+    <w:lsdException w:name="Grid Table 5 Dark" w:uiPriority="50"/>
+    <w:lsdException w:name="Grid Table 6 Colorful" w:uiPriority="51"/>
+    <w:lsdException w:name="Grid Table 7 Colorful" w:uiPriority="52"/>
+    <w:lsdException w:name="Grid Table 1 Light Accent 1" w:uiPriority="46"/>
+    <w:lsdException w:name="Grid Table 2 Accent 1" w:uiPriority="47"/>
+    <w:lsdException w:name="Grid Table 3 Accent 1" w:uiPriority="48"/>
+    <w:lsdException w:name="Grid Table 4 Accent 1" w:uiPriority="49"/>
+    <w:lsdException w:name="Grid Table 5 Dark Accent 1" w:uiPriority="50"/>
+    <w:lsdException w:name="Grid Table 6 Colorful Accent 1" w:uiPriority="51"/>
+    <w:lsdException w:name="Grid Table 7 Colorful Accent 1" w:uiPriority="52"/>
+    <w:lsdException w:name="Grid Table 1 Light Accent 2" w:uiPriority="46"/>
+    <w:lsdException w:name="Grid Table 2 Accent 2" w:uiPriority="47"/>
+    <w:lsdException w:name="Grid Table 3 Accent 2" w:uiPriority="48"/>
+    <w:lsdException w:name="Grid Table 4 Accent 2" w:uiPriority="49"/>
+    <w:lsdException w:name="Grid Table 5 Dark Accent 2" w:uiPriority="50"/>
+    <w:lsdException w:name="Grid Table 6 Colorful Accent 2" w:uiPriority="51"/>
+    <w:lsdException w:name="Grid Table 7 Colorful Accent 2" w:uiPriority="52"/>
+    <w:lsdException w:name="Grid Table 1 Light Accent 3" w:uiPriority="46"/>
+    <w:lsdException w:name="Grid Table 2 Accent 3" w:uiPriority="47"/>
+    <w:lsdException w:name="Grid Table 3 Accent 3" w:uiPriority="48"/>
+    <w:lsdException w:name="Grid Table 4 Accent 3" w:uiPriority="49"/>
+    <w:lsdException w:name="Grid Table 5 Dark Accent 3" w:uiPriority="50"/>
+    <w:lsdException w:name="Grid Table 6 Colorful Accent 3" w:uiPriority="51"/>
+    <w:lsdException w:name="Grid Table 7 Colorful Accent 3" w:uiPriority="52"/>
+    <w:lsdException w:name="Grid Table 1 Light Accent 4" w:uiPriority="46"/>
+    <w:lsdException w:name="Grid Table 2 Accent 4" w:uiPriority="47"/>
+    <w:lsdException w:name="Grid Table 3 Accent 4" w:uiPriority="48"/>
+    <w:lsdException w:name="Grid Table 4 Accent 4" w:uiPriority="49"/>
+    <w:lsdException w:name="Grid Table 5 Dark Accent 4" w:uiPriority="50"/>
+    <w:lsdException w:name="Grid Table 6 Colorful Accent 4" w:uiPriority="51"/>
+    <w:lsdException w:name="Grid Table 7 Colorful Accent 4" w:uiPriority="52"/>
+    <w:lsdException w:name="Grid Table 1 Light Accent 5" w:uiPriority="46"/>
+    <w:lsdException w:name="Grid Table 2 Accent 5" w:uiPriority="47"/>
+    <w:lsdException w:name="Grid Table 3 Accent 5" w:uiPriority="48"/>
+    <w:lsdException w:name="Grid Table 4 Accent 5" w:uiPriority="49"/>
+    <w:lsdException w:name="Grid Table 5 Dark Accent 5" w:uiPriority="50"/>
+    <w:lsdException w:name="Grid Table 6 Colorful Accent 5" w:uiPriority="51"/>
+    <w:lsdException w:name="Grid Table 7 Colorful Accent 5" w:uiPriority="52"/>
+    <w:lsdException w:name="Grid Table 1 Light Accent 6" w:uiPriority="46"/>
+    <w:lsdException w:name="Grid Table 2 Accent 6" w:uiPriority="47"/>
+    <w:lsdException w:name="Grid Table 3 Accent 6" w:uiPriority="48"/>
+    <w:lsdException w:name="Grid Table 4 Accent 6" w:uiPriority="49"/>
+    <w:lsdException w:name="Grid Table 5 Dark Accent 6" w:uiPriority="50"/>
+    <w:lsdException w:name="Grid Table 6 Colorful Accent 6" w:uiPriority="51"/>
+    <w:lsdException w:name="Grid Table 7 Colorful Accent 6" w:uiPriority="52"/>
+    <w:lsdException w:name="List Table 1 Light" w:uiPriority="46"/>
+    <w:lsdException w:name="List Table 2" w:uiPriority="47"/>
+    <w:lsdException w:name="List Table 3" w:uiPriority="48"/>
+    <w:lsdException w:name="List Table 4" w:uiPriority="49"/>
+    <w:lsdException w:name="List Table 5 Dark" w:uiPriority="50"/>
+    <w:lsdException w:name="List Table 6 Colorful" w:uiPriority="51"/>
+    <w:lsdException w:name="List Table 7 Colorful" w:uiPriority="52"/>
+    <w:lsdException w:name="List Table 1 Light Accent 1" w:uiPriority="46"/>
+    <w:lsdException w:name="List Table 2 Accent 1" w:uiPriority="47"/>
+    <w:lsdException w:name="List Table 3 Accent 1" w:uiPriority="48"/>
+    <w:lsdException w:name="List Table 4 Accent 1" w:uiPriority="49"/>
+    <w:lsdException w:name="List Table 5 Dark Accent 1" w:uiPriority="50"/>
+    <w:lsdException w:name="List Table 6 Colorful Accent 1" w:uiPriority="51"/>
+    <w:lsdException w:name="List Table 7 Colorful Accent 1" w:uiPriority="52"/>
+    <w:lsdException w:name="List Table 1 Light Accent 2" w:uiPriority="46"/>
+    <w:lsdException w:name="List Table 2 Accent 2" w:uiPriority="47"/>
+    <w:lsdException w:name="List Table 3 Accent 2" w:uiPriority="48"/>
+    <w:lsdException w:name="List Table 4 Accent 2" w:uiPriority="49"/>
+    <w:lsdException w:name="List Table 5 Dark Accent 2" w:uiPriority="50"/>
+    <w:lsdException w:name="List Table 6 Colorful Accent 2" w:uiPriority="51"/>
+    <w:lsdException w:name="List Table 7 Colorful Accent 2" w:uiPriority="52"/>
+    <w:lsdException w:name="List Table 1 Light Accent 3" w:uiPriority="46"/>
+    <w:lsdException w:name="List Table 2 Accent 3" w:uiPriority="47"/>
+    <w:lsdException w:name="List Table 3 Accent 3" w:uiPriority="48"/>
+    <w:lsdException w:name="List Table 4 Accent 3" w:uiPriority="49"/>
+    <w:lsdException w:name="List Table 5 Dark Accent 3" w:uiPriority="50"/>
+    <w:lsdException w:name="List Table 6 Colorful Accent 3" w:uiPriority="51"/>
+    <w:lsdException w:name="List Table 7 Colorful Accent 3" w:uiPriority="52"/>
+    <w:lsdException w:name="List Table 1 Light Accent 4" w:uiPriority="46"/>
+    <w:lsdException w:name="List Table 2 Accent 4" w:uiPriority="47"/>
+    <w:lsdException w:name="List Table 3 Accent 4" w:uiPriority="48"/>
+    <w:lsdException w:name="List Table 4 Accent 4" w:uiPriority="49"/>
+    <w:lsdException w:name="List Table 5 Dark Accent 4" w:uiPriority="50"/>
+    <w:lsdException w:name="List Table 6 Colorful Accent 4" w:uiPriority="51"/>
+    <w:lsdException w:name="List Table 7 Colorful Accent 4" w:uiPriority="52"/>
+    <w:lsdException w:name="List Table 1 Light Accent 5" w:uiPriority="46"/>
+    <w:lsdException w:name="List Table 2 Accent 5" w:uiPriority="47"/>
+    <w:lsdException w:name="List Table 3 Accent 5" w:uiPriority="48"/>
+    <w:lsdException w:name="List Table 4 Accent 5" w:uiPriority="49"/>
+    <w:lsdException w:name="List Table 5 Dark Accent 5" w:uiPriority="50"/>
+    <w:lsdException w:name="List Table 6 Colorful Accent 5" w:uiPriority="51"/>
+    <w:lsdException w:name="List Table 7 Colorful Accent 5" w:uiPriority="52"/>
+    <w:lsdException w:name="List Table 1 Light Accent 6" w:uiPriority="46"/>
+    <w:lsdException w:name="List Table 2 Accent 6" w:uiPriority="47"/>
+    <w:lsdException w:name="List Table 3 Accent 6" w:uiPriority="48"/>
+    <w:lsdException w:name="List Table 4 Accent 6" w:uiPriority="49"/>
+    <w:lsdException w:name="List Table 5 Dark Accent 6" w:uiPriority="50"/>
+    <w:lsdException w:name="List Table 6 Colorful Accent 6" w:uiPriority="51"/>
+    <w:lsdException w:name="List Table 7 Colorful Accent 6" w:uiPriority="52"/>
+    <w:lsdException w:name="Mention" w:semiHidden="1" w:unhideWhenUsed="1"/>
+    <w:lsdException w:name="Smart Hyperlink" w:semiHidden="1" w:unhideWhenUsed="1"/>
+    <w:lsdException w:name="Hashtag" w:semiHidden="1" w:unhideWhenUsed="1"/>
+    <w:lsdException w:name="Unresolved Mention" w:semiHidden="1" w:unhideWhenUsed="1"/>
+    <w:lsdException w:name="Smart Link" w:semiHidden="1" w:unhideWhenUsed="1"/>
+  </w:latentStyles>
   <w:style w:default="1" w:styleId="Normal" w:type="paragraph">
     <w:name w:val="Normal"/>
     <w:qFormat/>
   </w:style>
-  <w:style w:styleId="BodyText" w:type="paragraph">
-    <w:name w:val="Body Text"/>
-    <w:basedOn w:val="Normal"/>
-    <w:link w:val="BodyTextChar"/>
-    <w:qFormat/>
-    <w:pPr>
-      <w:spacing w:after="180" w:before="180"/>
-    </w:pPr>
-  </w:style>
-  <w:style w:customStyle="1" w:styleId="FirstParagraph" w:type="paragraph">
-    <w:name w:val="First Paragraph"/>
-    <w:basedOn w:val="BodyText"/>
-    <w:next w:val="BodyText"/>
-    <w:qFormat/>
-  </w:style>
-  <w:style w:customStyle="1" w:styleId="Compact" w:type="paragraph">
-    <w:name w:val="Compact"/>
-    <w:basedOn w:val="BodyText"/>
-    <w:qFormat/>
-    <w:pPr>
-      <w:spacing w:after="36" w:before="36"/>
-    </w:pPr>
-  </w:style>
-  <w:style w:styleId="Title" w:type="paragraph">
-    <w:name w:val="Title"/>
-    <w:basedOn w:val="Normal"/>
-    <w:next w:val="BodyText"/>
-    <w:link w:val="TitleChar"/>
-    <w:uiPriority w:val="10"/>
-    <w:qFormat/>
-    <w:rsid w:val="00A10FD9"/>
-    <w:pPr>
-      <w:spacing w:after="80" w:line="240" w:lineRule="auto"/>
-      <w:contextualSpacing/>
-      <w:jc w:val="center"/>
-    </w:pPr>
-    <w:rPr>
-      <w:rFonts w:asciiTheme="majorHAnsi" w:cstheme="majorBidi" w:eastAsiaTheme="majorEastAsia" w:hAnsiTheme="majorHAnsi"/>
-      <w:sz w:val="56"/>
-      <w:szCs w:val="56"/>
-    </w:rPr>
-  </w:style>
-  <w:style w:customStyle="1" w:styleId="TitleChar" w:type="character">
-    <w:name w:val="Title Char"/>
-    <w:basedOn w:val="DefaultParagraphFont"/>
-    <w:link w:val="Title"/>
-    <w:uiPriority w:val="10"/>
-    <w:rsid w:val="00A10FD9"/>
-    <w:rPr>
-      <w:rFonts w:asciiTheme="majorHAnsi" w:cstheme="majorBidi" w:eastAsiaTheme="majorEastAsia" w:hAnsiTheme="majorHAnsi"/>
-      <w:sz w:val="56"/>
-      <w:szCs w:val="56"/>
-    </w:rPr>
-  </w:style>
-  <w:style w:styleId="Subtitle" w:type="paragraph">
-    <w:name w:val="Subtitle"/>
-    <w:basedOn w:val="Title"/>
-    <w:next w:val="BodyText"/>
-    <w:link w:val="SubtitleChar"/>
-    <w:uiPriority w:val="11"/>
-    <w:qFormat/>
-    <w:rsid w:val="00A10FD9"/>
-    <w:pPr>
-      <w:numPr>
-        <w:ilvl w:val="1"/>
-      </w:numPr>
-    </w:pPr>
-    <w:rPr>
-      <w:rFonts w:cstheme="majorBidi" w:eastAsiaTheme="majorEastAsia"/>
-      <w:spacing w:val="15"/>
-      <w:sz w:val="28"/>
-      <w:szCs w:val="28"/>
-    </w:rPr>
-  </w:style>
-  <w:style w:customStyle="1" w:styleId="SubtitleChar" w:type="character">
-    <w:name w:val="Subtitle Char"/>
-    <w:basedOn w:val="DefaultParagraphFont"/>
-    <w:link w:val="Subtitle"/>
-    <w:uiPriority w:val="11"/>
-    <w:rsid w:val="00A10FD9"/>
-    <w:rPr>
-      <w:rFonts w:cstheme="majorBidi" w:eastAsiaTheme="majorEastAsia"/>
-      <w:color w:themeColor="text1" w:themeTint="A6" w:val="595959"/>
-      <w:spacing w:val="15"/>
-      <w:sz w:val="28"/>
-      <w:szCs w:val="28"/>
-    </w:rPr>
-  </w:style>
-  <w:style w:customStyle="1" w:styleId="Author" w:type="paragraph">
-    <w:name w:val="Author"/>
-    <w:basedOn w:val="Title"/>
-    <w:next w:val="BodyText"/>
-    <w:qFormat/>
-    <w:pPr>
-      <w:keepNext/>
-      <w:keepLines/>
-    </w:pPr>
-    <w:rPr>
-      <w:sz w:val="24"/>
-      <w:szCs w:val="24"/>
-    </w:rPr>
-  </w:style>
-  <w:style w:styleId="Date" w:type="paragraph">
-    <w:name w:val="Date"/>
-    <w:basedOn w:val="Title"/>
-    <w:next w:val="BodyText"/>
-    <w:qFormat/>
-    <w:pPr>
-      <w:keepNext/>
-      <w:keepLines/>
-    </w:pPr>
-    <w:rPr>
-      <w:sz w:val="24"/>
-      <w:szCs w:val="24"/>
-    </w:rPr>
-  </w:style>
-  <w:style w:customStyle="1" w:styleId="AbstractTitle" w:type="paragraph">
-    <w:name w:val="Abstract Title"/>
-    <w:basedOn w:val="Normal"/>
-    <w:next w:val="Abstract"/>
-    <w:qFormat/>
-    <w:pPr>
-      <w:keepNext/>
-      <w:keepLines/>
-      <w:spacing w:after="0" w:before="300"/>
-      <w:jc w:val="center"/>
-    </w:pPr>
-    <w:rPr>
-      <w:b/>
-      <w:sz w:val="20"/>
-      <w:szCs w:val="20"/>
-    </w:rPr>
-  </w:style>
-  <w:style w:customStyle="1" w:styleId="Abstract" w:type="paragraph">
-    <w:name w:val="Abstract"/>
-    <w:basedOn w:val="Normal"/>
-    <w:next w:val="BodyText"/>
-    <w:qFormat/>
-    <w:pPr>
-      <w:keepNext/>
-      <w:keepLines/>
-      <w:spacing w:after="300" w:before="100"/>
-    </w:pPr>
-    <w:rPr>
-      <w:sz w:val="20"/>
-      <w:szCs w:val="20"/>
-    </w:rPr>
-  </w:style>
-  <w:style w:styleId="Bibliography" w:type="paragraph">
-    <w:name w:val="Bibliography"/>
-    <w:basedOn w:val="Normal"/>
-    <w:next w:val="Bibliography"/>
-    <w:qFormat/>
-    <w:pPr/>
-    <w:rPr/>
-  </w:style>
   <w:style w:styleId="Heading1" w:type="paragraph">
     <w:name w:val="heading 1"/>
     <w:basedOn w:val="Normal"/>
-    <w:next w:val="BodyText"/>
+    <w:next w:val="Normal"/>
     <w:link w:val="Heading1Char"/>
     <w:uiPriority w:val="9"/>
     <w:qFormat/>
-    <w:rsid w:val="00A10FD9"/>
+    <w:rsid w:val="00146459"/>
     <w:pPr>
       <w:keepNext/>
       <w:keepLines/>
@@ -8894,13 +9256,13 @@
   <w:style w:styleId="Heading2" w:type="paragraph">
     <w:name w:val="heading 2"/>
     <w:basedOn w:val="Normal"/>
-    <w:next w:val="BodyText"/>
+    <w:next w:val="Normal"/>
     <w:link w:val="Heading2Char"/>
     <w:uiPriority w:val="9"/>
     <w:semiHidden/>
     <w:unhideWhenUsed/>
     <w:qFormat/>
-    <w:rsid w:val="00A10FD9"/>
+    <w:rsid w:val="00146459"/>
     <w:pPr>
       <w:keepNext/>
       <w:keepLines/>
@@ -8917,13 +9279,13 @@
   <w:style w:styleId="Heading3" w:type="paragraph">
     <w:name w:val="heading 3"/>
     <w:basedOn w:val="Normal"/>
-    <w:next w:val="BodyText"/>
+    <w:next w:val="Normal"/>
     <w:link w:val="Heading3Char"/>
     <w:uiPriority w:val="9"/>
     <w:semiHidden/>
     <w:unhideWhenUsed/>
     <w:qFormat/>
-    <w:rsid w:val="00A10FD9"/>
+    <w:rsid w:val="00146459"/>
     <w:pPr>
       <w:keepNext/>
       <w:keepLines/>
@@ -8940,13 +9302,13 @@
   <w:style w:styleId="Heading4" w:type="paragraph">
     <w:name w:val="heading 4"/>
     <w:basedOn w:val="Normal"/>
-    <w:next w:val="BodyText"/>
+    <w:next w:val="Normal"/>
     <w:link w:val="Heading4Char"/>
     <w:uiPriority w:val="9"/>
     <w:semiHidden/>
     <w:unhideWhenUsed/>
     <w:qFormat/>
-    <w:rsid w:val="00A10FD9"/>
+    <w:rsid w:val="00146459"/>
     <w:pPr>
       <w:keepNext/>
       <w:keepLines/>
@@ -8963,13 +9325,13 @@
   <w:style w:styleId="Heading5" w:type="paragraph">
     <w:name w:val="heading 5"/>
     <w:basedOn w:val="Normal"/>
-    <w:next w:val="BodyText"/>
+    <w:next w:val="Normal"/>
     <w:link w:val="Heading5Char"/>
     <w:uiPriority w:val="9"/>
     <w:semiHidden/>
     <w:unhideWhenUsed/>
     <w:qFormat/>
-    <w:rsid w:val="00A10FD9"/>
+    <w:rsid w:val="00146459"/>
     <w:pPr>
       <w:keepNext/>
       <w:keepLines/>
@@ -8984,13 +9346,13 @@
   <w:style w:styleId="Heading6" w:type="paragraph">
     <w:name w:val="heading 6"/>
     <w:basedOn w:val="Normal"/>
-    <w:next w:val="BodyText"/>
+    <w:next w:val="Normal"/>
     <w:link w:val="Heading6Char"/>
     <w:uiPriority w:val="9"/>
     <w:semiHidden/>
     <w:unhideWhenUsed/>
     <w:qFormat/>
-    <w:rsid w:val="00A10FD9"/>
+    <w:rsid w:val="00146459"/>
     <w:pPr>
       <w:keepNext/>
       <w:keepLines/>
@@ -9007,13 +9369,13 @@
   <w:style w:styleId="Heading7" w:type="paragraph">
     <w:name w:val="heading 7"/>
     <w:basedOn w:val="Normal"/>
-    <w:next w:val="BodyText"/>
+    <w:next w:val="Normal"/>
     <w:link w:val="Heading7Char"/>
     <w:uiPriority w:val="9"/>
     <w:semiHidden/>
     <w:unhideWhenUsed/>
     <w:qFormat/>
-    <w:rsid w:val="00A10FD9"/>
+    <w:rsid w:val="00146459"/>
     <w:pPr>
       <w:keepNext/>
       <w:keepLines/>
@@ -9028,13 +9390,13 @@
   <w:style w:styleId="Heading8" w:type="paragraph">
     <w:name w:val="heading 8"/>
     <w:basedOn w:val="Normal"/>
-    <w:next w:val="BodyText"/>
+    <w:next w:val="Normal"/>
     <w:link w:val="Heading8Char"/>
     <w:uiPriority w:val="9"/>
     <w:semiHidden/>
     <w:unhideWhenUsed/>
     <w:qFormat/>
-    <w:rsid w:val="00A10FD9"/>
+    <w:rsid w:val="00146459"/>
     <w:pPr>
       <w:keepNext/>
       <w:keepLines/>
@@ -9051,13 +9413,13 @@
   <w:style w:styleId="Heading9" w:type="paragraph">
     <w:name w:val="heading 9"/>
     <w:basedOn w:val="Normal"/>
-    <w:next w:val="BodyText"/>
+    <w:next w:val="Normal"/>
     <w:link w:val="Heading9Char"/>
     <w:uiPriority w:val="9"/>
     <w:semiHidden/>
     <w:unhideWhenUsed/>
     <w:qFormat/>
-    <w:rsid w:val="00A10FD9"/>
+    <w:rsid w:val="00146459"/>
     <w:pPr>
       <w:keepNext/>
       <w:keepLines/>
@@ -9069,12 +9431,39 @@
       <w:color w:themeColor="text1" w:themeTint="D8" w:val="272727"/>
     </w:rPr>
   </w:style>
+  <w:style w:default="1" w:styleId="DefaultParagraphFont" w:type="character">
+    <w:name w:val="Default Paragraph Font"/>
+    <w:uiPriority w:val="1"/>
+    <w:semiHidden/>
+    <w:unhideWhenUsed/>
+  </w:style>
+  <w:style w:default="1" w:styleId="TableNormal" w:type="table">
+    <w:name w:val="Normal Table"/>
+    <w:uiPriority w:val="99"/>
+    <w:semiHidden/>
+    <w:unhideWhenUsed/>
+    <w:tblPr>
+      <w:tblInd w:type="dxa" w:w="0"/>
+      <w:tblCellMar>
+        <w:top w:type="dxa" w:w="0"/>
+        <w:left w:type="dxa" w:w="108"/>
+        <w:bottom w:type="dxa" w:w="0"/>
+        <w:right w:type="dxa" w:w="108"/>
+      </w:tblCellMar>
+    </w:tblPr>
+  </w:style>
+  <w:style w:default="1" w:styleId="NoList" w:type="numbering">
+    <w:name w:val="No List"/>
+    <w:uiPriority w:val="99"/>
+    <w:semiHidden/>
+    <w:unhideWhenUsed/>
+  </w:style>
   <w:style w:customStyle="1" w:styleId="Heading1Char" w:type="character">
     <w:name w:val="Heading 1 Char"/>
     <w:basedOn w:val="DefaultParagraphFont"/>
     <w:link w:val="Heading1"/>
     <w:uiPriority w:val="9"/>
-    <w:rsid w:val="00A10FD9"/>
+    <w:rsid w:val="00146459"/>
     <w:rPr>
       <w:rFonts w:asciiTheme="majorHAnsi" w:cstheme="majorBidi" w:eastAsiaTheme="majorEastAsia" w:hAnsiTheme="majorHAnsi"/>
       <w:color w:themeColor="accent1" w:themeShade="BF" w:val="0F4761"/>
@@ -9088,7 +9477,7 @@
     <w:link w:val="Heading2"/>
     <w:uiPriority w:val="9"/>
     <w:semiHidden/>
-    <w:rsid w:val="00A10FD9"/>
+    <w:rsid w:val="00146459"/>
     <w:rPr>
       <w:rFonts w:asciiTheme="majorHAnsi" w:cstheme="majorBidi" w:eastAsiaTheme="majorEastAsia" w:hAnsiTheme="majorHAnsi"/>
       <w:color w:themeColor="accent1" w:themeShade="BF" w:val="0F4761"/>
@@ -9102,7 +9491,7 @@
     <w:link w:val="Heading3"/>
     <w:uiPriority w:val="9"/>
     <w:semiHidden/>
-    <w:rsid w:val="00A10FD9"/>
+    <w:rsid w:val="00146459"/>
     <w:rPr>
       <w:rFonts w:cstheme="majorBidi" w:eastAsiaTheme="majorEastAsia"/>
       <w:color w:themeColor="accent1" w:themeShade="BF" w:val="0F4761"/>
@@ -9116,7 +9505,7 @@
     <w:link w:val="Heading4"/>
     <w:uiPriority w:val="9"/>
     <w:semiHidden/>
-    <w:rsid w:val="00A10FD9"/>
+    <w:rsid w:val="00146459"/>
     <w:rPr>
       <w:rFonts w:cstheme="majorBidi" w:eastAsiaTheme="majorEastAsia"/>
       <w:i/>
@@ -9130,7 +9519,7 @@
     <w:link w:val="Heading5"/>
     <w:uiPriority w:val="9"/>
     <w:semiHidden/>
-    <w:rsid w:val="00A10FD9"/>
+    <w:rsid w:val="00146459"/>
     <w:rPr>
       <w:rFonts w:cstheme="majorBidi" w:eastAsiaTheme="majorEastAsia"/>
       <w:color w:themeColor="accent1" w:themeShade="BF" w:val="0F4761"/>
@@ -9142,7 +9531,7 @@
     <w:link w:val="Heading6"/>
     <w:uiPriority w:val="9"/>
     <w:semiHidden/>
-    <w:rsid w:val="00A10FD9"/>
+    <w:rsid w:val="00146459"/>
     <w:rPr>
       <w:rFonts w:cstheme="majorBidi" w:eastAsiaTheme="majorEastAsia"/>
       <w:i/>
@@ -9156,7 +9545,7 @@
     <w:link w:val="Heading7"/>
     <w:uiPriority w:val="9"/>
     <w:semiHidden/>
-    <w:rsid w:val="00A10FD9"/>
+    <w:rsid w:val="00146459"/>
     <w:rPr>
       <w:rFonts w:cstheme="majorBidi" w:eastAsiaTheme="majorEastAsia"/>
       <w:color w:themeColor="text1" w:themeTint="A6" w:val="595959"/>
@@ -9168,7 +9557,7 @@
     <w:link w:val="Heading8"/>
     <w:uiPriority w:val="9"/>
     <w:semiHidden/>
-    <w:rsid w:val="00A10FD9"/>
+    <w:rsid w:val="00146459"/>
     <w:rPr>
       <w:rFonts w:cstheme="majorBidi" w:eastAsiaTheme="majorEastAsia"/>
       <w:i/>
@@ -9182,178 +9571,226 @@
     <w:link w:val="Heading9"/>
     <w:uiPriority w:val="9"/>
     <w:semiHidden/>
-    <w:rsid w:val="00A10FD9"/>
+    <w:rsid w:val="00146459"/>
     <w:rPr>
       <w:rFonts w:cstheme="majorBidi" w:eastAsiaTheme="majorEastAsia"/>
       <w:color w:themeColor="text1" w:themeTint="D8" w:val="272727"/>
     </w:rPr>
   </w:style>
-  <w:style w:styleId="BlockText" w:type="paragraph">
-    <w:name w:val="Block Text"/>
-    <w:basedOn w:val="BodyText"/>
-    <w:next w:val="BodyText"/>
-    <w:uiPriority w:val="9"/>
-    <w:unhideWhenUsed/>
+  <w:style w:styleId="Title" w:type="paragraph">
+    <w:name w:val="Title"/>
+    <w:basedOn w:val="Normal"/>
+    <w:next w:val="Normal"/>
+    <w:link w:val="TitleChar"/>
+    <w:uiPriority w:val="10"/>
     <w:qFormat/>
+    <w:rsid w:val="00146459"/>
     <w:pPr>
-      <w:spacing w:after="100" w:before="100"/>
-      <w:ind w:firstLine="0" w:left="480" w:right="480"/>
-    </w:pPr>
-  </w:style>
-  <w:style w:styleId="FootnoteText" w:type="paragraph">
-    <w:name w:val="Footnote Text"/>
-    <w:basedOn w:val="Normal"/>
-    <w:next w:val="FootnoteText"/>
-    <w:uiPriority w:val="9"/>
-    <w:unhideWhenUsed/>
-    <w:qFormat/>
-  </w:style>
-  <w:style w:styleId="FootnoteBlockText" w:type="paragraph">
-    <w:name w:val="Footnote Block Text"/>
-    <w:basedOn w:val="FootnoteText"/>
-    <w:next w:val="FootnoteText"/>
-    <w:uiPriority w:val="9"/>
-    <w:unhideWhenUsed/>
-    <w:qFormat/>
-    <w:pPr>
-      <w:spacing w:after="100" w:before="100"/>
-      <w:ind w:firstLine="0" w:left="480" w:right="480"/>
-    </w:pPr>
-  </w:style>
-  <w:style w:default="1" w:styleId="DefaultParagraphFont" w:type="character">
-    <w:name w:val="Default Paragraph Font"/>
-    <w:semiHidden/>
-    <w:unhideWhenUsed/>
-  </w:style>
-  <w:style w:default="1" w:styleId="Table" w:type="table">
-    <w:name w:val="Table"/>
-    <w:basedOn w:val="TableNormal"/>
-    <w:semiHidden/>
-    <w:unhideWhenUsed/>
-    <w:qFormat/>
-    <w:tblPr>
-      <w:tblInd w:type="dxa" w:w="0"/>
-      <w:tblCellMar>
-        <w:top w:type="dxa" w:w="0"/>
-        <w:left w:type="dxa" w:w="108"/>
-        <w:bottom w:type="dxa" w:w="0"/>
-        <w:right w:type="dxa" w:w="108"/>
-      </w:tblCellMar>
-    </w:tblPr>
-    <w:tblStylePr w:type="firstRow">
-      <w:tblPr>
-        <w:jc w:val="left"/>
-        <w:tblInd w:type="dxa" w:w="0"/>
-      </w:tblPr>
-      <w:trPr>
-        <w:jc w:val="left"/>
-      </w:trPr>
-      <w:tcPr>
-        <w:tcBorders>
-          <w:bottom w:val="single"/>
-        </w:tcBorders>
-        <w:vAlign w:val="bottom"/>
-      </w:tcPr>
-    </w:tblStylePr>
-  </w:style>
-  <w:style w:customStyle="1" w:styleId="DefinitionTerm" w:type="paragraph">
-    <w:name w:val="Definition Term"/>
-    <w:basedOn w:val="Normal"/>
-    <w:next w:val="Definition"/>
-    <w:pPr>
-      <w:keepNext/>
-      <w:keepLines/>
-      <w:spacing w:after="0"/>
+      <w:spacing w:after="80" w:line="240" w:lineRule="auto"/>
+      <w:contextualSpacing/>
     </w:pPr>
     <w:rPr>
-      <w:b/>
+      <w:rFonts w:asciiTheme="majorHAnsi" w:cstheme="majorBidi" w:eastAsiaTheme="majorEastAsia" w:hAnsiTheme="majorHAnsi"/>
+      <w:spacing w:val="-10"/>
+      <w:kern w:val="28"/>
+      <w:sz w:val="56"/>
+      <w:szCs w:val="56"/>
     </w:rPr>
   </w:style>
-  <w:style w:customStyle="1" w:styleId="Definition" w:type="paragraph">
-    <w:name w:val="Definition"/>
+  <w:style w:customStyle="1" w:styleId="TitleChar" w:type="character">
+    <w:name w:val="Title Char"/>
+    <w:basedOn w:val="DefaultParagraphFont"/>
+    <w:link w:val="Title"/>
+    <w:uiPriority w:val="10"/>
+    <w:rsid w:val="00146459"/>
+    <w:rPr>
+      <w:rFonts w:asciiTheme="majorHAnsi" w:cstheme="majorBidi" w:eastAsiaTheme="majorEastAsia" w:hAnsiTheme="majorHAnsi"/>
+      <w:spacing w:val="-10"/>
+      <w:kern w:val="28"/>
+      <w:sz w:val="56"/>
+      <w:szCs w:val="56"/>
+    </w:rPr>
+  </w:style>
+  <w:style w:styleId="Subtitle" w:type="paragraph">
+    <w:name w:val="Subtitle"/>
     <w:basedOn w:val="Normal"/>
+    <w:next w:val="Normal"/>
+    <w:link w:val="SubtitleChar"/>
+    <w:uiPriority w:val="11"/>
+    <w:qFormat/>
+    <w:rsid w:val="00146459"/>
+    <w:pPr>
+      <w:numPr>
+        <w:ilvl w:val="1"/>
+      </w:numPr>
+    </w:pPr>
+    <w:rPr>
+      <w:rFonts w:cstheme="majorBidi" w:eastAsiaTheme="majorEastAsia"/>
+      <w:color w:themeColor="text1" w:themeTint="A6" w:val="595959"/>
+      <w:spacing w:val="15"/>
+      <w:sz w:val="28"/>
+      <w:szCs w:val="28"/>
+    </w:rPr>
   </w:style>
-  <w:style w:styleId="Caption" w:type="paragraph">
-    <w:name w:val="Caption"/>
+  <w:style w:customStyle="1" w:styleId="SubtitleChar" w:type="character">
+    <w:name w:val="Subtitle Char"/>
+    <w:basedOn w:val="DefaultParagraphFont"/>
+    <w:link w:val="Subtitle"/>
+    <w:uiPriority w:val="11"/>
+    <w:rsid w:val="00146459"/>
+    <w:rPr>
+      <w:rFonts w:cstheme="majorBidi" w:eastAsiaTheme="majorEastAsia"/>
+      <w:color w:themeColor="text1" w:themeTint="A6" w:val="595959"/>
+      <w:spacing w:val="15"/>
+      <w:sz w:val="28"/>
+      <w:szCs w:val="28"/>
+    </w:rPr>
+  </w:style>
+  <w:style w:styleId="Quote" w:type="paragraph">
+    <w:name w:val="Quote"/>
     <w:basedOn w:val="Normal"/>
-    <w:link w:val="BodyTextChar"/>
+    <w:next w:val="Normal"/>
+    <w:link w:val="QuoteChar"/>
+    <w:uiPriority w:val="29"/>
+    <w:qFormat/>
+    <w:rsid w:val="00146459"/>
     <w:pPr>
-      <w:spacing w:after="120" w:before="0"/>
+      <w:spacing w:before="160"/>
+      <w:jc w:val="center"/>
     </w:pPr>
     <w:rPr>
       <w:i/>
+      <w:iCs/>
+      <w:color w:themeColor="text1" w:themeTint="BF" w:val="404040"/>
     </w:rPr>
   </w:style>
-  <w:style w:customStyle="1" w:styleId="TableCaption" w:type="paragraph">
-    <w:name w:val="Table Caption"/>
-    <w:basedOn w:val="Caption"/>
+  <w:style w:customStyle="1" w:styleId="QuoteChar" w:type="character">
+    <w:name w:val="Quote Char"/>
+    <w:basedOn w:val="DefaultParagraphFont"/>
+    <w:link w:val="Quote"/>
+    <w:uiPriority w:val="29"/>
+    <w:rsid w:val="00146459"/>
+    <w:rPr>
+      <w:i/>
+      <w:iCs/>
+      <w:color w:themeColor="text1" w:themeTint="BF" w:val="404040"/>
+    </w:rPr>
+  </w:style>
+  <w:style w:styleId="ListParagraph" w:type="paragraph">
+    <w:name w:val="List Paragraph"/>
+    <w:basedOn w:val="Normal"/>
+    <w:uiPriority w:val="34"/>
+    <w:qFormat/>
+    <w:rsid w:val="00146459"/>
     <w:pPr>
-      <w:keepNext/>
+      <w:ind w:left="720"/>
+      <w:contextualSpacing/>
     </w:pPr>
   </w:style>
-  <w:style w:customStyle="1" w:styleId="ImageCaption" w:type="paragraph">
-    <w:name w:val="Image Caption"/>
-    <w:basedOn w:val="Caption"/>
+  <w:style w:styleId="IntenseEmphasis" w:type="character">
+    <w:name w:val="Intense Emphasis"/>
+    <w:basedOn w:val="DefaultParagraphFont"/>
+    <w:uiPriority w:val="21"/>
+    <w:qFormat/>
+    <w:rsid w:val="00146459"/>
+    <w:rPr>
+      <w:i/>
+      <w:iCs/>
+      <w:color w:themeColor="accent1" w:themeShade="BF" w:val="0F4761"/>
+    </w:rPr>
   </w:style>
-  <w:style w:customStyle="1" w:styleId="Figure" w:type="paragraph">
-    <w:name w:val="Figure"/>
+  <w:style w:styleId="IntenseQuote" w:type="paragraph">
+    <w:name w:val="Intense Quote"/>
     <w:basedOn w:val="Normal"/>
+    <w:next w:val="Normal"/>
+    <w:link w:val="IntenseQuoteChar"/>
+    <w:uiPriority w:val="30"/>
+    <w:qFormat/>
+    <w:rsid w:val="00146459"/>
+    <w:pPr>
+      <w:pBdr>
+        <w:top w:color="0F4761" w:space="10" w:sz="4" w:themeColor="accent1" w:themeShade="BF" w:val="single"/>
+        <w:bottom w:color="0F4761" w:space="10" w:sz="4" w:themeColor="accent1" w:themeShade="BF" w:val="single"/>
+      </w:pBdr>
+      <w:spacing w:after="360" w:before="360"/>
+      <w:ind w:left="864" w:right="864"/>
+      <w:jc w:val="center"/>
+    </w:pPr>
+    <w:rPr>
+      <w:i/>
+      <w:iCs/>
+      <w:color w:themeColor="accent1" w:themeShade="BF" w:val="0F4761"/>
+    </w:rPr>
   </w:style>
-  <w:style w:customStyle="1" w:styleId="CaptionedFigure" w:type="paragraph">
-    <w:name w:val="Captioned Figure"/>
-    <w:basedOn w:val="Figure"/>
+  <w:style w:customStyle="1" w:styleId="IntenseQuoteChar" w:type="character">
+    <w:name w:val="Intense Quote Char"/>
+    <w:basedOn w:val="DefaultParagraphFont"/>
+    <w:link w:val="IntenseQuote"/>
+    <w:uiPriority w:val="30"/>
+    <w:rsid w:val="00146459"/>
+    <w:rPr>
+      <w:i/>
+      <w:iCs/>
+      <w:color w:themeColor="accent1" w:themeShade="BF" w:val="0F4761"/>
+    </w:rPr>
+  </w:style>
+  <w:style w:styleId="IntenseReference" w:type="character">
+    <w:name w:val="Intense Reference"/>
+    <w:basedOn w:val="DefaultParagraphFont"/>
+    <w:uiPriority w:val="32"/>
+    <w:qFormat/>
+    <w:rsid w:val="00146459"/>
+    <w:rPr>
+      <w:b/>
+      <w:bCs/>
+      <w:smallCaps/>
+      <w:color w:themeColor="accent1" w:themeShade="BF" w:val="0F4761"/>
+      <w:spacing w:val="5"/>
+    </w:rPr>
+  </w:style>
+  <w:style w:styleId="Header" w:type="paragraph">
+    <w:name w:val="header"/>
+    <w:basedOn w:val="Normal"/>
+    <w:link w:val="HeaderChar"/>
+    <w:uiPriority w:val="99"/>
+    <w:unhideWhenUsed/>
+    <w:rsid w:val="00146459"/>
     <w:pPr>
-      <w:keepNext/>
+      <w:tabs>
+        <w:tab w:pos="4513" w:val="center"/>
+        <w:tab w:pos="9026" w:val="right"/>
+      </w:tabs>
+      <w:spacing w:after="0" w:line="240" w:lineRule="auto"/>
     </w:pPr>
   </w:style>
-  <w:style w:customStyle="1" w:styleId="BodyTextChar" w:type="character">
-    <w:name w:val="Body Text Char"/>
+  <w:style w:customStyle="1" w:styleId="HeaderChar" w:type="character">
+    <w:name w:val="Header Char"/>
     <w:basedOn w:val="DefaultParagraphFont"/>
-    <w:link w:val="BodyText"/>
+    <w:link w:val="Header"/>
+    <w:uiPriority w:val="99"/>
+    <w:rsid w:val="00146459"/>
   </w:style>
-  <w:style w:customStyle="1" w:styleId="VerbatimChar" w:type="character">
-    <w:name w:val="Verbatim Char"/>
-    <w:basedOn w:val="BodyTextChar"/>
-    <w:rPr>
-      <w:rFonts w:ascii="Consolas" w:hAnsi="Consolas"/>
-      <w:sz w:val="22"/>
-    </w:rPr>
+  <w:style w:styleId="Footer" w:type="paragraph">
+    <w:name w:val="footer"/>
+    <w:basedOn w:val="Normal"/>
+    <w:link w:val="FooterChar"/>
+    <w:uiPriority w:val="99"/>
+    <w:unhideWhenUsed/>
+    <w:rsid w:val="00146459"/>
+    <w:pPr>
+      <w:tabs>
+        <w:tab w:pos="4513" w:val="center"/>
+        <w:tab w:pos="9026" w:val="right"/>
+      </w:tabs>
+      <w:spacing w:after="0" w:line="240" w:lineRule="auto"/>
+    </w:pPr>
   </w:style>
-  <w:style w:customStyle="1" w:styleId="SectionNumber" w:type="character">
-    <w:name w:val="Section Number"/>
-    <w:basedOn w:val="BodyTextChar"/>
-  </w:style>
-  <w:style w:styleId="FootnoteReference" w:type="character">
-    <w:name w:val="Footnote Reference"/>
-    <w:basedOn w:val="BodyTextChar"/>
-    <w:rPr>
-      <w:vertAlign w:val="superscript"/>
-    </w:rPr>
-  </w:style>
-  <w:style w:styleId="Hyperlink" w:type="character">
-    <w:name w:val="Hyperlink"/>
-    <w:basedOn w:val="BodyTextChar"/>
-    <w:rPr>
-      <w:color w:themeColor="accent1" w:val="4F81BD"/>
-    </w:rPr>
-  </w:style>
-  <w:style w:styleId="TOCHeading" w:type="paragraph">
-    <w:name w:val="TOC Heading"/>
-    <w:basedOn w:val="Heading1"/>
-    <w:next w:val="BodyText"/>
-    <w:uiPriority w:val="39"/>
-    <w:unhideWhenUsed/>
-    <w:qFormat/>
-    <w:pPr>
-      <w:spacing w:before="240" w:line="259" w:lineRule="auto"/>
-      <w:outlineLvl w:val="9"/>
-    </w:pPr>
-    <w:rPr>
-      <w:rFonts w:asciiTheme="majorHAnsi" w:cstheme="majorBidi" w:eastAsiaTheme="majorEastAsia" w:hAnsiTheme="majorHAnsi"/>
-      <w:b w:val="0"/>
-      <w:bCs w:val="0"/>
-      <w:color w:themeColor="accent1" w:themeShade="BF" w:val="365F91"/>
-    </w:rPr>
+  <w:style w:customStyle="1" w:styleId="FooterChar" w:type="character">
+    <w:name w:val="Footer Char"/>
+    <w:basedOn w:val="DefaultParagraphFont"/>
+    <w:link w:val="Footer"/>
+    <w:uiPriority w:val="99"/>
+    <w:rsid w:val="00146459"/>
   </w:style>
   <w:style w:type="paragraph" w:customStyle="1" w:styleId="SourceCode">
     <w:name w:val="Source Code"/>
@@ -9826,13 +10263,6 @@
         </a:gradFill>
       </a:fillStyleLst>
       <a:lnStyleLst>
-        <a:ln w="6350" cap="flat" cmpd="sng" algn="ctr">
-          <a:solidFill>
-            <a:schemeClr val="phClr"/>
-          </a:solidFill>
-          <a:prstDash val="solid"/>
-          <a:miter lim="800000"/>
-        </a:ln>
         <a:ln w="12700" cap="flat" cmpd="sng" algn="ctr">
           <a:solidFill>
             <a:schemeClr val="phClr"/>
@@ -9841,6 +10271,13 @@
           <a:miter lim="800000"/>
         </a:ln>
         <a:ln w="19050" cap="flat" cmpd="sng" algn="ctr">
+          <a:solidFill>
+            <a:schemeClr val="phClr"/>
+          </a:solidFill>
+          <a:prstDash val="solid"/>
+          <a:miter lim="800000"/>
+        </a:ln>
+        <a:ln w="25400" cap="flat" cmpd="sng" algn="ctr">
           <a:solidFill>
             <a:schemeClr val="phClr"/>
           </a:solidFill>
@@ -9905,7 +10342,27 @@
       </a:bgFillStyleLst>
     </a:fmtScheme>
   </a:themeElements>
-  <a:objectDefaults/>
+  <a:objectDefaults>
+    <a:lnDef>
+      <a:spPr/>
+      <a:bodyPr/>
+      <a:lstStyle/>
+      <a:style>
+        <a:lnRef idx="2">
+          <a:schemeClr val="accent1"/>
+        </a:lnRef>
+        <a:fillRef idx="0">
+          <a:schemeClr val="accent1"/>
+        </a:fillRef>
+        <a:effectRef idx="1">
+          <a:schemeClr val="accent1"/>
+        </a:effectRef>
+        <a:fontRef idx="minor">
+          <a:schemeClr val="tx1"/>
+        </a:fontRef>
+      </a:style>
+    </a:lnDef>
+  </a:objectDefaults>
   <a:extraClrSchemeLst/>
   <a:extLst>
     <a:ext uri="{05A4C25C-085E-4340-85A3-A5531E510DB2}">

</xml_diff>

<commit_message>
changes to heading on pdf output
</commit_message>
<xml_diff>
--- a/Test.docx
+++ b/Test.docx
@@ -4625,6 +4625,11 @@
       </w:r>
     </w:p>
     <w:p>
+      <w:r>
+        <w:br w:type="page"/>
+      </w:r>
+    </w:p>
+    <w:p>
       <w:pPr>
         <w:pStyle w:val="BodyText"/>
       </w:pPr>
@@ -5571,6 +5576,11 @@
           <w:rStyle w:val="DataTypeTok"/>
         </w:rPr>
         <w:t xml:space="preserve">&gt;</w:t>
+      </w:r>
+    </w:p>
+    <w:p>
+      <w:r>
+        <w:br w:type="page"/>
       </w:r>
     </w:p>
     <w:p>
@@ -10233,6 +10243,11 @@
           <w:rStyle w:val="DataTypeTok"/>
         </w:rPr>
         <w:t xml:space="preserve">&gt;</w:t>
+      </w:r>
+    </w:p>
+    <w:p>
+      <w:r>
+        <w:br w:type="page"/>
       </w:r>
     </w:p>
     <w:p>
@@ -14060,7 +14075,7 @@
     <w:bookmarkStart w:id="105" w:name="section"/>
     <w:p>
       <w:pPr>
-        <w:pStyle w:val="Heading345"/>
+        <w:pStyle w:val="Heading357"/>
       </w:pPr>
     </w:p>
     <w:bookmarkEnd w:id="105"/>
@@ -14586,7 +14601,7 @@
       </w:pPr>
       <w:r>
         <w:rPr>
-          <w:rStyle w:val="VerbatimChar"/>
+          <w:rStyle w:val="NormalTok"/>
         </w:rPr>
         <w:t xml:space="preserve">sequenceDiagram</w:t>
       </w:r>
@@ -14595,7 +14610,7 @@
       </w:r>
       <w:r>
         <w:rPr>
-          <w:rStyle w:val="VerbatimChar"/>
+          <w:rStyle w:val="NormalTok"/>
         </w:rPr>
         <w:t xml:space="preserve">Alice -&gt;&gt; Bob: Hello Bob, how are you?</w:t>
       </w:r>
@@ -14604,7 +14619,7 @@
       </w:r>
       <w:r>
         <w:rPr>
-          <w:rStyle w:val="VerbatimChar"/>
+          <w:rStyle w:val="NormalTok"/>
         </w:rPr>
         <w:t xml:space="preserve">Bob--&gt;&gt;John: How about you John?</w:t>
       </w:r>
@@ -14613,7 +14628,7 @@
       </w:r>
       <w:r>
         <w:rPr>
-          <w:rStyle w:val="VerbatimChar"/>
+          <w:rStyle w:val="NormalTok"/>
         </w:rPr>
         <w:t xml:space="preserve">Bob--x Alice: I am good thanks!</w:t>
       </w:r>
@@ -14622,7 +14637,7 @@
       </w:r>
       <w:r>
         <w:rPr>
-          <w:rStyle w:val="VerbatimChar"/>
+          <w:rStyle w:val="NormalTok"/>
         </w:rPr>
         <w:t xml:space="preserve">Bob-x John: I am good thanks!</w:t>
       </w:r>
@@ -14631,19 +14646,91 @@
       </w:r>
       <w:r>
         <w:rPr>
-          <w:rStyle w:val="VerbatimChar"/>
-        </w:rPr>
-        <w:t xml:space="preserve">Note right of John: John thinks a long&lt;br/&gt;long time, so long&lt;br/&gt;that the text does&lt;br/&gt;not fit on a row.</w:t>
-      </w:r>
-      <w:r>
-        <w:br/>
-      </w:r>
-      <w:r>
-        <w:br/>
-      </w:r>
-      <w:r>
-        <w:rPr>
-          <w:rStyle w:val="VerbatimChar"/>
+          <w:rStyle w:val="NormalTok"/>
+        </w:rPr>
+        <w:t xml:space="preserve">Note right of John: John thinks a long</w:t>
+      </w:r>
+      <w:r>
+        <w:rPr>
+          <w:rStyle w:val="DataTypeTok"/>
+        </w:rPr>
+        <w:t xml:space="preserve">&lt;</w:t>
+      </w:r>
+      <w:r>
+        <w:rPr>
+          <w:rStyle w:val="KeywordTok"/>
+        </w:rPr>
+        <w:t xml:space="preserve">br</w:t>
+      </w:r>
+      <w:r>
+        <w:rPr>
+          <w:rStyle w:val="DataTypeTok"/>
+        </w:rPr>
+        <w:t xml:space="preserve">/&gt;</w:t>
+      </w:r>
+      <w:r>
+        <w:rPr>
+          <w:rStyle w:val="NormalTok"/>
+        </w:rPr>
+        <w:t xml:space="preserve">long time, so long</w:t>
+      </w:r>
+      <w:r>
+        <w:rPr>
+          <w:rStyle w:val="DataTypeTok"/>
+        </w:rPr>
+        <w:t xml:space="preserve">&lt;</w:t>
+      </w:r>
+      <w:r>
+        <w:rPr>
+          <w:rStyle w:val="KeywordTok"/>
+        </w:rPr>
+        <w:t xml:space="preserve">br</w:t>
+      </w:r>
+      <w:r>
+        <w:rPr>
+          <w:rStyle w:val="DataTypeTok"/>
+        </w:rPr>
+        <w:t xml:space="preserve">/&gt;</w:t>
+      </w:r>
+      <w:r>
+        <w:rPr>
+          <w:rStyle w:val="NormalTok"/>
+        </w:rPr>
+        <w:t xml:space="preserve">that the text does</w:t>
+      </w:r>
+      <w:r>
+        <w:rPr>
+          <w:rStyle w:val="DataTypeTok"/>
+        </w:rPr>
+        <w:t xml:space="preserve">&lt;</w:t>
+      </w:r>
+      <w:r>
+        <w:rPr>
+          <w:rStyle w:val="KeywordTok"/>
+        </w:rPr>
+        <w:t xml:space="preserve">br</w:t>
+      </w:r>
+      <w:r>
+        <w:rPr>
+          <w:rStyle w:val="DataTypeTok"/>
+        </w:rPr>
+        <w:t xml:space="preserve">/&gt;</w:t>
+      </w:r>
+      <w:r>
+        <w:rPr>
+          <w:rStyle w:val="NormalTok"/>
+        </w:rPr>
+        <w:t xml:space="preserve">not fit on a row.</w:t>
+      </w:r>
+      <w:r>
+        <w:br/>
+      </w:r>
+      <w:r>
+        <w:br/>
+      </w:r>
+      <w:r>
+        <w:rPr>
+          <w:rStyle w:val="NormalTok"/>
         </w:rPr>
         <w:t xml:space="preserve">Bob--&gt;Alice: Checking with John...</w:t>
       </w:r>
@@ -14652,7 +14739,7 @@
       </w:r>
       <w:r>
         <w:rPr>
-          <w:rStyle w:val="VerbatimChar"/>
+          <w:rStyle w:val="NormalTok"/>
         </w:rPr>
         <w:t xml:space="preserve">Alice-&gt;John: Yes... John, how are you?</w:t>
       </w:r>
@@ -14718,7 +14805,7 @@
       </w:pPr>
       <w:r>
         <w:rPr>
-          <w:rStyle w:val="VerbatimChar"/>
+          <w:rStyle w:val="NormalTok"/>
         </w:rPr>
         <w:t xml:space="preserve">sequenceDiagram</w:t>
       </w:r>
@@ -14727,7 +14814,7 @@
       </w:r>
       <w:r>
         <w:rPr>
-          <w:rStyle w:val="VerbatimChar"/>
+          <w:rStyle w:val="NormalTok"/>
         </w:rPr>
         <w:t xml:space="preserve">graph LR</w:t>
       </w:r>
@@ -14736,16 +14823,40 @@
       </w:r>
       <w:r>
         <w:rPr>
-          <w:rStyle w:val="VerbatimChar"/>
-        </w:rPr>
-        <w:t xml:space="preserve">A[Square Rect] -- Link text --&gt; B((Circle))</w:t>
-      </w:r>
-      <w:r>
-        <w:br/>
-      </w:r>
-      <w:r>
-        <w:rPr>
-          <w:rStyle w:val="VerbatimChar"/>
+          <w:rStyle w:val="NormalTok"/>
+        </w:rPr>
+        <w:t xml:space="preserve">A</w:t>
+      </w:r>
+      <w:r>
+        <w:rPr>
+          <w:rStyle w:val="CommentTok"/>
+        </w:rPr>
+        <w:t xml:space="preserve">[</w:t>
+      </w:r>
+      <w:r>
+        <w:rPr>
+          <w:rStyle w:val="OtherTok"/>
+        </w:rPr>
+        <w:t xml:space="preserve">Square Rect</w:t>
+      </w:r>
+      <w:r>
+        <w:rPr>
+          <w:rStyle w:val="CommentTok"/>
+        </w:rPr>
+        <w:t xml:space="preserve">]</w:t>
+      </w:r>
+      <w:r>
+        <w:rPr>
+          <w:rStyle w:val="NormalTok"/>
+        </w:rPr>
+        <w:t xml:space="preserve"> -- Link text --&gt; B((Circle))</w:t>
+      </w:r>
+      <w:r>
+        <w:br/>
+      </w:r>
+      <w:r>
+        <w:rPr>
+          <w:rStyle w:val="NormalTok"/>
         </w:rPr>
         <w:t xml:space="preserve">A --&gt; C(Round Rect)</w:t>
       </w:r>
@@ -14754,7 +14865,7 @@
       </w:r>
       <w:r>
         <w:rPr>
-          <w:rStyle w:val="VerbatimChar"/>
+          <w:rStyle w:val="NormalTok"/>
         </w:rPr>
         <w:t xml:space="preserve">B --&gt; D{Rhombus}</w:t>
       </w:r>
@@ -14763,7 +14874,7 @@
       </w:r>
       <w:r>
         <w:rPr>
-          <w:rStyle w:val="VerbatimChar"/>
+          <w:rStyle w:val="NormalTok"/>
         </w:rPr>
         <w:t xml:space="preserve">C --&gt; D</w:t>
       </w:r>
@@ -16033,7 +16144,7 @@
   <w:docDefaults>
     <w:rPrDefault>
       <w:rPr>
-        <w:rFonts w:asciiTheme="minorHAnsi" w:cstheme="minorBidi" w:eastAsiaTheme="minorHAnsi" w:hAnsiTheme="minorHAnsi"/>
+        <w:rFonts w:ascii="Times New Roman" w:cstheme="minorBidi" w:eastAsiaTheme="minorHAnsi" w:hAnsi="Times New Roman"/>
         <w:kern w:val="2"/>
         <w:sz w:val="24"/>
         <w:szCs w:val="24"/>
@@ -16428,6 +16539,10 @@
   <w:style w:default="1" w:styleId="Normal" w:type="paragraph">
     <w:name w:val="Normal"/>
     <w:qFormat/>
+    <w:rsid w:val="00B268A0"/>
+    <w:pPr>
+      <w:spacing w:before="100" w:beforeAutospacing="1" w:line="240" w:lineRule="auto"/>
+    </w:pPr>
   </w:style>
   <w:style w:styleId="Heading1" w:type="paragraph">
     <w:name w:val="heading 1"/>
@@ -16783,7 +16898,7 @@
     <w:qFormat/>
     <w:rsid w:val="00146459"/>
     <w:pPr>
-      <w:spacing w:after="80" w:line="240" w:lineRule="auto"/>
+      <w:spacing w:after="80"/>
       <w:contextualSpacing/>
     </w:pPr>
     <w:rPr>
@@ -16957,7 +17072,7 @@
         <w:tab w:pos="4513" w:val="center"/>
         <w:tab w:pos="9026" w:val="right"/>
       </w:tabs>
-      <w:spacing w:after="0" w:line="240" w:lineRule="auto"/>
+      <w:spacing w:after="0"/>
     </w:pPr>
   </w:style>
   <w:style w:customStyle="1" w:styleId="HeaderChar" w:type="character">
@@ -16979,7 +17094,7 @@
         <w:tab w:pos="4513" w:val="center"/>
         <w:tab w:pos="9026" w:val="right"/>
       </w:tabs>
-      <w:spacing w:after="0" w:line="240" w:lineRule="auto"/>
+      <w:spacing w:after="0"/>
     </w:pPr>
   </w:style>
   <w:style w:customStyle="1" w:styleId="FooterChar" w:type="character">
@@ -16988,6 +17103,28 @@
     <w:link w:val="Footer"/>
     <w:uiPriority w:val="99"/>
     <w:rsid w:val="00146459"/>
+  </w:style>
+  <w:style w:customStyle="1" w:styleId="BodyText" w:type="paragraph">
+    <w:name w:val="BodyText"/>
+    <w:basedOn w:val="Normal"/>
+    <w:link w:val="BodyTextChar"/>
+    <w:qFormat/>
+    <w:rsid w:val="001D348E"/>
+  </w:style>
+  <w:style w:customStyle="1" w:styleId="BodyTextChar" w:type="character">
+    <w:name w:val="BodyText Char"/>
+    <w:basedOn w:val="DefaultParagraphFont"/>
+    <w:link w:val="BodyText"/>
+    <w:rsid w:val="001D348E"/>
+  </w:style>
+  <w:style w:styleId="NoSpacing" w:type="paragraph">
+    <w:name w:val="No Spacing"/>
+    <w:uiPriority w:val="1"/>
+    <w:qFormat/>
+    <w:rsid w:val="00625ACA"/>
+    <w:pPr>
+      <w:spacing w:after="0" w:line="240" w:lineRule="auto"/>
+    </w:pPr>
   </w:style>
   <w:style w:type="paragraph" w:customStyle="1" w:styleId="SourceCode">
     <w:name w:val="Source Code"/>

</xml_diff>